<commit_message>
Plano de Ação com conteudo completo (falta a tabela das quizenas)
</commit_message>
<xml_diff>
--- a/Plano de Acao.docx
+++ b/Plano de Acao.docx
@@ -984,32 +984,6 @@
         <w:t>Descreva o processo de escolha do local de realização do PI.</w:t>
       </w:r>
     </w:p>
-    <w:p>
-      <w:pPr>
-        <w:pStyle w:val="Normal0"/>
-        <w:spacing w:lineRule="auto" w:line="288" w:before="0" w:after="240"/>
-        <w:rPr>
-          <w:rFonts w:ascii="Trebuchet MS" w:hAnsi="Trebuchet MS"/>
-          <w:i/>
-          <w:i/>
-          <w:iCs/>
-          <w:color w:val="7F7F7F"/>
-          <w:sz w:val="20"/>
-          <w:szCs w:val="20"/>
-        </w:rPr>
-      </w:pPr>
-      <w:r>
-        <w:rPr>
-          <w:rFonts w:ascii="Trebuchet MS" w:hAnsi="Trebuchet MS"/>
-          <w:i/>
-          <w:iCs/>
-          <w:color w:val="7F7F7F"/>
-          <w:sz w:val="20"/>
-          <w:szCs w:val="20"/>
-        </w:rPr>
-        <w:t>Orientação para o preenchimento: É esperado que o grupo descreva o processo de escolha do local, identificando as seguintes ações: quais outras opções de comunidades externas existiam ou se existiam; como chegaram até essas comunidades; quais ações e decisões tomaram em grupo para a escolha da comunidade participante do projeto.</w:t>
-      </w:r>
-    </w:p>
     <w:tbl>
       <w:tblPr>
         <w:tblW w:w="8502" w:type="dxa"/>
@@ -1042,67 +1016,55 @@
           </w:tcPr>
           <w:p>
             <w:pPr>
+              <w:pStyle w:val="Corpodotexto"/>
+              <w:widowControl w:val="false"/>
+              <w:spacing w:lineRule="auto" w:line="288" w:before="0" w:after="0"/>
+              <w:jc w:val="both"/>
+              <w:rPr/>
+            </w:pPr>
+            <w:r>
+              <w:rPr>
+                <w:rFonts w:eastAsia="Calibri" w:cs="Calibri"/>
+                <w:kern w:val="0"/>
+                <w:sz w:val="22"/>
+                <w:szCs w:val="22"/>
+                <w:lang w:val="pt-BR" w:eastAsia="pt-BR" w:bidi="ar-SA"/>
+              </w:rPr>
+              <w:t>A escolha do local para realização do Projeto Integrador ocorreu após discussão em grupo sobre possíveis comunidades externas que apresentassem demandas relacionadas à área de Tecnologia da Informação. Foram consideradas alternativas como uma unidade de saúde, uma associação comunitária e uma escola pública.</w:t>
+            </w:r>
+          </w:p>
+          <w:p>
+            <w:pPr>
+              <w:pStyle w:val="Corpodotexto"/>
+              <w:jc w:val="both"/>
+              <w:rPr/>
+            </w:pPr>
+            <w:r>
+              <w:rPr/>
+              <w:t>Após conversas iniciais e levantamento das necessidades, identificou-se que a escola apresentava dificuldades no controle da merenda, realizado de forma manual, especialmente no registro de estoque e na organização das informações.</w:t>
+            </w:r>
+          </w:p>
+          <w:p>
+            <w:pPr>
+              <w:pStyle w:val="Corpodotexto"/>
+              <w:jc w:val="both"/>
+              <w:rPr/>
+            </w:pPr>
+            <w:r>
+              <w:rPr/>
+              <w:t>Em reunião, o grupo avaliou critérios como impacto social, viabilidade técnica e acesso à instituição. Com base nesses fatores, decidiu-se pela escolha da escola, por apresentar uma demanda clara e alinhada aos conhecimentos do curso de BTI.</w:t>
+            </w:r>
+          </w:p>
+          <w:p>
+            <w:pPr>
               <w:pStyle w:val="Normal0"/>
               <w:widowControl w:val="false"/>
               <w:spacing w:lineRule="auto" w:line="288" w:before="0" w:after="0"/>
-              <w:jc w:val="left"/>
-              <w:rPr>
-                <w:rFonts w:eastAsia="Calibri" w:cs="Calibri"/>
-                <w:kern w:val="0"/>
-                <w:sz w:val="22"/>
-                <w:szCs w:val="22"/>
-                <w:lang w:val="pt-BR" w:eastAsia="pt-BR" w:bidi="ar-SA"/>
-              </w:rPr>
-            </w:pPr>
-            <w:r>
-              <w:rPr>
-                <w:rFonts w:eastAsia="Calibri" w:cs="Calibri"/>
-                <w:kern w:val="0"/>
-                <w:sz w:val="22"/>
-                <w:szCs w:val="22"/>
-                <w:lang w:val="pt-BR" w:eastAsia="pt-BR" w:bidi="ar-SA"/>
-              </w:rPr>
-              <w:fldChar w:fldCharType="begin"/>
-            </w:r>
-            <w:r>
-              <w:rPr>
-                <w:sz w:val="22"/>
-                <w:kern w:val="0"/>
-                <w:szCs w:val="22"/>
-                <w:rFonts w:eastAsia="Calibri" w:cs="Calibri"/>
-                <w:lang w:val="pt-BR" w:eastAsia="pt-BR" w:bidi="ar-SA"/>
-              </w:rPr>
-              <w:instrText xml:space="preserve"> FILLIN ""</w:instrText>
-            </w:r>
-            <w:r>
-              <w:rPr>
-                <w:sz w:val="22"/>
-                <w:kern w:val="0"/>
-                <w:szCs w:val="22"/>
-                <w:rFonts w:eastAsia="Calibri" w:cs="Calibri"/>
-                <w:lang w:val="pt-BR" w:eastAsia="pt-BR" w:bidi="ar-SA"/>
-              </w:rPr>
-              <w:fldChar w:fldCharType="separate"/>
-            </w:r>
-            <w:r>
-              <w:rPr>
-                <w:sz w:val="22"/>
-                <w:kern w:val="0"/>
-                <w:szCs w:val="22"/>
-                <w:rFonts w:eastAsia="Calibri" w:cs="Calibri"/>
-                <w:lang w:val="pt-BR" w:eastAsia="pt-BR" w:bidi="ar-SA"/>
-              </w:rPr>
-              <w:t>Sua resposta</w:t>
-            </w:r>
-            <w:r>
-              <w:rPr>
-                <w:sz w:val="22"/>
-                <w:kern w:val="0"/>
-                <w:szCs w:val="22"/>
-                <w:rFonts w:eastAsia="Calibri" w:cs="Calibri"/>
-                <w:lang w:val="pt-BR" w:eastAsia="pt-BR" w:bidi="ar-SA"/>
-              </w:rPr>
-              <w:fldChar w:fldCharType="end"/>
+              <w:jc w:val="both"/>
+              <w:rPr/>
+            </w:pPr>
+            <w:r>
+              <w:rPr/>
             </w:r>
           </w:p>
         </w:tc>
@@ -1156,32 +1118,6 @@
         <w:t>Descreva como foi a conversa com a comunidade externa que participará do projeto e que acolheu o grupo.</w:t>
       </w:r>
     </w:p>
-    <w:p>
-      <w:pPr>
-        <w:pStyle w:val="Normal0"/>
-        <w:spacing w:lineRule="auto" w:line="288" w:before="0" w:after="240"/>
-        <w:rPr>
-          <w:rFonts w:ascii="Trebuchet MS" w:hAnsi="Trebuchet MS"/>
-          <w:i/>
-          <w:i/>
-          <w:iCs/>
-          <w:color w:val="7F7F7F"/>
-          <w:sz w:val="20"/>
-          <w:szCs w:val="20"/>
-        </w:rPr>
-      </w:pPr>
-      <w:r>
-        <w:rPr>
-          <w:rFonts w:ascii="Trebuchet MS" w:hAnsi="Trebuchet MS"/>
-          <w:i/>
-          <w:iCs/>
-          <w:color w:val="7F7F7F"/>
-          <w:sz w:val="20"/>
-          <w:szCs w:val="20"/>
-        </w:rPr>
-        <w:t>Orientação para o preenchimento: É esperado que o grupo descreva a primeira visita à comunidade externa, identificando as seguintes ações: com qual(is) pessoa(s) conversou(ram) e sua posição na empresa/escola/etc.; descrição do local da visita; percepções do grupo quanto ao seu primeiro contato.</w:t>
-      </w:r>
-    </w:p>
     <w:tbl>
       <w:tblPr>
         <w:tblW w:w="8502" w:type="dxa"/>
@@ -1214,67 +1150,55 @@
           </w:tcPr>
           <w:p>
             <w:pPr>
+              <w:pStyle w:val="Corpodotexto"/>
+              <w:widowControl w:val="false"/>
+              <w:spacing w:lineRule="auto" w:line="288" w:before="0" w:after="0"/>
+              <w:jc w:val="both"/>
+              <w:rPr/>
+            </w:pPr>
+            <w:r>
+              <w:rPr>
+                <w:rFonts w:eastAsia="Calibri" w:cs="Calibri"/>
+                <w:kern w:val="0"/>
+                <w:sz w:val="22"/>
+                <w:szCs w:val="22"/>
+                <w:lang w:val="pt-BR" w:eastAsia="pt-BR" w:bidi="ar-SA"/>
+              </w:rPr>
+              <w:t>A primeira visita à escola ocorreu após contato prévio para apresentação da proposta do Projeto Integrador. O grupo foi recebido pela diretora da instituição e pela responsável pelo setor da merenda escolar, que apresentaram a rotina de funcionamento e explicaram as principais dificuldades enfrentadas no controle dos alimentos.</w:t>
+            </w:r>
+          </w:p>
+          <w:p>
+            <w:pPr>
+              <w:pStyle w:val="Corpodotexto"/>
+              <w:jc w:val="both"/>
+              <w:rPr/>
+            </w:pPr>
+            <w:r>
+              <w:rPr/>
+              <w:t>Durante a visita, foi possível conhecer a cozinha, o espaço de armazenamento e a forma como o controle de estoque era realizado, predominantemente por meio de registros manuais em cadernos. Observou-se que o ambiente era organizado, porém havia limitações no acompanhamento preciso das entradas e saídas dos produtos.</w:t>
+            </w:r>
+          </w:p>
+          <w:p>
+            <w:pPr>
+              <w:pStyle w:val="Corpodotexto"/>
+              <w:jc w:val="both"/>
+              <w:rPr/>
+            </w:pPr>
+            <w:r>
+              <w:rPr/>
+              <w:t>O grupo percebeu receptividade por parte da equipe escolar, que demonstrou interesse na proposta de desenvolvimento de um sistema para auxiliar na organização das informações. O primeiro contato foi positivo e contribuiu para compreender melhor as necessidades da instituição, permitindo alinhar a solução tecnológica à realidade da comunidade atendida</w:t>
+            </w:r>
+          </w:p>
+          <w:p>
+            <w:pPr>
               <w:pStyle w:val="Normal0"/>
               <w:widowControl w:val="false"/>
               <w:spacing w:lineRule="auto" w:line="288" w:before="0" w:after="0"/>
-              <w:jc w:val="left"/>
-              <w:rPr>
-                <w:rFonts w:eastAsia="Calibri" w:cs="Calibri"/>
-                <w:kern w:val="0"/>
-                <w:sz w:val="22"/>
-                <w:szCs w:val="22"/>
-                <w:lang w:val="pt-BR" w:eastAsia="pt-BR" w:bidi="ar-SA"/>
-              </w:rPr>
-            </w:pPr>
-            <w:r>
-              <w:rPr>
-                <w:rFonts w:eastAsia="Calibri" w:cs="Calibri"/>
-                <w:kern w:val="0"/>
-                <w:sz w:val="22"/>
-                <w:szCs w:val="22"/>
-                <w:lang w:val="pt-BR" w:eastAsia="pt-BR" w:bidi="ar-SA"/>
-              </w:rPr>
-              <w:fldChar w:fldCharType="begin"/>
-            </w:r>
-            <w:r>
-              <w:rPr>
-                <w:sz w:val="22"/>
-                <w:kern w:val="0"/>
-                <w:szCs w:val="22"/>
-                <w:rFonts w:eastAsia="Calibri" w:cs="Calibri"/>
-                <w:lang w:val="pt-BR" w:eastAsia="pt-BR" w:bidi="ar-SA"/>
-              </w:rPr>
-              <w:instrText xml:space="preserve"> FILLIN ""</w:instrText>
-            </w:r>
-            <w:r>
-              <w:rPr>
-                <w:sz w:val="22"/>
-                <w:kern w:val="0"/>
-                <w:szCs w:val="22"/>
-                <w:rFonts w:eastAsia="Calibri" w:cs="Calibri"/>
-                <w:lang w:val="pt-BR" w:eastAsia="pt-BR" w:bidi="ar-SA"/>
-              </w:rPr>
-              <w:fldChar w:fldCharType="separate"/>
-            </w:r>
-            <w:r>
-              <w:rPr>
-                <w:sz w:val="22"/>
-                <w:kern w:val="0"/>
-                <w:szCs w:val="22"/>
-                <w:rFonts w:eastAsia="Calibri" w:cs="Calibri"/>
-                <w:lang w:val="pt-BR" w:eastAsia="pt-BR" w:bidi="ar-SA"/>
-              </w:rPr>
-              <w:t>Sua resposta</w:t>
-            </w:r>
-            <w:r>
-              <w:rPr>
-                <w:sz w:val="22"/>
-                <w:kern w:val="0"/>
-                <w:szCs w:val="22"/>
-                <w:rFonts w:eastAsia="Calibri" w:cs="Calibri"/>
-                <w:lang w:val="pt-BR" w:eastAsia="pt-BR" w:bidi="ar-SA"/>
-              </w:rPr>
-              <w:fldChar w:fldCharType="end"/>
+              <w:jc w:val="both"/>
+              <w:rPr/>
+            </w:pPr>
+            <w:r>
+              <w:rPr/>
             </w:r>
           </w:p>
         </w:tc>
@@ -1307,6 +1231,51 @@
         </w:rPr>
       </w:pPr>
       <w:r>
+        <w:rPr/>
+      </w:r>
+    </w:p>
+    <w:p>
+      <w:pPr>
+        <w:pStyle w:val="Normal0"/>
+        <w:spacing w:lineRule="auto" w:line="288" w:before="0" w:after="120"/>
+        <w:rPr>
+          <w:rFonts w:ascii="Trebuchet MS" w:hAnsi="Trebuchet MS"/>
+          <w:b/>
+          <w:b/>
+          <w:bCs/>
+        </w:rPr>
+      </w:pPr>
+      <w:r>
+        <w:rPr/>
+      </w:r>
+    </w:p>
+    <w:p>
+      <w:pPr>
+        <w:pStyle w:val="Normal0"/>
+        <w:spacing w:lineRule="auto" w:line="288" w:before="0" w:after="120"/>
+        <w:rPr>
+          <w:rFonts w:ascii="Trebuchet MS" w:hAnsi="Trebuchet MS"/>
+          <w:b/>
+          <w:b/>
+          <w:bCs/>
+        </w:rPr>
+      </w:pPr>
+      <w:r>
+        <w:rPr/>
+      </w:r>
+    </w:p>
+    <w:p>
+      <w:pPr>
+        <w:pStyle w:val="Normal0"/>
+        <w:spacing w:lineRule="auto" w:line="288" w:before="0" w:after="120"/>
+        <w:rPr>
+          <w:rFonts w:ascii="Trebuchet MS" w:hAnsi="Trebuchet MS"/>
+          <w:b/>
+          <w:b/>
+          <w:bCs/>
+        </w:rPr>
+      </w:pPr>
+      <w:r>
         <w:rPr>
           <w:rFonts w:ascii="Trebuchet MS" w:hAnsi="Trebuchet MS"/>
           <w:b/>
@@ -1318,27 +1287,16 @@
     <w:p>
       <w:pPr>
         <w:pStyle w:val="Normal0"/>
-        <w:spacing w:lineRule="auto" w:line="288" w:before="0" w:after="240"/>
+        <w:spacing w:lineRule="auto" w:line="288" w:before="0" w:after="120"/>
         <w:rPr>
           <w:rFonts w:ascii="Trebuchet MS" w:hAnsi="Trebuchet MS"/>
-          <w:i/>
-          <w:i/>
-          <w:iCs/>
-          <w:color w:val="7F7F7F"/>
-          <w:sz w:val="20"/>
-          <w:szCs w:val="20"/>
+          <w:b/>
+          <w:b/>
+          <w:bCs/>
         </w:rPr>
       </w:pPr>
       <w:r>
-        <w:rPr>
-          <w:rFonts w:ascii="Trebuchet MS" w:hAnsi="Trebuchet MS"/>
-          <w:i/>
-          <w:iCs/>
-          <w:color w:val="7F7F7F"/>
-          <w:sz w:val="20"/>
-          <w:szCs w:val="20"/>
-        </w:rPr>
-        <w:t>Orientação para o preenchimento: É esperado que o grupo descreva ao menos um problema e sua relação com o tema norteador definido pela Univesp.</w:t>
+        <w:rPr/>
       </w:r>
     </w:p>
     <w:tbl>
@@ -1373,67 +1331,44 @@
           </w:tcPr>
           <w:p>
             <w:pPr>
-              <w:pStyle w:val="Normal0"/>
+              <w:pStyle w:val="Corpodotexto"/>
               <w:widowControl w:val="false"/>
               <w:spacing w:lineRule="auto" w:line="288" w:before="0" w:after="0"/>
-              <w:jc w:val="left"/>
-              <w:rPr>
-                <w:rFonts w:eastAsia="Calibri" w:cs="Calibri"/>
-                <w:kern w:val="0"/>
-                <w:sz w:val="22"/>
-                <w:szCs w:val="22"/>
-                <w:lang w:val="pt-BR" w:eastAsia="pt-BR" w:bidi="ar-SA"/>
-              </w:rPr>
-            </w:pPr>
-            <w:r>
-              <w:rPr>
-                <w:rFonts w:eastAsia="Calibri" w:cs="Calibri"/>
-                <w:kern w:val="0"/>
-                <w:sz w:val="22"/>
-                <w:szCs w:val="22"/>
-                <w:lang w:val="pt-BR" w:eastAsia="pt-BR" w:bidi="ar-SA"/>
-              </w:rPr>
-              <w:fldChar w:fldCharType="begin"/>
-            </w:r>
-            <w:r>
-              <w:rPr>
-                <w:sz w:val="22"/>
-                <w:kern w:val="0"/>
-                <w:szCs w:val="22"/>
-                <w:rFonts w:eastAsia="Calibri" w:cs="Calibri"/>
-                <w:lang w:val="pt-BR" w:eastAsia="pt-BR" w:bidi="ar-SA"/>
-              </w:rPr>
-              <w:instrText xml:space="preserve"> FILLIN ""</w:instrText>
-            </w:r>
-            <w:r>
-              <w:rPr>
-                <w:sz w:val="22"/>
-                <w:kern w:val="0"/>
-                <w:szCs w:val="22"/>
-                <w:rFonts w:eastAsia="Calibri" w:cs="Calibri"/>
-                <w:lang w:val="pt-BR" w:eastAsia="pt-BR" w:bidi="ar-SA"/>
-              </w:rPr>
-              <w:fldChar w:fldCharType="separate"/>
-            </w:r>
-            <w:r>
-              <w:rPr>
-                <w:sz w:val="22"/>
-                <w:kern w:val="0"/>
-                <w:szCs w:val="22"/>
-                <w:rFonts w:eastAsia="Calibri" w:cs="Calibri"/>
-                <w:lang w:val="pt-BR" w:eastAsia="pt-BR" w:bidi="ar-SA"/>
-              </w:rPr>
-              <w:t>Sua resposta</w:t>
-            </w:r>
-            <w:r>
-              <w:rPr>
-                <w:sz w:val="22"/>
-                <w:kern w:val="0"/>
-                <w:szCs w:val="22"/>
-                <w:rFonts w:eastAsia="Calibri" w:cs="Calibri"/>
-                <w:lang w:val="pt-BR" w:eastAsia="pt-BR" w:bidi="ar-SA"/>
-              </w:rPr>
-              <w:fldChar w:fldCharType="end"/>
+              <w:jc w:val="both"/>
+              <w:rPr/>
+            </w:pPr>
+            <w:r>
+              <w:rPr>
+                <w:rFonts w:eastAsia="Calibri" w:cs="Calibri"/>
+                <w:kern w:val="0"/>
+                <w:sz w:val="22"/>
+                <w:szCs w:val="22"/>
+                <w:lang w:val="pt-BR" w:eastAsia="pt-BR" w:bidi="ar-SA"/>
+              </w:rPr>
+              <w:t>A partir da conversa com a comunidade externa, identificou-se como problema central a realização manual do controle de estoque da cozinha escolar, o que dificulta o acompanhamento preciso das entradas e saídas de produtos, aumenta a possibilidade de erros e compromete a organização das informações.</w:t>
+            </w:r>
+          </w:p>
+          <w:p>
+            <w:pPr>
+              <w:pStyle w:val="Corpodotexto"/>
+              <w:jc w:val="both"/>
+              <w:rPr/>
+            </w:pPr>
+            <w:r>
+              <w:rPr/>
+              <w:t>Diante disso, propõe-se o desenvolvimento de um sistema web para controle de estoque da cozinha escolar, utilizando framework web, banco de dados e recursos em nuvem, com o objetivo de substituir o processo manual por uma solução digital segura, acessível e automatizada. O sistema permitirá o cadastro e gerenciamento de produtos, controle de movimentações, disponibilização de API para integração com outros sistemas, além da aplicação de testes automatizados, controle de versão e integração contínua.</w:t>
+            </w:r>
+          </w:p>
+          <w:p>
+            <w:pPr>
+              <w:pStyle w:val="Corpodotexto"/>
+              <w:spacing w:before="0" w:after="140"/>
+              <w:jc w:val="both"/>
+              <w:rPr/>
+            </w:pPr>
+            <w:r>
+              <w:rPr/>
+              <w:t>Essa proposta está alinhada ao tema norteador da Univesp, pois envolve a aplicação prática de tecnologias da informação para promover transformação digital, modernização de processos e melhoria na gestão de recursos em uma instituição pública.</w:t>
             </w:r>
           </w:p>
         </w:tc>
@@ -1473,32 +1408,6 @@
         <w:t xml:space="preserve">Frente ao tema norteador e aos problemas levantados junto à comunidade externa, descreva qual o tema específico a ser trabalho pelo grupo no PI. </w:t>
       </w:r>
     </w:p>
-    <w:p>
-      <w:pPr>
-        <w:pStyle w:val="Normal0"/>
-        <w:spacing w:lineRule="auto" w:line="288" w:before="0" w:after="240"/>
-        <w:rPr>
-          <w:rFonts w:ascii="Trebuchet MS" w:hAnsi="Trebuchet MS"/>
-          <w:i/>
-          <w:i/>
-          <w:iCs/>
-          <w:color w:val="7F7F7F"/>
-          <w:sz w:val="20"/>
-          <w:szCs w:val="20"/>
-        </w:rPr>
-      </w:pPr>
-      <w:r>
-        <w:rPr>
-          <w:rFonts w:ascii="Trebuchet MS" w:hAnsi="Trebuchet MS"/>
-          <w:i/>
-          <w:iCs/>
-          <w:color w:val="7F7F7F"/>
-          <w:sz w:val="20"/>
-          <w:szCs w:val="20"/>
-        </w:rPr>
-        <w:t>Orientação para o preenchimento: É esperado que o grupo descreva o tema que será trabalhado no Projeto Integrador e sua relação com o tema norteador definido pela Univesp.</w:t>
-      </w:r>
-    </w:p>
     <w:tbl>
       <w:tblPr>
         <w:tblW w:w="8502" w:type="dxa"/>
@@ -1531,67 +1440,38 @@
           </w:tcPr>
           <w:p>
             <w:pPr>
-              <w:pStyle w:val="Normal0"/>
+              <w:pStyle w:val="Corpodotexto"/>
               <w:widowControl w:val="false"/>
               <w:spacing w:lineRule="auto" w:line="288" w:before="0" w:after="0"/>
-              <w:jc w:val="left"/>
-              <w:rPr>
-                <w:rFonts w:eastAsia="Calibri" w:cs="Calibri"/>
-                <w:kern w:val="0"/>
-                <w:sz w:val="22"/>
-                <w:szCs w:val="22"/>
-                <w:lang w:val="pt-BR" w:eastAsia="pt-BR" w:bidi="ar-SA"/>
-              </w:rPr>
-            </w:pPr>
-            <w:r>
-              <w:rPr>
-                <w:rFonts w:eastAsia="Calibri" w:cs="Calibri"/>
-                <w:kern w:val="0"/>
-                <w:sz w:val="22"/>
-                <w:szCs w:val="22"/>
-                <w:lang w:val="pt-BR" w:eastAsia="pt-BR" w:bidi="ar-SA"/>
-              </w:rPr>
-              <w:fldChar w:fldCharType="begin"/>
-            </w:r>
-            <w:r>
-              <w:rPr>
-                <w:sz w:val="22"/>
-                <w:kern w:val="0"/>
-                <w:szCs w:val="22"/>
-                <w:rFonts w:eastAsia="Calibri" w:cs="Calibri"/>
-                <w:lang w:val="pt-BR" w:eastAsia="pt-BR" w:bidi="ar-SA"/>
-              </w:rPr>
-              <w:instrText xml:space="preserve"> FILLIN ""</w:instrText>
-            </w:r>
-            <w:r>
-              <w:rPr>
-                <w:sz w:val="22"/>
-                <w:kern w:val="0"/>
-                <w:szCs w:val="22"/>
-                <w:rFonts w:eastAsia="Calibri" w:cs="Calibri"/>
-                <w:lang w:val="pt-BR" w:eastAsia="pt-BR" w:bidi="ar-SA"/>
-              </w:rPr>
-              <w:fldChar w:fldCharType="separate"/>
-            </w:r>
-            <w:r>
-              <w:rPr>
-                <w:sz w:val="22"/>
-                <w:kern w:val="0"/>
-                <w:szCs w:val="22"/>
-                <w:rFonts w:eastAsia="Calibri" w:cs="Calibri"/>
-                <w:lang w:val="pt-BR" w:eastAsia="pt-BR" w:bidi="ar-SA"/>
-              </w:rPr>
-              <w:t>Sua resposta</w:t>
-            </w:r>
-            <w:r>
-              <w:rPr>
-                <w:sz w:val="22"/>
-                <w:kern w:val="0"/>
-                <w:szCs w:val="22"/>
-                <w:rFonts w:eastAsia="Calibri" w:cs="Calibri"/>
-                <w:lang w:val="pt-BR" w:eastAsia="pt-BR" w:bidi="ar-SA"/>
-              </w:rPr>
-              <w:fldChar w:fldCharType="end"/>
+              <w:jc w:val="both"/>
+              <w:rPr/>
+            </w:pPr>
+            <w:r>
+              <w:rPr/>
+              <w:t>O tema específico a ser trabalhado pelo grupo no Projeto Integrador é o desenvolvimento de um sistema web para controle de estoque da cozinha escolar, com foco na digitalização e automatização do processo de gerenciamento da merenda.</w:t>
+            </w:r>
+          </w:p>
+          <w:p>
+            <w:pPr>
+              <w:pStyle w:val="Corpodotexto"/>
+              <w:jc w:val="both"/>
+              <w:rPr/>
+            </w:pPr>
+            <w:r>
+              <w:rPr/>
+              <w:t>A proposta consiste na criação de uma solução tecnológica que permita o cadastro de produtos, controle de entradas e saídas, organização das informações em banco de dados e disponibilização de recursos para integração com outros sistemas. O sistema será desenvolvido utilizando framework web, banco de dados e recursos em nuvem, além da aplicação de testes, controle de versão e integração contínua.</w:t>
+            </w:r>
+          </w:p>
+          <w:p>
+            <w:pPr>
+              <w:pStyle w:val="Corpodotexto"/>
+              <w:spacing w:before="0" w:after="140"/>
+              <w:jc w:val="both"/>
+              <w:rPr/>
+            </w:pPr>
+            <w:r>
+              <w:rPr/>
+              <w:t>Esse tema está diretamente relacionado ao tema norteador da Univesp, pois promove a aplicação prática da Tecnologia da Informação na modernização de processos, contribuindo para a transformação digital e para a melhoria da gestão em uma instituição pública.</w:t>
             </w:r>
           </w:p>
         </w:tc>
@@ -11379,7 +11259,7 @@
     </w:pPr>
     <w:r>
       <w:drawing>
-        <wp:anchor behindDoc="0" distT="0" distB="0" distL="114300" distR="114300" simplePos="0" locked="0" layoutInCell="0" allowOverlap="1" relativeHeight="8">
+        <wp:anchor behindDoc="1" distT="0" distB="0" distL="114300" distR="114300" simplePos="0" locked="0" layoutInCell="0" allowOverlap="1" relativeHeight="8">
           <wp:simplePos x="0" y="0"/>
           <wp:positionH relativeFrom="column">
             <wp:posOffset>13970</wp:posOffset>
@@ -11500,7 +11380,7 @@
     </w:pPr>
     <w:r>
       <w:drawing>
-        <wp:anchor behindDoc="0" distT="0" distB="0" distL="114300" distR="114300" simplePos="0" locked="0" layoutInCell="0" allowOverlap="1" relativeHeight="5">
+        <wp:anchor behindDoc="1" distT="0" distB="0" distL="114300" distR="114300" simplePos="0" locked="0" layoutInCell="0" allowOverlap="1" relativeHeight="5">
           <wp:simplePos x="0" y="0"/>
           <wp:positionH relativeFrom="column">
             <wp:posOffset>13970</wp:posOffset>
@@ -11627,7 +11507,7 @@
     <w:pPr>
       <w:widowControl/>
       <w:suppressAutoHyphens w:val="true"/>
-      <w:overflowPunct w:val="false"/>
+      <w:overflowPunct w:val="true"/>
       <w:bidi w:val="0"/>
       <w:spacing w:lineRule="auto" w:line="288" w:before="0" w:after="120"/>
       <w:jc w:val="left"/>
@@ -11873,7 +11753,7 @@
     <w:pPr>
       <w:widowControl/>
       <w:suppressAutoHyphens w:val="true"/>
-      <w:overflowPunct w:val="false"/>
+      <w:overflowPunct w:val="true"/>
       <w:bidi w:val="0"/>
       <w:spacing w:lineRule="auto" w:line="259" w:before="0" w:after="160"/>
       <w:jc w:val="left"/>

</xml_diff>

<commit_message>
Preenchimento das quinzenas do Plano de Ação
</commit_message>
<xml_diff>
--- a/Plano de Acao.docx
+++ b/Plano de Acao.docx
@@ -1036,6 +1036,7 @@
           <w:p>
             <w:pPr>
               <w:pStyle w:val="Corpodotexto"/>
+              <w:widowControl w:val="false"/>
               <w:jc w:val="both"/>
               <w:rPr/>
             </w:pPr>
@@ -1047,6 +1048,7 @@
           <w:p>
             <w:pPr>
               <w:pStyle w:val="Corpodotexto"/>
+              <w:widowControl w:val="false"/>
               <w:jc w:val="both"/>
               <w:rPr/>
             </w:pPr>
@@ -1170,6 +1172,7 @@
           <w:p>
             <w:pPr>
               <w:pStyle w:val="Corpodotexto"/>
+              <w:widowControl w:val="false"/>
               <w:jc w:val="both"/>
               <w:rPr/>
             </w:pPr>
@@ -1181,6 +1184,7 @@
           <w:p>
             <w:pPr>
               <w:pStyle w:val="Corpodotexto"/>
+              <w:widowControl w:val="false"/>
               <w:jc w:val="both"/>
               <w:rPr/>
             </w:pPr>
@@ -1231,7 +1235,11 @@
         </w:rPr>
       </w:pPr>
       <w:r>
-        <w:rPr/>
+        <w:rPr>
+          <w:rFonts w:ascii="Trebuchet MS" w:hAnsi="Trebuchet MS"/>
+          <w:b/>
+          <w:bCs/>
+        </w:rPr>
       </w:r>
     </w:p>
     <w:p>
@@ -1246,7 +1254,11 @@
         </w:rPr>
       </w:pPr>
       <w:r>
-        <w:rPr/>
+        <w:rPr>
+          <w:rFonts w:ascii="Trebuchet MS" w:hAnsi="Trebuchet MS"/>
+          <w:b/>
+          <w:bCs/>
+        </w:rPr>
       </w:r>
     </w:p>
     <w:p>
@@ -1261,7 +1273,11 @@
         </w:rPr>
       </w:pPr>
       <w:r>
-        <w:rPr/>
+        <w:rPr>
+          <w:rFonts w:ascii="Trebuchet MS" w:hAnsi="Trebuchet MS"/>
+          <w:b/>
+          <w:bCs/>
+        </w:rPr>
       </w:r>
     </w:p>
     <w:p>
@@ -1296,7 +1312,11 @@
         </w:rPr>
       </w:pPr>
       <w:r>
-        <w:rPr/>
+        <w:rPr>
+          <w:rFonts w:ascii="Trebuchet MS" w:hAnsi="Trebuchet MS"/>
+          <w:b/>
+          <w:bCs/>
+        </w:rPr>
       </w:r>
     </w:p>
     <w:tbl>
@@ -1351,6 +1371,7 @@
           <w:p>
             <w:pPr>
               <w:pStyle w:val="Corpodotexto"/>
+              <w:widowControl w:val="false"/>
               <w:jc w:val="both"/>
               <w:rPr/>
             </w:pPr>
@@ -1362,6 +1383,7 @@
           <w:p>
             <w:pPr>
               <w:pStyle w:val="Corpodotexto"/>
+              <w:widowControl w:val="false"/>
               <w:spacing w:before="0" w:after="140"/>
               <w:jc w:val="both"/>
               <w:rPr/>
@@ -1454,6 +1476,7 @@
           <w:p>
             <w:pPr>
               <w:pStyle w:val="Corpodotexto"/>
+              <w:widowControl w:val="false"/>
               <w:jc w:val="both"/>
               <w:rPr/>
             </w:pPr>
@@ -1465,6 +1488,7 @@
           <w:p>
             <w:pPr>
               <w:pStyle w:val="Corpodotexto"/>
+              <w:widowControl w:val="false"/>
               <w:spacing w:before="0" w:after="140"/>
               <w:jc w:val="both"/>
               <w:rPr/>
@@ -1520,85 +1544,6 @@
     </w:p>
     <w:p>
       <w:pPr>
-        <w:pStyle w:val="Normal0"/>
-        <w:spacing w:lineRule="auto" w:line="288" w:before="0" w:after="0"/>
-        <w:ind w:left="0" w:right="7590" w:hanging="0"/>
-        <w:rPr>
-          <w:rFonts w:ascii="Trebuchet MS" w:hAnsi="Trebuchet MS"/>
-          <w:i/>
-          <w:i/>
-          <w:iCs/>
-          <w:color w:val="7F7F7F"/>
-          <w:sz w:val="20"/>
-          <w:szCs w:val="20"/>
-        </w:rPr>
-      </w:pPr>
-      <w:r>
-        <w:rPr>
-          <w:rFonts w:ascii="Trebuchet MS" w:hAnsi="Trebuchet MS"/>
-          <w:i/>
-          <w:iCs/>
-          <w:color w:val="7F7F7F"/>
-          <w:sz w:val="20"/>
-          <w:szCs w:val="20"/>
-        </w:rPr>
-      </w:r>
-    </w:p>
-    <w:p>
-      <w:pPr>
-        <w:pStyle w:val="Normal0"/>
-        <w:spacing w:lineRule="auto" w:line="288" w:before="0" w:after="0"/>
-        <w:ind w:left="0" w:right="-64" w:hanging="0"/>
-        <w:rPr>
-          <w:rFonts w:ascii="Trebuchet MS" w:hAnsi="Trebuchet MS"/>
-          <w:i/>
-          <w:i/>
-          <w:iCs/>
-          <w:color w:val="7F7F7F"/>
-          <w:sz w:val="20"/>
-          <w:szCs w:val="20"/>
-        </w:rPr>
-      </w:pPr>
-      <w:r>
-        <w:rPr>
-          <w:rFonts w:ascii="Trebuchet MS" w:hAnsi="Trebuchet MS"/>
-          <w:i/>
-          <w:iCs/>
-          <w:color w:val="7F7F7F"/>
-          <w:sz w:val="20"/>
-          <w:szCs w:val="20"/>
-        </w:rPr>
-        <w:t>Orientação para o preenchimento: É esperado que o grupo identifique em todas as quinzenas: as atividades de maneira detalhada; os integrantes do grupo responsáveis por elas (todos os integrantes precisam ser listados); as datas de início e de finalização (conclusão da atividade) para cada uma delas. Além disso, ao descrever a atividade, note se há relação com o objetivo proposto para cada quinzena.</w:t>
-      </w:r>
-    </w:p>
-    <w:p>
-      <w:pPr>
-        <w:pStyle w:val="Normal0"/>
-        <w:spacing w:lineRule="auto" w:line="288" w:before="0" w:after="0"/>
-        <w:ind w:left="0" w:right="7590" w:hanging="0"/>
-        <w:rPr>
-          <w:rFonts w:ascii="Trebuchet MS" w:hAnsi="Trebuchet MS"/>
-          <w:i/>
-          <w:i/>
-          <w:iCs/>
-          <w:color w:val="7F7F7F"/>
-          <w:sz w:val="20"/>
-          <w:szCs w:val="20"/>
-        </w:rPr>
-      </w:pPr>
-      <w:r>
-        <w:rPr>
-          <w:rFonts w:ascii="Trebuchet MS" w:hAnsi="Trebuchet MS"/>
-          <w:i/>
-          <w:iCs/>
-          <w:color w:val="7F7F7F"/>
-          <w:sz w:val="20"/>
-          <w:szCs w:val="20"/>
-        </w:rPr>
-      </w:r>
-    </w:p>
-    <w:p>
-      <w:pPr>
         <w:pStyle w:val="Normal"/>
         <w:rPr/>
       </w:pPr>
@@ -2023,7 +1968,17 @@
                 <w:szCs w:val="22"/>
                 <w:lang w:val="pt-BR" w:eastAsia="pt-BR" w:bidi="ar-SA"/>
               </w:rPr>
-              <w:t>Willian Silveira Vantier</w:t>
+              <w:t xml:space="preserve">Willian, </w:t>
+            </w:r>
+            <w:r>
+              <w:rPr>
+                <w:rFonts w:eastAsia="Calibri" w:cs="Calibri"/>
+                <w:kern w:val="0"/>
+                <w:sz w:val="22"/>
+                <w:szCs w:val="22"/>
+                <w:lang w:val="pt-BR" w:eastAsia="pt-BR" w:bidi="ar-SA"/>
+              </w:rPr>
+              <w:t>Daniel, Gabriel e Dayan</w:t>
             </w:r>
           </w:p>
         </w:tc>
@@ -2187,6 +2142,7 @@
                 <w:szCs w:val="22"/>
                 <w:lang w:val="pt-BR" w:eastAsia="pt-BR" w:bidi="ar-SA"/>
               </w:rPr>
+              <w:t>Levantamento Bibliografico</w:t>
             </w:r>
           </w:p>
         </w:tc>
@@ -2226,6 +2182,18 @@
                 <w:szCs w:val="22"/>
                 <w:lang w:val="pt-BR" w:eastAsia="pt-BR" w:bidi="ar-SA"/>
               </w:rPr>
+              <w:t>Jos</w:t>
+            </w:r>
+            <w:r>
+              <w:rPr>
+                <w:rFonts w:eastAsia="Calibri" w:cs="Calibri"/>
+                <w:color w:val="auto"/>
+                <w:kern w:val="0"/>
+                <w:sz w:val="22"/>
+                <w:szCs w:val="22"/>
+                <w:lang w:val="pt-BR" w:eastAsia="pt-BR" w:bidi="ar-SA"/>
+              </w:rPr>
+              <w:t xml:space="preserve">é Ricardo, José Willas, Walter e Flávio </w:t>
             </w:r>
           </w:p>
         </w:tc>
@@ -2265,6 +2233,7 @@
                 <w:szCs w:val="22"/>
                 <w:lang w:val="pt-BR" w:eastAsia="pt-BR" w:bidi="ar-SA"/>
               </w:rPr>
+              <w:t>16/02/2026</w:t>
             </w:r>
           </w:p>
         </w:tc>
@@ -2304,6 +2273,7 @@
                 <w:szCs w:val="22"/>
                 <w:lang w:val="pt-BR" w:eastAsia="pt-BR" w:bidi="ar-SA"/>
               </w:rPr>
+              <w:t>27/02/2026</w:t>
             </w:r>
           </w:p>
         </w:tc>
@@ -2314,606 +2284,6 @@
               <w:top w:val="single" w:sz="4" w:space="0" w:color="000000"/>
               <w:left w:val="single" w:sz="4" w:space="0" w:color="000000"/>
               <w:bottom w:val="single" w:sz="4" w:space="0" w:color="000000"/>
-              <w:right w:val="single" w:sz="12" w:space="0" w:color="000000"/>
-            </w:tcBorders>
-            <w:tcMar>
-              <w:top w:w="57" w:type="dxa"/>
-              <w:bottom w:w="57" w:type="dxa"/>
-            </w:tcMar>
-          </w:tcPr>
-          <w:p>
-            <w:pPr>
-              <w:pStyle w:val="Normal"/>
-              <w:widowControl w:val="false"/>
-              <w:spacing w:before="0" w:after="0"/>
-              <w:jc w:val="left"/>
-              <w:rPr>
-                <w:rFonts w:eastAsia="Calibri" w:cs="Calibri"/>
-                <w:kern w:val="0"/>
-                <w:sz w:val="22"/>
-                <w:szCs w:val="22"/>
-                <w:lang w:val="pt-BR" w:eastAsia="pt-BR" w:bidi="ar-SA"/>
-              </w:rPr>
-            </w:pPr>
-            <w:r>
-              <w:rPr>
-                <w:rFonts w:eastAsia="Calibri" w:cs="Calibri"/>
-                <w:kern w:val="0"/>
-                <w:sz w:val="22"/>
-                <w:szCs w:val="22"/>
-                <w:lang w:val="pt-BR" w:eastAsia="pt-BR" w:bidi="ar-SA"/>
-              </w:rPr>
-            </w:r>
-          </w:p>
-        </w:tc>
-      </w:tr>
-      <w:tr>
-        <w:trPr>
-          <w:cantSplit w:val="true"/>
-        </w:trPr>
-        <w:tc>
-          <w:tcPr>
-            <w:tcW w:w="4382" w:type="dxa"/>
-            <w:tcBorders>
-              <w:top w:val="single" w:sz="4" w:space="0" w:color="000000"/>
-              <w:left w:val="single" w:sz="12" w:space="0" w:color="000000"/>
-              <w:bottom w:val="single" w:sz="4" w:space="0" w:color="000000"/>
-              <w:right w:val="single" w:sz="4" w:space="0" w:color="000000"/>
-            </w:tcBorders>
-            <w:tcMar>
-              <w:top w:w="57" w:type="dxa"/>
-              <w:bottom w:w="57" w:type="dxa"/>
-            </w:tcMar>
-          </w:tcPr>
-          <w:p>
-            <w:pPr>
-              <w:pStyle w:val="Normal"/>
-              <w:widowControl w:val="false"/>
-              <w:spacing w:before="0" w:after="0"/>
-              <w:jc w:val="left"/>
-              <w:rPr>
-                <w:rFonts w:eastAsia="Calibri" w:cs="Calibri"/>
-                <w:kern w:val="0"/>
-                <w:sz w:val="22"/>
-                <w:szCs w:val="22"/>
-                <w:lang w:val="pt-BR" w:eastAsia="pt-BR" w:bidi="ar-SA"/>
-              </w:rPr>
-            </w:pPr>
-            <w:r>
-              <w:rPr>
-                <w:rFonts w:eastAsia="Calibri" w:cs="Calibri"/>
-                <w:kern w:val="0"/>
-                <w:sz w:val="22"/>
-                <w:szCs w:val="22"/>
-                <w:lang w:val="pt-BR" w:eastAsia="pt-BR" w:bidi="ar-SA"/>
-              </w:rPr>
-            </w:r>
-          </w:p>
-        </w:tc>
-        <w:tc>
-          <w:tcPr>
-            <w:tcW w:w="2832" w:type="dxa"/>
-            <w:tcBorders>
-              <w:top w:val="single" w:sz="4" w:space="0" w:color="000000"/>
-              <w:left w:val="single" w:sz="4" w:space="0" w:color="000000"/>
-              <w:bottom w:val="single" w:sz="4" w:space="0" w:color="000000"/>
-              <w:right w:val="single" w:sz="4" w:space="0" w:color="000000"/>
-            </w:tcBorders>
-            <w:tcMar>
-              <w:top w:w="57" w:type="dxa"/>
-              <w:bottom w:w="57" w:type="dxa"/>
-            </w:tcMar>
-          </w:tcPr>
-          <w:p>
-            <w:pPr>
-              <w:pStyle w:val="Normal"/>
-              <w:widowControl w:val="false"/>
-              <w:spacing w:before="0" w:after="0"/>
-              <w:jc w:val="left"/>
-              <w:rPr>
-                <w:rFonts w:eastAsia="Calibri" w:cs="Calibri"/>
-                <w:kern w:val="0"/>
-                <w:sz w:val="22"/>
-                <w:szCs w:val="22"/>
-                <w:lang w:val="pt-BR" w:eastAsia="pt-BR" w:bidi="ar-SA"/>
-              </w:rPr>
-            </w:pPr>
-            <w:r>
-              <w:rPr>
-                <w:rFonts w:eastAsia="Calibri" w:cs="Calibri"/>
-                <w:kern w:val="0"/>
-                <w:sz w:val="22"/>
-                <w:szCs w:val="22"/>
-                <w:lang w:val="pt-BR" w:eastAsia="pt-BR" w:bidi="ar-SA"/>
-              </w:rPr>
-            </w:r>
-          </w:p>
-        </w:tc>
-        <w:tc>
-          <w:tcPr>
-            <w:tcW w:w="1557" w:type="dxa"/>
-            <w:tcBorders>
-              <w:top w:val="single" w:sz="4" w:space="0" w:color="000000"/>
-              <w:left w:val="single" w:sz="4" w:space="0" w:color="000000"/>
-              <w:bottom w:val="single" w:sz="4" w:space="0" w:color="000000"/>
-              <w:right w:val="single" w:sz="4" w:space="0" w:color="000000"/>
-            </w:tcBorders>
-            <w:tcMar>
-              <w:top w:w="57" w:type="dxa"/>
-              <w:bottom w:w="57" w:type="dxa"/>
-            </w:tcMar>
-          </w:tcPr>
-          <w:p>
-            <w:pPr>
-              <w:pStyle w:val="Normal"/>
-              <w:widowControl w:val="false"/>
-              <w:spacing w:before="0" w:after="0"/>
-              <w:jc w:val="left"/>
-              <w:rPr>
-                <w:rFonts w:eastAsia="Calibri" w:cs="Calibri"/>
-                <w:kern w:val="0"/>
-                <w:sz w:val="22"/>
-                <w:szCs w:val="22"/>
-                <w:lang w:val="pt-BR" w:eastAsia="pt-BR" w:bidi="ar-SA"/>
-              </w:rPr>
-            </w:pPr>
-            <w:r>
-              <w:rPr>
-                <w:rFonts w:eastAsia="Calibri" w:cs="Calibri"/>
-                <w:kern w:val="0"/>
-                <w:sz w:val="22"/>
-                <w:szCs w:val="22"/>
-                <w:lang w:val="pt-BR" w:eastAsia="pt-BR" w:bidi="ar-SA"/>
-              </w:rPr>
-            </w:r>
-          </w:p>
-        </w:tc>
-        <w:tc>
-          <w:tcPr>
-            <w:tcW w:w="1416" w:type="dxa"/>
-            <w:tcBorders>
-              <w:top w:val="single" w:sz="4" w:space="0" w:color="000000"/>
-              <w:left w:val="single" w:sz="4" w:space="0" w:color="000000"/>
-              <w:bottom w:val="single" w:sz="4" w:space="0" w:color="000000"/>
-              <w:right w:val="single" w:sz="4" w:space="0" w:color="000000"/>
-            </w:tcBorders>
-            <w:tcMar>
-              <w:top w:w="57" w:type="dxa"/>
-              <w:bottom w:w="57" w:type="dxa"/>
-            </w:tcMar>
-          </w:tcPr>
-          <w:p>
-            <w:pPr>
-              <w:pStyle w:val="Normal"/>
-              <w:widowControl w:val="false"/>
-              <w:spacing w:before="0" w:after="0"/>
-              <w:jc w:val="left"/>
-              <w:rPr>
-                <w:rFonts w:eastAsia="Calibri" w:cs="Calibri"/>
-                <w:kern w:val="0"/>
-                <w:sz w:val="22"/>
-                <w:szCs w:val="22"/>
-                <w:lang w:val="pt-BR" w:eastAsia="pt-BR" w:bidi="ar-SA"/>
-              </w:rPr>
-            </w:pPr>
-            <w:r>
-              <w:rPr>
-                <w:rFonts w:eastAsia="Calibri" w:cs="Calibri"/>
-                <w:kern w:val="0"/>
-                <w:sz w:val="22"/>
-                <w:szCs w:val="22"/>
-                <w:lang w:val="pt-BR" w:eastAsia="pt-BR" w:bidi="ar-SA"/>
-              </w:rPr>
-            </w:r>
-          </w:p>
-        </w:tc>
-        <w:tc>
-          <w:tcPr>
-            <w:tcW w:w="4461" w:type="dxa"/>
-            <w:tcBorders>
-              <w:top w:val="single" w:sz="4" w:space="0" w:color="000000"/>
-              <w:left w:val="single" w:sz="4" w:space="0" w:color="000000"/>
-              <w:bottom w:val="single" w:sz="4" w:space="0" w:color="000000"/>
-              <w:right w:val="single" w:sz="12" w:space="0" w:color="000000"/>
-            </w:tcBorders>
-            <w:tcMar>
-              <w:top w:w="57" w:type="dxa"/>
-              <w:bottom w:w="57" w:type="dxa"/>
-            </w:tcMar>
-          </w:tcPr>
-          <w:p>
-            <w:pPr>
-              <w:pStyle w:val="Normal"/>
-              <w:widowControl w:val="false"/>
-              <w:spacing w:before="0" w:after="0"/>
-              <w:jc w:val="left"/>
-              <w:rPr>
-                <w:rFonts w:eastAsia="Calibri" w:cs="Calibri"/>
-                <w:kern w:val="0"/>
-                <w:sz w:val="22"/>
-                <w:szCs w:val="22"/>
-                <w:lang w:val="pt-BR" w:eastAsia="pt-BR" w:bidi="ar-SA"/>
-              </w:rPr>
-            </w:pPr>
-            <w:r>
-              <w:rPr>
-                <w:rFonts w:eastAsia="Calibri" w:cs="Calibri"/>
-                <w:kern w:val="0"/>
-                <w:sz w:val="22"/>
-                <w:szCs w:val="22"/>
-                <w:lang w:val="pt-BR" w:eastAsia="pt-BR" w:bidi="ar-SA"/>
-              </w:rPr>
-            </w:r>
-          </w:p>
-        </w:tc>
-      </w:tr>
-      <w:tr>
-        <w:trPr>
-          <w:cantSplit w:val="true"/>
-        </w:trPr>
-        <w:tc>
-          <w:tcPr>
-            <w:tcW w:w="4382" w:type="dxa"/>
-            <w:tcBorders>
-              <w:top w:val="single" w:sz="4" w:space="0" w:color="000000"/>
-              <w:left w:val="single" w:sz="12" w:space="0" w:color="000000"/>
-              <w:bottom w:val="single" w:sz="4" w:space="0" w:color="000000"/>
-              <w:right w:val="single" w:sz="4" w:space="0" w:color="000000"/>
-            </w:tcBorders>
-            <w:tcMar>
-              <w:top w:w="57" w:type="dxa"/>
-              <w:bottom w:w="57" w:type="dxa"/>
-            </w:tcMar>
-          </w:tcPr>
-          <w:p>
-            <w:pPr>
-              <w:pStyle w:val="Normal"/>
-              <w:widowControl w:val="false"/>
-              <w:spacing w:before="0" w:after="0"/>
-              <w:jc w:val="left"/>
-              <w:rPr>
-                <w:rFonts w:eastAsia="Calibri" w:cs="Calibri"/>
-                <w:kern w:val="0"/>
-                <w:sz w:val="22"/>
-                <w:szCs w:val="22"/>
-                <w:lang w:val="pt-BR" w:eastAsia="pt-BR" w:bidi="ar-SA"/>
-              </w:rPr>
-            </w:pPr>
-            <w:r>
-              <w:rPr>
-                <w:rFonts w:eastAsia="Calibri" w:cs="Calibri"/>
-                <w:kern w:val="0"/>
-                <w:sz w:val="22"/>
-                <w:szCs w:val="22"/>
-                <w:lang w:val="pt-BR" w:eastAsia="pt-BR" w:bidi="ar-SA"/>
-              </w:rPr>
-            </w:r>
-          </w:p>
-        </w:tc>
-        <w:tc>
-          <w:tcPr>
-            <w:tcW w:w="2832" w:type="dxa"/>
-            <w:tcBorders>
-              <w:top w:val="single" w:sz="4" w:space="0" w:color="000000"/>
-              <w:left w:val="single" w:sz="4" w:space="0" w:color="000000"/>
-              <w:bottom w:val="single" w:sz="4" w:space="0" w:color="000000"/>
-              <w:right w:val="single" w:sz="4" w:space="0" w:color="000000"/>
-            </w:tcBorders>
-            <w:tcMar>
-              <w:top w:w="57" w:type="dxa"/>
-              <w:bottom w:w="57" w:type="dxa"/>
-            </w:tcMar>
-          </w:tcPr>
-          <w:p>
-            <w:pPr>
-              <w:pStyle w:val="Normal"/>
-              <w:widowControl w:val="false"/>
-              <w:spacing w:before="0" w:after="0"/>
-              <w:jc w:val="left"/>
-              <w:rPr>
-                <w:rFonts w:eastAsia="Calibri" w:cs="Calibri"/>
-                <w:kern w:val="0"/>
-                <w:sz w:val="22"/>
-                <w:szCs w:val="22"/>
-                <w:lang w:val="pt-BR" w:eastAsia="pt-BR" w:bidi="ar-SA"/>
-              </w:rPr>
-            </w:pPr>
-            <w:r>
-              <w:rPr>
-                <w:rFonts w:eastAsia="Calibri" w:cs="Calibri"/>
-                <w:kern w:val="0"/>
-                <w:sz w:val="22"/>
-                <w:szCs w:val="22"/>
-                <w:lang w:val="pt-BR" w:eastAsia="pt-BR" w:bidi="ar-SA"/>
-              </w:rPr>
-            </w:r>
-          </w:p>
-        </w:tc>
-        <w:tc>
-          <w:tcPr>
-            <w:tcW w:w="1557" w:type="dxa"/>
-            <w:tcBorders>
-              <w:top w:val="single" w:sz="4" w:space="0" w:color="000000"/>
-              <w:left w:val="single" w:sz="4" w:space="0" w:color="000000"/>
-              <w:bottom w:val="single" w:sz="4" w:space="0" w:color="000000"/>
-              <w:right w:val="single" w:sz="4" w:space="0" w:color="000000"/>
-            </w:tcBorders>
-            <w:tcMar>
-              <w:top w:w="57" w:type="dxa"/>
-              <w:bottom w:w="57" w:type="dxa"/>
-            </w:tcMar>
-          </w:tcPr>
-          <w:p>
-            <w:pPr>
-              <w:pStyle w:val="Normal"/>
-              <w:widowControl w:val="false"/>
-              <w:spacing w:before="0" w:after="0"/>
-              <w:jc w:val="left"/>
-              <w:rPr>
-                <w:rFonts w:eastAsia="Calibri" w:cs="Calibri"/>
-                <w:kern w:val="0"/>
-                <w:sz w:val="22"/>
-                <w:szCs w:val="22"/>
-                <w:lang w:val="pt-BR" w:eastAsia="pt-BR" w:bidi="ar-SA"/>
-              </w:rPr>
-            </w:pPr>
-            <w:r>
-              <w:rPr>
-                <w:rFonts w:eastAsia="Calibri" w:cs="Calibri"/>
-                <w:kern w:val="0"/>
-                <w:sz w:val="22"/>
-                <w:szCs w:val="22"/>
-                <w:lang w:val="pt-BR" w:eastAsia="pt-BR" w:bidi="ar-SA"/>
-              </w:rPr>
-            </w:r>
-          </w:p>
-        </w:tc>
-        <w:tc>
-          <w:tcPr>
-            <w:tcW w:w="1416" w:type="dxa"/>
-            <w:tcBorders>
-              <w:top w:val="single" w:sz="4" w:space="0" w:color="000000"/>
-              <w:left w:val="single" w:sz="4" w:space="0" w:color="000000"/>
-              <w:bottom w:val="single" w:sz="4" w:space="0" w:color="000000"/>
-              <w:right w:val="single" w:sz="4" w:space="0" w:color="000000"/>
-            </w:tcBorders>
-            <w:tcMar>
-              <w:top w:w="57" w:type="dxa"/>
-              <w:bottom w:w="57" w:type="dxa"/>
-            </w:tcMar>
-          </w:tcPr>
-          <w:p>
-            <w:pPr>
-              <w:pStyle w:val="Normal"/>
-              <w:widowControl w:val="false"/>
-              <w:spacing w:before="0" w:after="0"/>
-              <w:jc w:val="left"/>
-              <w:rPr>
-                <w:rFonts w:eastAsia="Calibri" w:cs="Calibri"/>
-                <w:kern w:val="0"/>
-                <w:sz w:val="22"/>
-                <w:szCs w:val="22"/>
-                <w:lang w:val="pt-BR" w:eastAsia="pt-BR" w:bidi="ar-SA"/>
-              </w:rPr>
-            </w:pPr>
-            <w:r>
-              <w:rPr>
-                <w:rFonts w:eastAsia="Calibri" w:cs="Calibri"/>
-                <w:kern w:val="0"/>
-                <w:sz w:val="22"/>
-                <w:szCs w:val="22"/>
-                <w:lang w:val="pt-BR" w:eastAsia="pt-BR" w:bidi="ar-SA"/>
-              </w:rPr>
-            </w:r>
-          </w:p>
-        </w:tc>
-        <w:tc>
-          <w:tcPr>
-            <w:tcW w:w="4461" w:type="dxa"/>
-            <w:tcBorders>
-              <w:top w:val="single" w:sz="4" w:space="0" w:color="000000"/>
-              <w:left w:val="single" w:sz="4" w:space="0" w:color="000000"/>
-              <w:bottom w:val="single" w:sz="4" w:space="0" w:color="000000"/>
-              <w:right w:val="single" w:sz="12" w:space="0" w:color="000000"/>
-            </w:tcBorders>
-            <w:tcMar>
-              <w:top w:w="57" w:type="dxa"/>
-              <w:bottom w:w="57" w:type="dxa"/>
-            </w:tcMar>
-          </w:tcPr>
-          <w:p>
-            <w:pPr>
-              <w:pStyle w:val="Normal"/>
-              <w:widowControl w:val="false"/>
-              <w:spacing w:before="0" w:after="0"/>
-              <w:jc w:val="left"/>
-              <w:rPr>
-                <w:rFonts w:eastAsia="Calibri" w:cs="Calibri"/>
-                <w:kern w:val="0"/>
-                <w:sz w:val="22"/>
-                <w:szCs w:val="22"/>
-                <w:lang w:val="pt-BR" w:eastAsia="pt-BR" w:bidi="ar-SA"/>
-              </w:rPr>
-            </w:pPr>
-            <w:r>
-              <w:rPr>
-                <w:rFonts w:eastAsia="Calibri" w:cs="Calibri"/>
-                <w:kern w:val="0"/>
-                <w:sz w:val="22"/>
-                <w:szCs w:val="22"/>
-                <w:lang w:val="pt-BR" w:eastAsia="pt-BR" w:bidi="ar-SA"/>
-              </w:rPr>
-            </w:r>
-          </w:p>
-        </w:tc>
-      </w:tr>
-      <w:tr>
-        <w:trPr>
-          <w:cantSplit w:val="true"/>
-        </w:trPr>
-        <w:tc>
-          <w:tcPr>
-            <w:tcW w:w="4382" w:type="dxa"/>
-            <w:tcBorders>
-              <w:top w:val="single" w:sz="4" w:space="0" w:color="000000"/>
-              <w:left w:val="single" w:sz="12" w:space="0" w:color="000000"/>
-              <w:bottom w:val="single" w:sz="12" w:space="0" w:color="000000"/>
-              <w:right w:val="single" w:sz="4" w:space="0" w:color="000000"/>
-            </w:tcBorders>
-            <w:tcMar>
-              <w:top w:w="57" w:type="dxa"/>
-              <w:bottom w:w="57" w:type="dxa"/>
-            </w:tcMar>
-          </w:tcPr>
-          <w:p>
-            <w:pPr>
-              <w:pStyle w:val="Normal"/>
-              <w:widowControl w:val="false"/>
-              <w:spacing w:before="0" w:after="0"/>
-              <w:jc w:val="left"/>
-              <w:rPr>
-                <w:rFonts w:eastAsia="Calibri" w:cs="Calibri"/>
-                <w:kern w:val="0"/>
-                <w:sz w:val="22"/>
-                <w:szCs w:val="22"/>
-                <w:lang w:val="pt-BR" w:eastAsia="pt-BR" w:bidi="ar-SA"/>
-              </w:rPr>
-            </w:pPr>
-            <w:r>
-              <w:rPr>
-                <w:rFonts w:eastAsia="Calibri" w:cs="Calibri"/>
-                <w:kern w:val="0"/>
-                <w:sz w:val="22"/>
-                <w:szCs w:val="22"/>
-                <w:lang w:val="pt-BR" w:eastAsia="pt-BR" w:bidi="ar-SA"/>
-              </w:rPr>
-            </w:r>
-          </w:p>
-        </w:tc>
-        <w:tc>
-          <w:tcPr>
-            <w:tcW w:w="2832" w:type="dxa"/>
-            <w:tcBorders>
-              <w:top w:val="single" w:sz="4" w:space="0" w:color="000000"/>
-              <w:left w:val="single" w:sz="4" w:space="0" w:color="000000"/>
-              <w:bottom w:val="single" w:sz="12" w:space="0" w:color="000000"/>
-              <w:right w:val="single" w:sz="4" w:space="0" w:color="000000"/>
-            </w:tcBorders>
-            <w:tcMar>
-              <w:top w:w="57" w:type="dxa"/>
-              <w:bottom w:w="57" w:type="dxa"/>
-            </w:tcMar>
-          </w:tcPr>
-          <w:p>
-            <w:pPr>
-              <w:pStyle w:val="Normal"/>
-              <w:widowControl w:val="false"/>
-              <w:spacing w:before="0" w:after="0"/>
-              <w:jc w:val="left"/>
-              <w:rPr>
-                <w:rFonts w:eastAsia="Calibri" w:cs="Calibri"/>
-                <w:kern w:val="0"/>
-                <w:sz w:val="22"/>
-                <w:szCs w:val="22"/>
-                <w:lang w:val="pt-BR" w:eastAsia="pt-BR" w:bidi="ar-SA"/>
-              </w:rPr>
-            </w:pPr>
-            <w:r>
-              <w:rPr>
-                <w:rFonts w:eastAsia="Calibri" w:cs="Calibri"/>
-                <w:kern w:val="0"/>
-                <w:sz w:val="22"/>
-                <w:szCs w:val="22"/>
-                <w:lang w:val="pt-BR" w:eastAsia="pt-BR" w:bidi="ar-SA"/>
-              </w:rPr>
-            </w:r>
-          </w:p>
-        </w:tc>
-        <w:tc>
-          <w:tcPr>
-            <w:tcW w:w="1557" w:type="dxa"/>
-            <w:tcBorders>
-              <w:top w:val="single" w:sz="4" w:space="0" w:color="000000"/>
-              <w:left w:val="single" w:sz="4" w:space="0" w:color="000000"/>
-              <w:bottom w:val="single" w:sz="12" w:space="0" w:color="000000"/>
-              <w:right w:val="single" w:sz="4" w:space="0" w:color="000000"/>
-            </w:tcBorders>
-            <w:tcMar>
-              <w:top w:w="57" w:type="dxa"/>
-              <w:bottom w:w="57" w:type="dxa"/>
-            </w:tcMar>
-          </w:tcPr>
-          <w:p>
-            <w:pPr>
-              <w:pStyle w:val="Normal"/>
-              <w:widowControl w:val="false"/>
-              <w:spacing w:before="0" w:after="0"/>
-              <w:jc w:val="left"/>
-              <w:rPr>
-                <w:rFonts w:eastAsia="Calibri" w:cs="Calibri"/>
-                <w:kern w:val="0"/>
-                <w:sz w:val="22"/>
-                <w:szCs w:val="22"/>
-                <w:lang w:val="pt-BR" w:eastAsia="pt-BR" w:bidi="ar-SA"/>
-              </w:rPr>
-            </w:pPr>
-            <w:r>
-              <w:rPr>
-                <w:rFonts w:eastAsia="Calibri" w:cs="Calibri"/>
-                <w:kern w:val="0"/>
-                <w:sz w:val="22"/>
-                <w:szCs w:val="22"/>
-                <w:lang w:val="pt-BR" w:eastAsia="pt-BR" w:bidi="ar-SA"/>
-              </w:rPr>
-            </w:r>
-          </w:p>
-        </w:tc>
-        <w:tc>
-          <w:tcPr>
-            <w:tcW w:w="1416" w:type="dxa"/>
-            <w:tcBorders>
-              <w:top w:val="single" w:sz="4" w:space="0" w:color="000000"/>
-              <w:left w:val="single" w:sz="4" w:space="0" w:color="000000"/>
-              <w:bottom w:val="single" w:sz="12" w:space="0" w:color="000000"/>
-              <w:right w:val="single" w:sz="4" w:space="0" w:color="000000"/>
-            </w:tcBorders>
-            <w:tcMar>
-              <w:top w:w="57" w:type="dxa"/>
-              <w:bottom w:w="57" w:type="dxa"/>
-            </w:tcMar>
-          </w:tcPr>
-          <w:p>
-            <w:pPr>
-              <w:pStyle w:val="Normal"/>
-              <w:widowControl w:val="false"/>
-              <w:spacing w:before="0" w:after="0"/>
-              <w:jc w:val="left"/>
-              <w:rPr>
-                <w:rFonts w:eastAsia="Calibri" w:cs="Calibri"/>
-                <w:kern w:val="0"/>
-                <w:sz w:val="22"/>
-                <w:szCs w:val="22"/>
-                <w:lang w:val="pt-BR" w:eastAsia="pt-BR" w:bidi="ar-SA"/>
-              </w:rPr>
-            </w:pPr>
-            <w:r>
-              <w:rPr>
-                <w:rFonts w:eastAsia="Calibri" w:cs="Calibri"/>
-                <w:kern w:val="0"/>
-                <w:sz w:val="22"/>
-                <w:szCs w:val="22"/>
-                <w:lang w:val="pt-BR" w:eastAsia="pt-BR" w:bidi="ar-SA"/>
-              </w:rPr>
-            </w:r>
-          </w:p>
-        </w:tc>
-        <w:tc>
-          <w:tcPr>
-            <w:tcW w:w="4461" w:type="dxa"/>
-            <w:tcBorders>
-              <w:top w:val="single" w:sz="4" w:space="0" w:color="000000"/>
-              <w:left w:val="single" w:sz="4" w:space="0" w:color="000000"/>
-              <w:bottom w:val="single" w:sz="12" w:space="0" w:color="000000"/>
               <w:right w:val="single" w:sz="12" w:space="0" w:color="000000"/>
             </w:tcBorders>
             <w:tcMar>
@@ -3330,7 +2700,7 @@
                 <w:szCs w:val="22"/>
                 <w:lang w:val="pt-BR" w:eastAsia="pt-BR" w:bidi="ar-SA"/>
               </w:rPr>
-              <w:t>Preenchimento do Plano de Aç</w:t>
+              <w:t>Elaboraç</w:t>
             </w:r>
             <w:r>
               <w:rPr>
@@ -3343,6 +2713,27 @@
               </w:rPr>
               <w:t>ão</w:t>
             </w:r>
+            <w:r>
+              <w:rPr>
+                <w:rFonts w:eastAsia="Calibri" w:cs="Calibri"/>
+                <w:kern w:val="0"/>
+                <w:sz w:val="22"/>
+                <w:szCs w:val="22"/>
+                <w:lang w:val="pt-BR" w:eastAsia="pt-BR" w:bidi="ar-SA"/>
+              </w:rPr>
+              <w:t xml:space="preserve"> do Plano de Aç</w:t>
+            </w:r>
+            <w:r>
+              <w:rPr>
+                <w:rFonts w:eastAsia="Calibri" w:cs="Calibri"/>
+                <w:color w:val="auto"/>
+                <w:kern w:val="0"/>
+                <w:sz w:val="22"/>
+                <w:szCs w:val="22"/>
+                <w:lang w:val="pt-BR" w:eastAsia="pt-BR" w:bidi="ar-SA"/>
+              </w:rPr>
+              <w:t>ão</w:t>
+            </w:r>
           </w:p>
         </w:tc>
         <w:tc>
@@ -3381,7 +2772,18 @@
                 <w:szCs w:val="22"/>
                 <w:lang w:val="pt-BR" w:eastAsia="pt-BR" w:bidi="ar-SA"/>
               </w:rPr>
-              <w:t>Willian Silveira Vantier</w:t>
+              <w:t>Jos</w:t>
+            </w:r>
+            <w:r>
+              <w:rPr>
+                <w:rFonts w:eastAsia="Calibri" w:cs="Calibri"/>
+                <w:color w:val="auto"/>
+                <w:kern w:val="0"/>
+                <w:sz w:val="22"/>
+                <w:szCs w:val="22"/>
+                <w:lang w:val="pt-BR" w:eastAsia="pt-BR" w:bidi="ar-SA"/>
+              </w:rPr>
+              <w:t xml:space="preserve">é Ricardo, José Willas, Walter e Flávio </w:t>
             </w:r>
           </w:p>
         </w:tc>
@@ -3545,6 +2947,18 @@
                 <w:szCs w:val="22"/>
                 <w:lang w:val="pt-BR" w:eastAsia="pt-BR" w:bidi="ar-SA"/>
               </w:rPr>
+              <w:t>Pesquisa de Campo e definiç</w:t>
+            </w:r>
+            <w:r>
+              <w:rPr>
+                <w:rFonts w:eastAsia="Calibri" w:cs="Calibri"/>
+                <w:color w:val="auto"/>
+                <w:kern w:val="0"/>
+                <w:sz w:val="22"/>
+                <w:szCs w:val="22"/>
+                <w:lang w:val="pt-BR" w:eastAsia="pt-BR" w:bidi="ar-SA"/>
+              </w:rPr>
+              <w:t>ão dos problemas</w:t>
             </w:r>
           </w:p>
         </w:tc>
@@ -3584,6 +2998,7 @@
                 <w:szCs w:val="22"/>
                 <w:lang w:val="pt-BR" w:eastAsia="pt-BR" w:bidi="ar-SA"/>
               </w:rPr>
+              <w:t>Willian, Daniel, Gabriel e Dayan</w:t>
             </w:r>
           </w:p>
         </w:tc>
@@ -3672,606 +3087,6 @@
               <w:top w:val="single" w:sz="4" w:space="0" w:color="000000"/>
               <w:left w:val="single" w:sz="4" w:space="0" w:color="000000"/>
               <w:bottom w:val="single" w:sz="4" w:space="0" w:color="000000"/>
-              <w:right w:val="single" w:sz="12" w:space="0" w:color="000000"/>
-            </w:tcBorders>
-            <w:tcMar>
-              <w:top w:w="57" w:type="dxa"/>
-              <w:bottom w:w="57" w:type="dxa"/>
-            </w:tcMar>
-          </w:tcPr>
-          <w:p>
-            <w:pPr>
-              <w:pStyle w:val="Normal"/>
-              <w:widowControl w:val="false"/>
-              <w:spacing w:before="0" w:after="0"/>
-              <w:jc w:val="left"/>
-              <w:rPr>
-                <w:rFonts w:eastAsia="Calibri" w:cs="Calibri"/>
-                <w:kern w:val="0"/>
-                <w:sz w:val="22"/>
-                <w:szCs w:val="22"/>
-                <w:lang w:val="pt-BR" w:eastAsia="pt-BR" w:bidi="ar-SA"/>
-              </w:rPr>
-            </w:pPr>
-            <w:r>
-              <w:rPr>
-                <w:rFonts w:eastAsia="Calibri" w:cs="Calibri"/>
-                <w:kern w:val="0"/>
-                <w:sz w:val="22"/>
-                <w:szCs w:val="22"/>
-                <w:lang w:val="pt-BR" w:eastAsia="pt-BR" w:bidi="ar-SA"/>
-              </w:rPr>
-            </w:r>
-          </w:p>
-        </w:tc>
-      </w:tr>
-      <w:tr>
-        <w:trPr>
-          <w:cantSplit w:val="true"/>
-        </w:trPr>
-        <w:tc>
-          <w:tcPr>
-            <w:tcW w:w="4382" w:type="dxa"/>
-            <w:tcBorders>
-              <w:top w:val="single" w:sz="4" w:space="0" w:color="000000"/>
-              <w:left w:val="single" w:sz="12" w:space="0" w:color="000000"/>
-              <w:bottom w:val="single" w:sz="4" w:space="0" w:color="000000"/>
-              <w:right w:val="single" w:sz="4" w:space="0" w:color="000000"/>
-            </w:tcBorders>
-            <w:tcMar>
-              <w:top w:w="57" w:type="dxa"/>
-              <w:bottom w:w="57" w:type="dxa"/>
-            </w:tcMar>
-          </w:tcPr>
-          <w:p>
-            <w:pPr>
-              <w:pStyle w:val="Normal"/>
-              <w:widowControl w:val="false"/>
-              <w:spacing w:before="0" w:after="0"/>
-              <w:jc w:val="left"/>
-              <w:rPr>
-                <w:rFonts w:eastAsia="Calibri" w:cs="Calibri"/>
-                <w:kern w:val="0"/>
-                <w:sz w:val="22"/>
-                <w:szCs w:val="22"/>
-                <w:lang w:val="pt-BR" w:eastAsia="pt-BR" w:bidi="ar-SA"/>
-              </w:rPr>
-            </w:pPr>
-            <w:r>
-              <w:rPr>
-                <w:rFonts w:eastAsia="Calibri" w:cs="Calibri"/>
-                <w:kern w:val="0"/>
-                <w:sz w:val="22"/>
-                <w:szCs w:val="22"/>
-                <w:lang w:val="pt-BR" w:eastAsia="pt-BR" w:bidi="ar-SA"/>
-              </w:rPr>
-            </w:r>
-          </w:p>
-        </w:tc>
-        <w:tc>
-          <w:tcPr>
-            <w:tcW w:w="2832" w:type="dxa"/>
-            <w:tcBorders>
-              <w:top w:val="single" w:sz="4" w:space="0" w:color="000000"/>
-              <w:left w:val="single" w:sz="4" w:space="0" w:color="000000"/>
-              <w:bottom w:val="single" w:sz="4" w:space="0" w:color="000000"/>
-              <w:right w:val="single" w:sz="4" w:space="0" w:color="000000"/>
-            </w:tcBorders>
-            <w:tcMar>
-              <w:top w:w="57" w:type="dxa"/>
-              <w:bottom w:w="57" w:type="dxa"/>
-            </w:tcMar>
-          </w:tcPr>
-          <w:p>
-            <w:pPr>
-              <w:pStyle w:val="Normal"/>
-              <w:widowControl w:val="false"/>
-              <w:spacing w:before="0" w:after="0"/>
-              <w:jc w:val="left"/>
-              <w:rPr>
-                <w:rFonts w:eastAsia="Calibri" w:cs="Calibri"/>
-                <w:kern w:val="0"/>
-                <w:sz w:val="22"/>
-                <w:szCs w:val="22"/>
-                <w:lang w:val="pt-BR" w:eastAsia="pt-BR" w:bidi="ar-SA"/>
-              </w:rPr>
-            </w:pPr>
-            <w:r>
-              <w:rPr>
-                <w:rFonts w:eastAsia="Calibri" w:cs="Calibri"/>
-                <w:kern w:val="0"/>
-                <w:sz w:val="22"/>
-                <w:szCs w:val="22"/>
-                <w:lang w:val="pt-BR" w:eastAsia="pt-BR" w:bidi="ar-SA"/>
-              </w:rPr>
-            </w:r>
-          </w:p>
-        </w:tc>
-        <w:tc>
-          <w:tcPr>
-            <w:tcW w:w="1557" w:type="dxa"/>
-            <w:tcBorders>
-              <w:top w:val="single" w:sz="4" w:space="0" w:color="000000"/>
-              <w:left w:val="single" w:sz="4" w:space="0" w:color="000000"/>
-              <w:bottom w:val="single" w:sz="4" w:space="0" w:color="000000"/>
-              <w:right w:val="single" w:sz="4" w:space="0" w:color="000000"/>
-            </w:tcBorders>
-            <w:tcMar>
-              <w:top w:w="57" w:type="dxa"/>
-              <w:bottom w:w="57" w:type="dxa"/>
-            </w:tcMar>
-          </w:tcPr>
-          <w:p>
-            <w:pPr>
-              <w:pStyle w:val="Normal"/>
-              <w:widowControl w:val="false"/>
-              <w:spacing w:before="0" w:after="0"/>
-              <w:jc w:val="left"/>
-              <w:rPr>
-                <w:rFonts w:eastAsia="Calibri" w:cs="Calibri"/>
-                <w:kern w:val="0"/>
-                <w:sz w:val="22"/>
-                <w:szCs w:val="22"/>
-                <w:lang w:val="pt-BR" w:eastAsia="pt-BR" w:bidi="ar-SA"/>
-              </w:rPr>
-            </w:pPr>
-            <w:r>
-              <w:rPr>
-                <w:rFonts w:eastAsia="Calibri" w:cs="Calibri"/>
-                <w:kern w:val="0"/>
-                <w:sz w:val="22"/>
-                <w:szCs w:val="22"/>
-                <w:lang w:val="pt-BR" w:eastAsia="pt-BR" w:bidi="ar-SA"/>
-              </w:rPr>
-            </w:r>
-          </w:p>
-        </w:tc>
-        <w:tc>
-          <w:tcPr>
-            <w:tcW w:w="1416" w:type="dxa"/>
-            <w:tcBorders>
-              <w:top w:val="single" w:sz="4" w:space="0" w:color="000000"/>
-              <w:left w:val="single" w:sz="4" w:space="0" w:color="000000"/>
-              <w:bottom w:val="single" w:sz="4" w:space="0" w:color="000000"/>
-              <w:right w:val="single" w:sz="4" w:space="0" w:color="000000"/>
-            </w:tcBorders>
-            <w:tcMar>
-              <w:top w:w="57" w:type="dxa"/>
-              <w:bottom w:w="57" w:type="dxa"/>
-            </w:tcMar>
-          </w:tcPr>
-          <w:p>
-            <w:pPr>
-              <w:pStyle w:val="Normal"/>
-              <w:widowControl w:val="false"/>
-              <w:spacing w:before="0" w:after="0"/>
-              <w:jc w:val="left"/>
-              <w:rPr>
-                <w:rFonts w:eastAsia="Calibri" w:cs="Calibri"/>
-                <w:kern w:val="0"/>
-                <w:sz w:val="22"/>
-                <w:szCs w:val="22"/>
-                <w:lang w:val="pt-BR" w:eastAsia="pt-BR" w:bidi="ar-SA"/>
-              </w:rPr>
-            </w:pPr>
-            <w:r>
-              <w:rPr>
-                <w:rFonts w:eastAsia="Calibri" w:cs="Calibri"/>
-                <w:kern w:val="0"/>
-                <w:sz w:val="22"/>
-                <w:szCs w:val="22"/>
-                <w:lang w:val="pt-BR" w:eastAsia="pt-BR" w:bidi="ar-SA"/>
-              </w:rPr>
-            </w:r>
-          </w:p>
-        </w:tc>
-        <w:tc>
-          <w:tcPr>
-            <w:tcW w:w="4461" w:type="dxa"/>
-            <w:tcBorders>
-              <w:top w:val="single" w:sz="4" w:space="0" w:color="000000"/>
-              <w:left w:val="single" w:sz="4" w:space="0" w:color="000000"/>
-              <w:bottom w:val="single" w:sz="4" w:space="0" w:color="000000"/>
-              <w:right w:val="single" w:sz="12" w:space="0" w:color="000000"/>
-            </w:tcBorders>
-            <w:tcMar>
-              <w:top w:w="57" w:type="dxa"/>
-              <w:bottom w:w="57" w:type="dxa"/>
-            </w:tcMar>
-          </w:tcPr>
-          <w:p>
-            <w:pPr>
-              <w:pStyle w:val="Normal"/>
-              <w:widowControl w:val="false"/>
-              <w:spacing w:before="0" w:after="0"/>
-              <w:jc w:val="left"/>
-              <w:rPr>
-                <w:rFonts w:eastAsia="Calibri" w:cs="Calibri"/>
-                <w:kern w:val="0"/>
-                <w:sz w:val="22"/>
-                <w:szCs w:val="22"/>
-                <w:lang w:val="pt-BR" w:eastAsia="pt-BR" w:bidi="ar-SA"/>
-              </w:rPr>
-            </w:pPr>
-            <w:r>
-              <w:rPr>
-                <w:rFonts w:eastAsia="Calibri" w:cs="Calibri"/>
-                <w:kern w:val="0"/>
-                <w:sz w:val="22"/>
-                <w:szCs w:val="22"/>
-                <w:lang w:val="pt-BR" w:eastAsia="pt-BR" w:bidi="ar-SA"/>
-              </w:rPr>
-            </w:r>
-          </w:p>
-        </w:tc>
-      </w:tr>
-      <w:tr>
-        <w:trPr>
-          <w:cantSplit w:val="true"/>
-        </w:trPr>
-        <w:tc>
-          <w:tcPr>
-            <w:tcW w:w="4382" w:type="dxa"/>
-            <w:tcBorders>
-              <w:top w:val="single" w:sz="4" w:space="0" w:color="000000"/>
-              <w:left w:val="single" w:sz="12" w:space="0" w:color="000000"/>
-              <w:bottom w:val="single" w:sz="4" w:space="0" w:color="000000"/>
-              <w:right w:val="single" w:sz="4" w:space="0" w:color="000000"/>
-            </w:tcBorders>
-            <w:tcMar>
-              <w:top w:w="57" w:type="dxa"/>
-              <w:bottom w:w="57" w:type="dxa"/>
-            </w:tcMar>
-          </w:tcPr>
-          <w:p>
-            <w:pPr>
-              <w:pStyle w:val="Normal"/>
-              <w:widowControl w:val="false"/>
-              <w:spacing w:before="0" w:after="0"/>
-              <w:jc w:val="left"/>
-              <w:rPr>
-                <w:rFonts w:eastAsia="Calibri" w:cs="Calibri"/>
-                <w:kern w:val="0"/>
-                <w:sz w:val="22"/>
-                <w:szCs w:val="22"/>
-                <w:lang w:val="pt-BR" w:eastAsia="pt-BR" w:bidi="ar-SA"/>
-              </w:rPr>
-            </w:pPr>
-            <w:r>
-              <w:rPr>
-                <w:rFonts w:eastAsia="Calibri" w:cs="Calibri"/>
-                <w:kern w:val="0"/>
-                <w:sz w:val="22"/>
-                <w:szCs w:val="22"/>
-                <w:lang w:val="pt-BR" w:eastAsia="pt-BR" w:bidi="ar-SA"/>
-              </w:rPr>
-            </w:r>
-          </w:p>
-        </w:tc>
-        <w:tc>
-          <w:tcPr>
-            <w:tcW w:w="2832" w:type="dxa"/>
-            <w:tcBorders>
-              <w:top w:val="single" w:sz="4" w:space="0" w:color="000000"/>
-              <w:left w:val="single" w:sz="4" w:space="0" w:color="000000"/>
-              <w:bottom w:val="single" w:sz="4" w:space="0" w:color="000000"/>
-              <w:right w:val="single" w:sz="4" w:space="0" w:color="000000"/>
-            </w:tcBorders>
-            <w:tcMar>
-              <w:top w:w="57" w:type="dxa"/>
-              <w:bottom w:w="57" w:type="dxa"/>
-            </w:tcMar>
-          </w:tcPr>
-          <w:p>
-            <w:pPr>
-              <w:pStyle w:val="Normal"/>
-              <w:widowControl w:val="false"/>
-              <w:spacing w:before="0" w:after="0"/>
-              <w:jc w:val="left"/>
-              <w:rPr>
-                <w:rFonts w:eastAsia="Calibri" w:cs="Calibri"/>
-                <w:kern w:val="0"/>
-                <w:sz w:val="22"/>
-                <w:szCs w:val="22"/>
-                <w:lang w:val="pt-BR" w:eastAsia="pt-BR" w:bidi="ar-SA"/>
-              </w:rPr>
-            </w:pPr>
-            <w:r>
-              <w:rPr>
-                <w:rFonts w:eastAsia="Calibri" w:cs="Calibri"/>
-                <w:kern w:val="0"/>
-                <w:sz w:val="22"/>
-                <w:szCs w:val="22"/>
-                <w:lang w:val="pt-BR" w:eastAsia="pt-BR" w:bidi="ar-SA"/>
-              </w:rPr>
-            </w:r>
-          </w:p>
-        </w:tc>
-        <w:tc>
-          <w:tcPr>
-            <w:tcW w:w="1557" w:type="dxa"/>
-            <w:tcBorders>
-              <w:top w:val="single" w:sz="4" w:space="0" w:color="000000"/>
-              <w:left w:val="single" w:sz="4" w:space="0" w:color="000000"/>
-              <w:bottom w:val="single" w:sz="4" w:space="0" w:color="000000"/>
-              <w:right w:val="single" w:sz="4" w:space="0" w:color="000000"/>
-            </w:tcBorders>
-            <w:tcMar>
-              <w:top w:w="57" w:type="dxa"/>
-              <w:bottom w:w="57" w:type="dxa"/>
-            </w:tcMar>
-          </w:tcPr>
-          <w:p>
-            <w:pPr>
-              <w:pStyle w:val="Normal"/>
-              <w:widowControl w:val="false"/>
-              <w:spacing w:before="0" w:after="0"/>
-              <w:jc w:val="left"/>
-              <w:rPr>
-                <w:rFonts w:eastAsia="Calibri" w:cs="Calibri"/>
-                <w:kern w:val="0"/>
-                <w:sz w:val="22"/>
-                <w:szCs w:val="22"/>
-                <w:lang w:val="pt-BR" w:eastAsia="pt-BR" w:bidi="ar-SA"/>
-              </w:rPr>
-            </w:pPr>
-            <w:r>
-              <w:rPr>
-                <w:rFonts w:eastAsia="Calibri" w:cs="Calibri"/>
-                <w:kern w:val="0"/>
-                <w:sz w:val="22"/>
-                <w:szCs w:val="22"/>
-                <w:lang w:val="pt-BR" w:eastAsia="pt-BR" w:bidi="ar-SA"/>
-              </w:rPr>
-            </w:r>
-          </w:p>
-        </w:tc>
-        <w:tc>
-          <w:tcPr>
-            <w:tcW w:w="1416" w:type="dxa"/>
-            <w:tcBorders>
-              <w:top w:val="single" w:sz="4" w:space="0" w:color="000000"/>
-              <w:left w:val="single" w:sz="4" w:space="0" w:color="000000"/>
-              <w:bottom w:val="single" w:sz="4" w:space="0" w:color="000000"/>
-              <w:right w:val="single" w:sz="4" w:space="0" w:color="000000"/>
-            </w:tcBorders>
-            <w:tcMar>
-              <w:top w:w="57" w:type="dxa"/>
-              <w:bottom w:w="57" w:type="dxa"/>
-            </w:tcMar>
-          </w:tcPr>
-          <w:p>
-            <w:pPr>
-              <w:pStyle w:val="Normal"/>
-              <w:widowControl w:val="false"/>
-              <w:spacing w:before="0" w:after="0"/>
-              <w:jc w:val="left"/>
-              <w:rPr>
-                <w:rFonts w:eastAsia="Calibri" w:cs="Calibri"/>
-                <w:kern w:val="0"/>
-                <w:sz w:val="22"/>
-                <w:szCs w:val="22"/>
-                <w:lang w:val="pt-BR" w:eastAsia="pt-BR" w:bidi="ar-SA"/>
-              </w:rPr>
-            </w:pPr>
-            <w:r>
-              <w:rPr>
-                <w:rFonts w:eastAsia="Calibri" w:cs="Calibri"/>
-                <w:kern w:val="0"/>
-                <w:sz w:val="22"/>
-                <w:szCs w:val="22"/>
-                <w:lang w:val="pt-BR" w:eastAsia="pt-BR" w:bidi="ar-SA"/>
-              </w:rPr>
-            </w:r>
-          </w:p>
-        </w:tc>
-        <w:tc>
-          <w:tcPr>
-            <w:tcW w:w="4461" w:type="dxa"/>
-            <w:tcBorders>
-              <w:top w:val="single" w:sz="4" w:space="0" w:color="000000"/>
-              <w:left w:val="single" w:sz="4" w:space="0" w:color="000000"/>
-              <w:bottom w:val="single" w:sz="4" w:space="0" w:color="000000"/>
-              <w:right w:val="single" w:sz="12" w:space="0" w:color="000000"/>
-            </w:tcBorders>
-            <w:tcMar>
-              <w:top w:w="57" w:type="dxa"/>
-              <w:bottom w:w="57" w:type="dxa"/>
-            </w:tcMar>
-          </w:tcPr>
-          <w:p>
-            <w:pPr>
-              <w:pStyle w:val="Normal"/>
-              <w:widowControl w:val="false"/>
-              <w:spacing w:before="0" w:after="0"/>
-              <w:jc w:val="left"/>
-              <w:rPr>
-                <w:rFonts w:eastAsia="Calibri" w:cs="Calibri"/>
-                <w:kern w:val="0"/>
-                <w:sz w:val="22"/>
-                <w:szCs w:val="22"/>
-                <w:lang w:val="pt-BR" w:eastAsia="pt-BR" w:bidi="ar-SA"/>
-              </w:rPr>
-            </w:pPr>
-            <w:r>
-              <w:rPr>
-                <w:rFonts w:eastAsia="Calibri" w:cs="Calibri"/>
-                <w:kern w:val="0"/>
-                <w:sz w:val="22"/>
-                <w:szCs w:val="22"/>
-                <w:lang w:val="pt-BR" w:eastAsia="pt-BR" w:bidi="ar-SA"/>
-              </w:rPr>
-            </w:r>
-          </w:p>
-        </w:tc>
-      </w:tr>
-      <w:tr>
-        <w:trPr>
-          <w:cantSplit w:val="true"/>
-        </w:trPr>
-        <w:tc>
-          <w:tcPr>
-            <w:tcW w:w="4382" w:type="dxa"/>
-            <w:tcBorders>
-              <w:top w:val="single" w:sz="4" w:space="0" w:color="000000"/>
-              <w:left w:val="single" w:sz="12" w:space="0" w:color="000000"/>
-              <w:bottom w:val="single" w:sz="12" w:space="0" w:color="000000"/>
-              <w:right w:val="single" w:sz="4" w:space="0" w:color="000000"/>
-            </w:tcBorders>
-            <w:tcMar>
-              <w:top w:w="57" w:type="dxa"/>
-              <w:bottom w:w="57" w:type="dxa"/>
-            </w:tcMar>
-          </w:tcPr>
-          <w:p>
-            <w:pPr>
-              <w:pStyle w:val="Normal"/>
-              <w:widowControl w:val="false"/>
-              <w:spacing w:before="0" w:after="0"/>
-              <w:jc w:val="left"/>
-              <w:rPr>
-                <w:rFonts w:eastAsia="Calibri" w:cs="Calibri"/>
-                <w:kern w:val="0"/>
-                <w:sz w:val="22"/>
-                <w:szCs w:val="22"/>
-                <w:lang w:val="pt-BR" w:eastAsia="pt-BR" w:bidi="ar-SA"/>
-              </w:rPr>
-            </w:pPr>
-            <w:r>
-              <w:rPr>
-                <w:rFonts w:eastAsia="Calibri" w:cs="Calibri"/>
-                <w:kern w:val="0"/>
-                <w:sz w:val="22"/>
-                <w:szCs w:val="22"/>
-                <w:lang w:val="pt-BR" w:eastAsia="pt-BR" w:bidi="ar-SA"/>
-              </w:rPr>
-            </w:r>
-          </w:p>
-        </w:tc>
-        <w:tc>
-          <w:tcPr>
-            <w:tcW w:w="2832" w:type="dxa"/>
-            <w:tcBorders>
-              <w:top w:val="single" w:sz="4" w:space="0" w:color="000000"/>
-              <w:left w:val="single" w:sz="4" w:space="0" w:color="000000"/>
-              <w:bottom w:val="single" w:sz="12" w:space="0" w:color="000000"/>
-              <w:right w:val="single" w:sz="4" w:space="0" w:color="000000"/>
-            </w:tcBorders>
-            <w:tcMar>
-              <w:top w:w="57" w:type="dxa"/>
-              <w:bottom w:w="57" w:type="dxa"/>
-            </w:tcMar>
-          </w:tcPr>
-          <w:p>
-            <w:pPr>
-              <w:pStyle w:val="Normal"/>
-              <w:widowControl w:val="false"/>
-              <w:spacing w:before="0" w:after="0"/>
-              <w:jc w:val="left"/>
-              <w:rPr>
-                <w:rFonts w:eastAsia="Calibri" w:cs="Calibri"/>
-                <w:kern w:val="0"/>
-                <w:sz w:val="22"/>
-                <w:szCs w:val="22"/>
-                <w:lang w:val="pt-BR" w:eastAsia="pt-BR" w:bidi="ar-SA"/>
-              </w:rPr>
-            </w:pPr>
-            <w:r>
-              <w:rPr>
-                <w:rFonts w:eastAsia="Calibri" w:cs="Calibri"/>
-                <w:kern w:val="0"/>
-                <w:sz w:val="22"/>
-                <w:szCs w:val="22"/>
-                <w:lang w:val="pt-BR" w:eastAsia="pt-BR" w:bidi="ar-SA"/>
-              </w:rPr>
-            </w:r>
-          </w:p>
-        </w:tc>
-        <w:tc>
-          <w:tcPr>
-            <w:tcW w:w="1557" w:type="dxa"/>
-            <w:tcBorders>
-              <w:top w:val="single" w:sz="4" w:space="0" w:color="000000"/>
-              <w:left w:val="single" w:sz="4" w:space="0" w:color="000000"/>
-              <w:bottom w:val="single" w:sz="12" w:space="0" w:color="000000"/>
-              <w:right w:val="single" w:sz="4" w:space="0" w:color="000000"/>
-            </w:tcBorders>
-            <w:tcMar>
-              <w:top w:w="57" w:type="dxa"/>
-              <w:bottom w:w="57" w:type="dxa"/>
-            </w:tcMar>
-          </w:tcPr>
-          <w:p>
-            <w:pPr>
-              <w:pStyle w:val="Normal"/>
-              <w:widowControl w:val="false"/>
-              <w:spacing w:before="0" w:after="0"/>
-              <w:jc w:val="left"/>
-              <w:rPr>
-                <w:rFonts w:eastAsia="Calibri" w:cs="Calibri"/>
-                <w:kern w:val="0"/>
-                <w:sz w:val="22"/>
-                <w:szCs w:val="22"/>
-                <w:lang w:val="pt-BR" w:eastAsia="pt-BR" w:bidi="ar-SA"/>
-              </w:rPr>
-            </w:pPr>
-            <w:r>
-              <w:rPr>
-                <w:rFonts w:eastAsia="Calibri" w:cs="Calibri"/>
-                <w:kern w:val="0"/>
-                <w:sz w:val="22"/>
-                <w:szCs w:val="22"/>
-                <w:lang w:val="pt-BR" w:eastAsia="pt-BR" w:bidi="ar-SA"/>
-              </w:rPr>
-            </w:r>
-          </w:p>
-        </w:tc>
-        <w:tc>
-          <w:tcPr>
-            <w:tcW w:w="1416" w:type="dxa"/>
-            <w:tcBorders>
-              <w:top w:val="single" w:sz="4" w:space="0" w:color="000000"/>
-              <w:left w:val="single" w:sz="4" w:space="0" w:color="000000"/>
-              <w:bottom w:val="single" w:sz="12" w:space="0" w:color="000000"/>
-              <w:right w:val="single" w:sz="4" w:space="0" w:color="000000"/>
-            </w:tcBorders>
-            <w:tcMar>
-              <w:top w:w="57" w:type="dxa"/>
-              <w:bottom w:w="57" w:type="dxa"/>
-            </w:tcMar>
-          </w:tcPr>
-          <w:p>
-            <w:pPr>
-              <w:pStyle w:val="Normal"/>
-              <w:widowControl w:val="false"/>
-              <w:spacing w:before="0" w:after="0"/>
-              <w:jc w:val="left"/>
-              <w:rPr>
-                <w:rFonts w:eastAsia="Calibri" w:cs="Calibri"/>
-                <w:kern w:val="0"/>
-                <w:sz w:val="22"/>
-                <w:szCs w:val="22"/>
-                <w:lang w:val="pt-BR" w:eastAsia="pt-BR" w:bidi="ar-SA"/>
-              </w:rPr>
-            </w:pPr>
-            <w:r>
-              <w:rPr>
-                <w:rFonts w:eastAsia="Calibri" w:cs="Calibri"/>
-                <w:kern w:val="0"/>
-                <w:sz w:val="22"/>
-                <w:szCs w:val="22"/>
-                <w:lang w:val="pt-BR" w:eastAsia="pt-BR" w:bidi="ar-SA"/>
-              </w:rPr>
-            </w:r>
-          </w:p>
-        </w:tc>
-        <w:tc>
-          <w:tcPr>
-            <w:tcW w:w="4461" w:type="dxa"/>
-            <w:tcBorders>
-              <w:top w:val="single" w:sz="4" w:space="0" w:color="000000"/>
-              <w:left w:val="single" w:sz="4" w:space="0" w:color="000000"/>
-              <w:bottom w:val="single" w:sz="12" w:space="0" w:color="000000"/>
               <w:right w:val="single" w:sz="12" w:space="0" w:color="000000"/>
             </w:tcBorders>
             <w:tcMar>
@@ -4692,6 +3507,7 @@
                 <w:szCs w:val="22"/>
                 <w:lang w:val="pt-BR" w:eastAsia="pt-BR" w:bidi="ar-SA"/>
               </w:rPr>
+              <w:t>Visita do local de pesquisa</w:t>
             </w:r>
           </w:p>
         </w:tc>
@@ -4731,6 +3547,7 @@
                 <w:szCs w:val="22"/>
                 <w:lang w:val="pt-BR" w:eastAsia="pt-BR" w:bidi="ar-SA"/>
               </w:rPr>
+              <w:t>Willian e Gabriel</w:t>
             </w:r>
           </w:p>
         </w:tc>
@@ -4770,6 +3587,7 @@
                 <w:szCs w:val="22"/>
                 <w:lang w:val="pt-BR" w:eastAsia="pt-BR" w:bidi="ar-SA"/>
               </w:rPr>
+              <w:t xml:space="preserve">16/03/2026 </w:t>
             </w:r>
           </w:p>
         </w:tc>
@@ -4809,6 +3627,7 @@
                 <w:szCs w:val="22"/>
                 <w:lang w:val="pt-BR" w:eastAsia="pt-BR" w:bidi="ar-SA"/>
               </w:rPr>
+              <w:t>25/03/2026</w:t>
             </w:r>
           </w:p>
         </w:tc>
@@ -4892,6 +3711,18 @@
                 <w:szCs w:val="22"/>
                 <w:lang w:val="pt-BR" w:eastAsia="pt-BR" w:bidi="ar-SA"/>
               </w:rPr>
+              <w:t>Definiç</w:t>
+            </w:r>
+            <w:r>
+              <w:rPr>
+                <w:rFonts w:eastAsia="Calibri" w:cs="Calibri"/>
+                <w:color w:val="auto"/>
+                <w:kern w:val="0"/>
+                <w:sz w:val="22"/>
+                <w:szCs w:val="22"/>
+                <w:lang w:val="pt-BR" w:eastAsia="pt-BR" w:bidi="ar-SA"/>
+              </w:rPr>
+              <w:t>ão do tema</w:t>
             </w:r>
           </w:p>
         </w:tc>
@@ -4931,6 +3762,18 @@
                 <w:szCs w:val="22"/>
                 <w:lang w:val="pt-BR" w:eastAsia="pt-BR" w:bidi="ar-SA"/>
               </w:rPr>
+              <w:t>Jos</w:t>
+            </w:r>
+            <w:r>
+              <w:rPr>
+                <w:rFonts w:eastAsia="Calibri" w:cs="Calibri"/>
+                <w:color w:val="auto"/>
+                <w:kern w:val="0"/>
+                <w:sz w:val="22"/>
+                <w:szCs w:val="22"/>
+                <w:lang w:val="pt-BR" w:eastAsia="pt-BR" w:bidi="ar-SA"/>
+              </w:rPr>
+              <w:t>é Ricardo e Dayan</w:t>
             </w:r>
           </w:p>
         </w:tc>
@@ -4970,6 +3813,7 @@
                 <w:szCs w:val="22"/>
                 <w:lang w:val="pt-BR" w:eastAsia="pt-BR" w:bidi="ar-SA"/>
               </w:rPr>
+              <w:t xml:space="preserve">16/03/2026 </w:t>
             </w:r>
           </w:p>
         </w:tc>
@@ -5009,6 +3853,7 @@
                 <w:szCs w:val="22"/>
                 <w:lang w:val="pt-BR" w:eastAsia="pt-BR" w:bidi="ar-SA"/>
               </w:rPr>
+              <w:t>25/03/2026</w:t>
             </w:r>
           </w:p>
         </w:tc>
@@ -5092,6 +3937,7 @@
                 <w:szCs w:val="22"/>
                 <w:lang w:val="pt-BR" w:eastAsia="pt-BR" w:bidi="ar-SA"/>
               </w:rPr>
+              <w:t>Inicio do Desenvolvimento do Software</w:t>
             </w:r>
           </w:p>
         </w:tc>
@@ -5131,6 +3977,7 @@
                 <w:szCs w:val="22"/>
                 <w:lang w:val="pt-BR" w:eastAsia="pt-BR" w:bidi="ar-SA"/>
               </w:rPr>
+              <w:t>Willian e Daniel</w:t>
             </w:r>
           </w:p>
         </w:tc>
@@ -5170,6 +4017,7 @@
                 <w:szCs w:val="22"/>
                 <w:lang w:val="pt-BR" w:eastAsia="pt-BR" w:bidi="ar-SA"/>
               </w:rPr>
+              <w:t xml:space="preserve">16/03/2026 </w:t>
             </w:r>
           </w:p>
         </w:tc>
@@ -5209,6 +4057,7 @@
                 <w:szCs w:val="22"/>
                 <w:lang w:val="pt-BR" w:eastAsia="pt-BR" w:bidi="ar-SA"/>
               </w:rPr>
+              <w:t>25/03/2026</w:t>
             </w:r>
           </w:p>
         </w:tc>
@@ -5292,6 +4141,18 @@
                 <w:szCs w:val="22"/>
                 <w:lang w:val="pt-BR" w:eastAsia="pt-BR" w:bidi="ar-SA"/>
               </w:rPr>
+              <w:t>Elaboraç</w:t>
+            </w:r>
+            <w:r>
+              <w:rPr>
+                <w:rFonts w:eastAsia="Calibri" w:cs="Calibri"/>
+                <w:color w:val="auto"/>
+                <w:kern w:val="0"/>
+                <w:sz w:val="22"/>
+                <w:szCs w:val="22"/>
+                <w:lang w:val="pt-BR" w:eastAsia="pt-BR" w:bidi="ar-SA"/>
+              </w:rPr>
+              <w:t>ão do Relatório Parcial</w:t>
             </w:r>
           </w:p>
         </w:tc>
@@ -5331,6 +4192,18 @@
                 <w:szCs w:val="22"/>
                 <w:lang w:val="pt-BR" w:eastAsia="pt-BR" w:bidi="ar-SA"/>
               </w:rPr>
+              <w:t>Jos</w:t>
+            </w:r>
+            <w:r>
+              <w:rPr>
+                <w:rFonts w:eastAsia="Calibri" w:cs="Calibri"/>
+                <w:color w:val="auto"/>
+                <w:kern w:val="0"/>
+                <w:sz w:val="22"/>
+                <w:szCs w:val="22"/>
+                <w:lang w:val="pt-BR" w:eastAsia="pt-BR" w:bidi="ar-SA"/>
+              </w:rPr>
+              <w:t>é Willas, Walter e Flavio</w:t>
             </w:r>
           </w:p>
         </w:tc>
@@ -5370,6 +4243,7 @@
                 <w:szCs w:val="22"/>
                 <w:lang w:val="pt-BR" w:eastAsia="pt-BR" w:bidi="ar-SA"/>
               </w:rPr>
+              <w:t xml:space="preserve">16/03/2026 </w:t>
             </w:r>
           </w:p>
         </w:tc>
@@ -5409,6 +4283,7 @@
                 <w:szCs w:val="22"/>
                 <w:lang w:val="pt-BR" w:eastAsia="pt-BR" w:bidi="ar-SA"/>
               </w:rPr>
+              <w:t>25/03/2026</w:t>
             </w:r>
           </w:p>
         </w:tc>
@@ -5419,206 +4294,6 @@
               <w:top w:val="single" w:sz="4" w:space="0" w:color="000000"/>
               <w:left w:val="single" w:sz="4" w:space="0" w:color="000000"/>
               <w:bottom w:val="single" w:sz="4" w:space="0" w:color="000000"/>
-              <w:right w:val="single" w:sz="12" w:space="0" w:color="000000"/>
-            </w:tcBorders>
-            <w:tcMar>
-              <w:top w:w="57" w:type="dxa"/>
-              <w:bottom w:w="57" w:type="dxa"/>
-            </w:tcMar>
-          </w:tcPr>
-          <w:p>
-            <w:pPr>
-              <w:pStyle w:val="Normal"/>
-              <w:widowControl w:val="false"/>
-              <w:spacing w:before="0" w:after="0"/>
-              <w:jc w:val="left"/>
-              <w:rPr>
-                <w:rFonts w:eastAsia="Calibri" w:cs="Calibri"/>
-                <w:kern w:val="0"/>
-                <w:sz w:val="22"/>
-                <w:szCs w:val="22"/>
-                <w:lang w:val="pt-BR" w:eastAsia="pt-BR" w:bidi="ar-SA"/>
-              </w:rPr>
-            </w:pPr>
-            <w:r>
-              <w:rPr>
-                <w:rFonts w:eastAsia="Calibri" w:cs="Calibri"/>
-                <w:kern w:val="0"/>
-                <w:sz w:val="22"/>
-                <w:szCs w:val="22"/>
-                <w:lang w:val="pt-BR" w:eastAsia="pt-BR" w:bidi="ar-SA"/>
-              </w:rPr>
-            </w:r>
-          </w:p>
-        </w:tc>
-      </w:tr>
-      <w:tr>
-        <w:trPr>
-          <w:cantSplit w:val="true"/>
-        </w:trPr>
-        <w:tc>
-          <w:tcPr>
-            <w:tcW w:w="4382" w:type="dxa"/>
-            <w:tcBorders>
-              <w:top w:val="single" w:sz="4" w:space="0" w:color="000000"/>
-              <w:left w:val="single" w:sz="12" w:space="0" w:color="000000"/>
-              <w:bottom w:val="single" w:sz="12" w:space="0" w:color="000000"/>
-              <w:right w:val="single" w:sz="4" w:space="0" w:color="000000"/>
-            </w:tcBorders>
-            <w:tcMar>
-              <w:top w:w="57" w:type="dxa"/>
-              <w:bottom w:w="57" w:type="dxa"/>
-            </w:tcMar>
-          </w:tcPr>
-          <w:p>
-            <w:pPr>
-              <w:pStyle w:val="Normal"/>
-              <w:widowControl w:val="false"/>
-              <w:spacing w:before="0" w:after="0"/>
-              <w:jc w:val="left"/>
-              <w:rPr>
-                <w:rFonts w:eastAsia="Calibri" w:cs="Calibri"/>
-                <w:kern w:val="0"/>
-                <w:sz w:val="22"/>
-                <w:szCs w:val="22"/>
-                <w:lang w:val="pt-BR" w:eastAsia="pt-BR" w:bidi="ar-SA"/>
-              </w:rPr>
-            </w:pPr>
-            <w:r>
-              <w:rPr>
-                <w:rFonts w:eastAsia="Calibri" w:cs="Calibri"/>
-                <w:kern w:val="0"/>
-                <w:sz w:val="22"/>
-                <w:szCs w:val="22"/>
-                <w:lang w:val="pt-BR" w:eastAsia="pt-BR" w:bidi="ar-SA"/>
-              </w:rPr>
-            </w:r>
-          </w:p>
-        </w:tc>
-        <w:tc>
-          <w:tcPr>
-            <w:tcW w:w="2832" w:type="dxa"/>
-            <w:tcBorders>
-              <w:top w:val="single" w:sz="4" w:space="0" w:color="000000"/>
-              <w:left w:val="single" w:sz="4" w:space="0" w:color="000000"/>
-              <w:bottom w:val="single" w:sz="12" w:space="0" w:color="000000"/>
-              <w:right w:val="single" w:sz="4" w:space="0" w:color="000000"/>
-            </w:tcBorders>
-            <w:tcMar>
-              <w:top w:w="57" w:type="dxa"/>
-              <w:bottom w:w="57" w:type="dxa"/>
-            </w:tcMar>
-          </w:tcPr>
-          <w:p>
-            <w:pPr>
-              <w:pStyle w:val="Normal"/>
-              <w:widowControl w:val="false"/>
-              <w:spacing w:before="0" w:after="0"/>
-              <w:jc w:val="left"/>
-              <w:rPr>
-                <w:rFonts w:eastAsia="Calibri" w:cs="Calibri"/>
-                <w:kern w:val="0"/>
-                <w:sz w:val="22"/>
-                <w:szCs w:val="22"/>
-                <w:lang w:val="pt-BR" w:eastAsia="pt-BR" w:bidi="ar-SA"/>
-              </w:rPr>
-            </w:pPr>
-            <w:r>
-              <w:rPr>
-                <w:rFonts w:eastAsia="Calibri" w:cs="Calibri"/>
-                <w:kern w:val="0"/>
-                <w:sz w:val="22"/>
-                <w:szCs w:val="22"/>
-                <w:lang w:val="pt-BR" w:eastAsia="pt-BR" w:bidi="ar-SA"/>
-              </w:rPr>
-            </w:r>
-          </w:p>
-        </w:tc>
-        <w:tc>
-          <w:tcPr>
-            <w:tcW w:w="1557" w:type="dxa"/>
-            <w:tcBorders>
-              <w:top w:val="single" w:sz="4" w:space="0" w:color="000000"/>
-              <w:left w:val="single" w:sz="4" w:space="0" w:color="000000"/>
-              <w:bottom w:val="single" w:sz="12" w:space="0" w:color="000000"/>
-              <w:right w:val="single" w:sz="4" w:space="0" w:color="000000"/>
-            </w:tcBorders>
-            <w:tcMar>
-              <w:top w:w="57" w:type="dxa"/>
-              <w:bottom w:w="57" w:type="dxa"/>
-            </w:tcMar>
-          </w:tcPr>
-          <w:p>
-            <w:pPr>
-              <w:pStyle w:val="Normal"/>
-              <w:widowControl w:val="false"/>
-              <w:spacing w:before="0" w:after="0"/>
-              <w:jc w:val="left"/>
-              <w:rPr>
-                <w:rFonts w:eastAsia="Calibri" w:cs="Calibri"/>
-                <w:kern w:val="0"/>
-                <w:sz w:val="22"/>
-                <w:szCs w:val="22"/>
-                <w:lang w:val="pt-BR" w:eastAsia="pt-BR" w:bidi="ar-SA"/>
-              </w:rPr>
-            </w:pPr>
-            <w:r>
-              <w:rPr>
-                <w:rFonts w:eastAsia="Calibri" w:cs="Calibri"/>
-                <w:kern w:val="0"/>
-                <w:sz w:val="22"/>
-                <w:szCs w:val="22"/>
-                <w:lang w:val="pt-BR" w:eastAsia="pt-BR" w:bidi="ar-SA"/>
-              </w:rPr>
-            </w:r>
-          </w:p>
-        </w:tc>
-        <w:tc>
-          <w:tcPr>
-            <w:tcW w:w="1416" w:type="dxa"/>
-            <w:tcBorders>
-              <w:top w:val="single" w:sz="4" w:space="0" w:color="000000"/>
-              <w:left w:val="single" w:sz="4" w:space="0" w:color="000000"/>
-              <w:bottom w:val="single" w:sz="12" w:space="0" w:color="000000"/>
-              <w:right w:val="single" w:sz="4" w:space="0" w:color="000000"/>
-            </w:tcBorders>
-            <w:tcMar>
-              <w:top w:w="57" w:type="dxa"/>
-              <w:bottom w:w="57" w:type="dxa"/>
-            </w:tcMar>
-          </w:tcPr>
-          <w:p>
-            <w:pPr>
-              <w:pStyle w:val="Normal"/>
-              <w:widowControl w:val="false"/>
-              <w:spacing w:before="0" w:after="0"/>
-              <w:jc w:val="left"/>
-              <w:rPr>
-                <w:rFonts w:eastAsia="Calibri" w:cs="Calibri"/>
-                <w:kern w:val="0"/>
-                <w:sz w:val="22"/>
-                <w:szCs w:val="22"/>
-                <w:lang w:val="pt-BR" w:eastAsia="pt-BR" w:bidi="ar-SA"/>
-              </w:rPr>
-            </w:pPr>
-            <w:r>
-              <w:rPr>
-                <w:rFonts w:eastAsia="Calibri" w:cs="Calibri"/>
-                <w:kern w:val="0"/>
-                <w:sz w:val="22"/>
-                <w:szCs w:val="22"/>
-                <w:lang w:val="pt-BR" w:eastAsia="pt-BR" w:bidi="ar-SA"/>
-              </w:rPr>
-            </w:r>
-          </w:p>
-        </w:tc>
-        <w:tc>
-          <w:tcPr>
-            <w:tcW w:w="4461" w:type="dxa"/>
-            <w:tcBorders>
-              <w:top w:val="single" w:sz="4" w:space="0" w:color="000000"/>
-              <w:left w:val="single" w:sz="4" w:space="0" w:color="000000"/>
-              <w:bottom w:val="single" w:sz="12" w:space="0" w:color="000000"/>
               <w:right w:val="single" w:sz="12" w:space="0" w:color="000000"/>
             </w:tcBorders>
             <w:tcMar>
@@ -6039,6 +4714,18 @@
                 <w:szCs w:val="22"/>
                 <w:lang w:val="pt-BR" w:eastAsia="pt-BR" w:bidi="ar-SA"/>
               </w:rPr>
+              <w:t>Construç</w:t>
+            </w:r>
+            <w:r>
+              <w:rPr>
+                <w:rFonts w:eastAsia="Calibri" w:cs="Calibri"/>
+                <w:color w:val="auto"/>
+                <w:kern w:val="0"/>
+                <w:sz w:val="22"/>
+                <w:szCs w:val="22"/>
+                <w:lang w:val="pt-BR" w:eastAsia="pt-BR" w:bidi="ar-SA"/>
+              </w:rPr>
+              <w:t>ão da solução inicial e coleta de sugestões da comunidade externa</w:t>
             </w:r>
           </w:p>
         </w:tc>
@@ -6078,6 +4765,7 @@
                 <w:szCs w:val="22"/>
                 <w:lang w:val="pt-BR" w:eastAsia="pt-BR" w:bidi="ar-SA"/>
               </w:rPr>
+              <w:t>Willian, Daniel, Gabriel e Dayan</w:t>
             </w:r>
           </w:p>
         </w:tc>
@@ -6117,6 +4805,7 @@
                 <w:szCs w:val="22"/>
                 <w:lang w:val="pt-BR" w:eastAsia="pt-BR" w:bidi="ar-SA"/>
               </w:rPr>
+              <w:t>30/03/2026</w:t>
             </w:r>
           </w:p>
         </w:tc>
@@ -6156,6 +4845,7 @@
                 <w:szCs w:val="22"/>
                 <w:lang w:val="pt-BR" w:eastAsia="pt-BR" w:bidi="ar-SA"/>
               </w:rPr>
+              <w:t xml:space="preserve">07/04/2026 </w:t>
             </w:r>
           </w:p>
         </w:tc>
@@ -6239,6 +4929,18 @@
                 <w:szCs w:val="22"/>
                 <w:lang w:val="pt-BR" w:eastAsia="pt-BR" w:bidi="ar-SA"/>
               </w:rPr>
+              <w:t>Finalizaç</w:t>
+            </w:r>
+            <w:r>
+              <w:rPr>
+                <w:rFonts w:eastAsia="Calibri" w:cs="Calibri"/>
+                <w:color w:val="auto"/>
+                <w:kern w:val="0"/>
+                <w:sz w:val="22"/>
+                <w:szCs w:val="22"/>
+                <w:lang w:val="pt-BR" w:eastAsia="pt-BR" w:bidi="ar-SA"/>
+              </w:rPr>
+              <w:t>ão e entrega do Relatório Parcial</w:t>
             </w:r>
           </w:p>
         </w:tc>
@@ -6278,6 +4980,18 @@
                 <w:szCs w:val="22"/>
                 <w:lang w:val="pt-BR" w:eastAsia="pt-BR" w:bidi="ar-SA"/>
               </w:rPr>
+              <w:t>Jos</w:t>
+            </w:r>
+            <w:r>
+              <w:rPr>
+                <w:rFonts w:eastAsia="Calibri" w:cs="Calibri"/>
+                <w:color w:val="auto"/>
+                <w:kern w:val="0"/>
+                <w:sz w:val="22"/>
+                <w:szCs w:val="22"/>
+                <w:lang w:val="pt-BR" w:eastAsia="pt-BR" w:bidi="ar-SA"/>
+              </w:rPr>
+              <w:t xml:space="preserve">é Ricardo, José Willas, Walter e Flávio </w:t>
             </w:r>
           </w:p>
         </w:tc>
@@ -6317,6 +5031,7 @@
                 <w:szCs w:val="22"/>
                 <w:lang w:val="pt-BR" w:eastAsia="pt-BR" w:bidi="ar-SA"/>
               </w:rPr>
+              <w:t>30/03/2026</w:t>
             </w:r>
           </w:p>
         </w:tc>
@@ -6356,6 +5071,7 @@
                 <w:szCs w:val="22"/>
                 <w:lang w:val="pt-BR" w:eastAsia="pt-BR" w:bidi="ar-SA"/>
               </w:rPr>
+              <w:t xml:space="preserve">07/04/2026 </w:t>
             </w:r>
           </w:p>
         </w:tc>
@@ -6366,606 +5082,6 @@
               <w:top w:val="single" w:sz="4" w:space="0" w:color="000000"/>
               <w:left w:val="single" w:sz="4" w:space="0" w:color="000000"/>
               <w:bottom w:val="single" w:sz="4" w:space="0" w:color="000000"/>
-              <w:right w:val="single" w:sz="12" w:space="0" w:color="000000"/>
-            </w:tcBorders>
-            <w:tcMar>
-              <w:top w:w="57" w:type="dxa"/>
-              <w:bottom w:w="57" w:type="dxa"/>
-            </w:tcMar>
-          </w:tcPr>
-          <w:p>
-            <w:pPr>
-              <w:pStyle w:val="Normal"/>
-              <w:widowControl w:val="false"/>
-              <w:spacing w:before="0" w:after="0"/>
-              <w:jc w:val="left"/>
-              <w:rPr>
-                <w:rFonts w:eastAsia="Calibri" w:cs="Calibri"/>
-                <w:kern w:val="0"/>
-                <w:sz w:val="22"/>
-                <w:szCs w:val="22"/>
-                <w:lang w:val="pt-BR" w:eastAsia="pt-BR" w:bidi="ar-SA"/>
-              </w:rPr>
-            </w:pPr>
-            <w:r>
-              <w:rPr>
-                <w:rFonts w:eastAsia="Calibri" w:cs="Calibri"/>
-                <w:kern w:val="0"/>
-                <w:sz w:val="22"/>
-                <w:szCs w:val="22"/>
-                <w:lang w:val="pt-BR" w:eastAsia="pt-BR" w:bidi="ar-SA"/>
-              </w:rPr>
-            </w:r>
-          </w:p>
-        </w:tc>
-      </w:tr>
-      <w:tr>
-        <w:trPr>
-          <w:cantSplit w:val="true"/>
-        </w:trPr>
-        <w:tc>
-          <w:tcPr>
-            <w:tcW w:w="4382" w:type="dxa"/>
-            <w:tcBorders>
-              <w:top w:val="single" w:sz="4" w:space="0" w:color="000000"/>
-              <w:left w:val="single" w:sz="12" w:space="0" w:color="000000"/>
-              <w:bottom w:val="single" w:sz="4" w:space="0" w:color="000000"/>
-              <w:right w:val="single" w:sz="4" w:space="0" w:color="000000"/>
-            </w:tcBorders>
-            <w:tcMar>
-              <w:top w:w="57" w:type="dxa"/>
-              <w:bottom w:w="57" w:type="dxa"/>
-            </w:tcMar>
-          </w:tcPr>
-          <w:p>
-            <w:pPr>
-              <w:pStyle w:val="Normal"/>
-              <w:widowControl w:val="false"/>
-              <w:spacing w:before="0" w:after="0"/>
-              <w:jc w:val="left"/>
-              <w:rPr>
-                <w:rFonts w:eastAsia="Calibri" w:cs="Calibri"/>
-                <w:kern w:val="0"/>
-                <w:sz w:val="22"/>
-                <w:szCs w:val="22"/>
-                <w:lang w:val="pt-BR" w:eastAsia="pt-BR" w:bidi="ar-SA"/>
-              </w:rPr>
-            </w:pPr>
-            <w:r>
-              <w:rPr>
-                <w:rFonts w:eastAsia="Calibri" w:cs="Calibri"/>
-                <w:kern w:val="0"/>
-                <w:sz w:val="22"/>
-                <w:szCs w:val="22"/>
-                <w:lang w:val="pt-BR" w:eastAsia="pt-BR" w:bidi="ar-SA"/>
-              </w:rPr>
-            </w:r>
-          </w:p>
-        </w:tc>
-        <w:tc>
-          <w:tcPr>
-            <w:tcW w:w="2832" w:type="dxa"/>
-            <w:tcBorders>
-              <w:top w:val="single" w:sz="4" w:space="0" w:color="000000"/>
-              <w:left w:val="single" w:sz="4" w:space="0" w:color="000000"/>
-              <w:bottom w:val="single" w:sz="4" w:space="0" w:color="000000"/>
-              <w:right w:val="single" w:sz="4" w:space="0" w:color="000000"/>
-            </w:tcBorders>
-            <w:tcMar>
-              <w:top w:w="57" w:type="dxa"/>
-              <w:bottom w:w="57" w:type="dxa"/>
-            </w:tcMar>
-          </w:tcPr>
-          <w:p>
-            <w:pPr>
-              <w:pStyle w:val="Normal"/>
-              <w:widowControl w:val="false"/>
-              <w:spacing w:before="0" w:after="0"/>
-              <w:jc w:val="left"/>
-              <w:rPr>
-                <w:rFonts w:eastAsia="Calibri" w:cs="Calibri"/>
-                <w:kern w:val="0"/>
-                <w:sz w:val="22"/>
-                <w:szCs w:val="22"/>
-                <w:lang w:val="pt-BR" w:eastAsia="pt-BR" w:bidi="ar-SA"/>
-              </w:rPr>
-            </w:pPr>
-            <w:r>
-              <w:rPr>
-                <w:rFonts w:eastAsia="Calibri" w:cs="Calibri"/>
-                <w:kern w:val="0"/>
-                <w:sz w:val="22"/>
-                <w:szCs w:val="22"/>
-                <w:lang w:val="pt-BR" w:eastAsia="pt-BR" w:bidi="ar-SA"/>
-              </w:rPr>
-            </w:r>
-          </w:p>
-        </w:tc>
-        <w:tc>
-          <w:tcPr>
-            <w:tcW w:w="1557" w:type="dxa"/>
-            <w:tcBorders>
-              <w:top w:val="single" w:sz="4" w:space="0" w:color="000000"/>
-              <w:left w:val="single" w:sz="4" w:space="0" w:color="000000"/>
-              <w:bottom w:val="single" w:sz="4" w:space="0" w:color="000000"/>
-              <w:right w:val="single" w:sz="4" w:space="0" w:color="000000"/>
-            </w:tcBorders>
-            <w:tcMar>
-              <w:top w:w="57" w:type="dxa"/>
-              <w:bottom w:w="57" w:type="dxa"/>
-            </w:tcMar>
-          </w:tcPr>
-          <w:p>
-            <w:pPr>
-              <w:pStyle w:val="Normal"/>
-              <w:widowControl w:val="false"/>
-              <w:spacing w:before="0" w:after="0"/>
-              <w:jc w:val="left"/>
-              <w:rPr>
-                <w:rFonts w:eastAsia="Calibri" w:cs="Calibri"/>
-                <w:kern w:val="0"/>
-                <w:sz w:val="22"/>
-                <w:szCs w:val="22"/>
-                <w:lang w:val="pt-BR" w:eastAsia="pt-BR" w:bidi="ar-SA"/>
-              </w:rPr>
-            </w:pPr>
-            <w:r>
-              <w:rPr>
-                <w:rFonts w:eastAsia="Calibri" w:cs="Calibri"/>
-                <w:kern w:val="0"/>
-                <w:sz w:val="22"/>
-                <w:szCs w:val="22"/>
-                <w:lang w:val="pt-BR" w:eastAsia="pt-BR" w:bidi="ar-SA"/>
-              </w:rPr>
-            </w:r>
-          </w:p>
-        </w:tc>
-        <w:tc>
-          <w:tcPr>
-            <w:tcW w:w="1416" w:type="dxa"/>
-            <w:tcBorders>
-              <w:top w:val="single" w:sz="4" w:space="0" w:color="000000"/>
-              <w:left w:val="single" w:sz="4" w:space="0" w:color="000000"/>
-              <w:bottom w:val="single" w:sz="4" w:space="0" w:color="000000"/>
-              <w:right w:val="single" w:sz="4" w:space="0" w:color="000000"/>
-            </w:tcBorders>
-            <w:tcMar>
-              <w:top w:w="57" w:type="dxa"/>
-              <w:bottom w:w="57" w:type="dxa"/>
-            </w:tcMar>
-          </w:tcPr>
-          <w:p>
-            <w:pPr>
-              <w:pStyle w:val="Normal"/>
-              <w:widowControl w:val="false"/>
-              <w:spacing w:before="0" w:after="0"/>
-              <w:jc w:val="left"/>
-              <w:rPr>
-                <w:rFonts w:eastAsia="Calibri" w:cs="Calibri"/>
-                <w:kern w:val="0"/>
-                <w:sz w:val="22"/>
-                <w:szCs w:val="22"/>
-                <w:lang w:val="pt-BR" w:eastAsia="pt-BR" w:bidi="ar-SA"/>
-              </w:rPr>
-            </w:pPr>
-            <w:r>
-              <w:rPr>
-                <w:rFonts w:eastAsia="Calibri" w:cs="Calibri"/>
-                <w:kern w:val="0"/>
-                <w:sz w:val="22"/>
-                <w:szCs w:val="22"/>
-                <w:lang w:val="pt-BR" w:eastAsia="pt-BR" w:bidi="ar-SA"/>
-              </w:rPr>
-            </w:r>
-          </w:p>
-        </w:tc>
-        <w:tc>
-          <w:tcPr>
-            <w:tcW w:w="4461" w:type="dxa"/>
-            <w:tcBorders>
-              <w:top w:val="single" w:sz="4" w:space="0" w:color="000000"/>
-              <w:left w:val="single" w:sz="4" w:space="0" w:color="000000"/>
-              <w:bottom w:val="single" w:sz="4" w:space="0" w:color="000000"/>
-              <w:right w:val="single" w:sz="12" w:space="0" w:color="000000"/>
-            </w:tcBorders>
-            <w:tcMar>
-              <w:top w:w="57" w:type="dxa"/>
-              <w:bottom w:w="57" w:type="dxa"/>
-            </w:tcMar>
-          </w:tcPr>
-          <w:p>
-            <w:pPr>
-              <w:pStyle w:val="Normal"/>
-              <w:widowControl w:val="false"/>
-              <w:spacing w:before="0" w:after="0"/>
-              <w:jc w:val="left"/>
-              <w:rPr>
-                <w:rFonts w:eastAsia="Calibri" w:cs="Calibri"/>
-                <w:kern w:val="0"/>
-                <w:sz w:val="22"/>
-                <w:szCs w:val="22"/>
-                <w:lang w:val="pt-BR" w:eastAsia="pt-BR" w:bidi="ar-SA"/>
-              </w:rPr>
-            </w:pPr>
-            <w:r>
-              <w:rPr>
-                <w:rFonts w:eastAsia="Calibri" w:cs="Calibri"/>
-                <w:kern w:val="0"/>
-                <w:sz w:val="22"/>
-                <w:szCs w:val="22"/>
-                <w:lang w:val="pt-BR" w:eastAsia="pt-BR" w:bidi="ar-SA"/>
-              </w:rPr>
-            </w:r>
-          </w:p>
-        </w:tc>
-      </w:tr>
-      <w:tr>
-        <w:trPr>
-          <w:cantSplit w:val="true"/>
-        </w:trPr>
-        <w:tc>
-          <w:tcPr>
-            <w:tcW w:w="4382" w:type="dxa"/>
-            <w:tcBorders>
-              <w:top w:val="single" w:sz="4" w:space="0" w:color="000000"/>
-              <w:left w:val="single" w:sz="12" w:space="0" w:color="000000"/>
-              <w:bottom w:val="single" w:sz="4" w:space="0" w:color="000000"/>
-              <w:right w:val="single" w:sz="4" w:space="0" w:color="000000"/>
-            </w:tcBorders>
-            <w:tcMar>
-              <w:top w:w="57" w:type="dxa"/>
-              <w:bottom w:w="57" w:type="dxa"/>
-            </w:tcMar>
-          </w:tcPr>
-          <w:p>
-            <w:pPr>
-              <w:pStyle w:val="Normal"/>
-              <w:widowControl w:val="false"/>
-              <w:spacing w:before="0" w:after="0"/>
-              <w:jc w:val="left"/>
-              <w:rPr>
-                <w:rFonts w:eastAsia="Calibri" w:cs="Calibri"/>
-                <w:kern w:val="0"/>
-                <w:sz w:val="22"/>
-                <w:szCs w:val="22"/>
-                <w:lang w:val="pt-BR" w:eastAsia="pt-BR" w:bidi="ar-SA"/>
-              </w:rPr>
-            </w:pPr>
-            <w:r>
-              <w:rPr>
-                <w:rFonts w:eastAsia="Calibri" w:cs="Calibri"/>
-                <w:kern w:val="0"/>
-                <w:sz w:val="22"/>
-                <w:szCs w:val="22"/>
-                <w:lang w:val="pt-BR" w:eastAsia="pt-BR" w:bidi="ar-SA"/>
-              </w:rPr>
-            </w:r>
-          </w:p>
-        </w:tc>
-        <w:tc>
-          <w:tcPr>
-            <w:tcW w:w="2832" w:type="dxa"/>
-            <w:tcBorders>
-              <w:top w:val="single" w:sz="4" w:space="0" w:color="000000"/>
-              <w:left w:val="single" w:sz="4" w:space="0" w:color="000000"/>
-              <w:bottom w:val="single" w:sz="4" w:space="0" w:color="000000"/>
-              <w:right w:val="single" w:sz="4" w:space="0" w:color="000000"/>
-            </w:tcBorders>
-            <w:tcMar>
-              <w:top w:w="57" w:type="dxa"/>
-              <w:bottom w:w="57" w:type="dxa"/>
-            </w:tcMar>
-          </w:tcPr>
-          <w:p>
-            <w:pPr>
-              <w:pStyle w:val="Normal"/>
-              <w:widowControl w:val="false"/>
-              <w:spacing w:before="0" w:after="0"/>
-              <w:jc w:val="left"/>
-              <w:rPr>
-                <w:rFonts w:eastAsia="Calibri" w:cs="Calibri"/>
-                <w:kern w:val="0"/>
-                <w:sz w:val="22"/>
-                <w:szCs w:val="22"/>
-                <w:lang w:val="pt-BR" w:eastAsia="pt-BR" w:bidi="ar-SA"/>
-              </w:rPr>
-            </w:pPr>
-            <w:r>
-              <w:rPr>
-                <w:rFonts w:eastAsia="Calibri" w:cs="Calibri"/>
-                <w:kern w:val="0"/>
-                <w:sz w:val="22"/>
-                <w:szCs w:val="22"/>
-                <w:lang w:val="pt-BR" w:eastAsia="pt-BR" w:bidi="ar-SA"/>
-              </w:rPr>
-            </w:r>
-          </w:p>
-        </w:tc>
-        <w:tc>
-          <w:tcPr>
-            <w:tcW w:w="1557" w:type="dxa"/>
-            <w:tcBorders>
-              <w:top w:val="single" w:sz="4" w:space="0" w:color="000000"/>
-              <w:left w:val="single" w:sz="4" w:space="0" w:color="000000"/>
-              <w:bottom w:val="single" w:sz="4" w:space="0" w:color="000000"/>
-              <w:right w:val="single" w:sz="4" w:space="0" w:color="000000"/>
-            </w:tcBorders>
-            <w:tcMar>
-              <w:top w:w="57" w:type="dxa"/>
-              <w:bottom w:w="57" w:type="dxa"/>
-            </w:tcMar>
-          </w:tcPr>
-          <w:p>
-            <w:pPr>
-              <w:pStyle w:val="Normal"/>
-              <w:widowControl w:val="false"/>
-              <w:spacing w:before="0" w:after="0"/>
-              <w:jc w:val="left"/>
-              <w:rPr>
-                <w:rFonts w:eastAsia="Calibri" w:cs="Calibri"/>
-                <w:kern w:val="0"/>
-                <w:sz w:val="22"/>
-                <w:szCs w:val="22"/>
-                <w:lang w:val="pt-BR" w:eastAsia="pt-BR" w:bidi="ar-SA"/>
-              </w:rPr>
-            </w:pPr>
-            <w:r>
-              <w:rPr>
-                <w:rFonts w:eastAsia="Calibri" w:cs="Calibri"/>
-                <w:kern w:val="0"/>
-                <w:sz w:val="22"/>
-                <w:szCs w:val="22"/>
-                <w:lang w:val="pt-BR" w:eastAsia="pt-BR" w:bidi="ar-SA"/>
-              </w:rPr>
-            </w:r>
-          </w:p>
-        </w:tc>
-        <w:tc>
-          <w:tcPr>
-            <w:tcW w:w="1416" w:type="dxa"/>
-            <w:tcBorders>
-              <w:top w:val="single" w:sz="4" w:space="0" w:color="000000"/>
-              <w:left w:val="single" w:sz="4" w:space="0" w:color="000000"/>
-              <w:bottom w:val="single" w:sz="4" w:space="0" w:color="000000"/>
-              <w:right w:val="single" w:sz="4" w:space="0" w:color="000000"/>
-            </w:tcBorders>
-            <w:tcMar>
-              <w:top w:w="57" w:type="dxa"/>
-              <w:bottom w:w="57" w:type="dxa"/>
-            </w:tcMar>
-          </w:tcPr>
-          <w:p>
-            <w:pPr>
-              <w:pStyle w:val="Normal"/>
-              <w:widowControl w:val="false"/>
-              <w:spacing w:before="0" w:after="0"/>
-              <w:jc w:val="left"/>
-              <w:rPr>
-                <w:rFonts w:eastAsia="Calibri" w:cs="Calibri"/>
-                <w:kern w:val="0"/>
-                <w:sz w:val="22"/>
-                <w:szCs w:val="22"/>
-                <w:lang w:val="pt-BR" w:eastAsia="pt-BR" w:bidi="ar-SA"/>
-              </w:rPr>
-            </w:pPr>
-            <w:r>
-              <w:rPr>
-                <w:rFonts w:eastAsia="Calibri" w:cs="Calibri"/>
-                <w:kern w:val="0"/>
-                <w:sz w:val="22"/>
-                <w:szCs w:val="22"/>
-                <w:lang w:val="pt-BR" w:eastAsia="pt-BR" w:bidi="ar-SA"/>
-              </w:rPr>
-            </w:r>
-          </w:p>
-        </w:tc>
-        <w:tc>
-          <w:tcPr>
-            <w:tcW w:w="4461" w:type="dxa"/>
-            <w:tcBorders>
-              <w:top w:val="single" w:sz="4" w:space="0" w:color="000000"/>
-              <w:left w:val="single" w:sz="4" w:space="0" w:color="000000"/>
-              <w:bottom w:val="single" w:sz="4" w:space="0" w:color="000000"/>
-              <w:right w:val="single" w:sz="12" w:space="0" w:color="000000"/>
-            </w:tcBorders>
-            <w:tcMar>
-              <w:top w:w="57" w:type="dxa"/>
-              <w:bottom w:w="57" w:type="dxa"/>
-            </w:tcMar>
-          </w:tcPr>
-          <w:p>
-            <w:pPr>
-              <w:pStyle w:val="Normal"/>
-              <w:widowControl w:val="false"/>
-              <w:spacing w:before="0" w:after="0"/>
-              <w:jc w:val="left"/>
-              <w:rPr>
-                <w:rFonts w:eastAsia="Calibri" w:cs="Calibri"/>
-                <w:kern w:val="0"/>
-                <w:sz w:val="22"/>
-                <w:szCs w:val="22"/>
-                <w:lang w:val="pt-BR" w:eastAsia="pt-BR" w:bidi="ar-SA"/>
-              </w:rPr>
-            </w:pPr>
-            <w:r>
-              <w:rPr>
-                <w:rFonts w:eastAsia="Calibri" w:cs="Calibri"/>
-                <w:kern w:val="0"/>
-                <w:sz w:val="22"/>
-                <w:szCs w:val="22"/>
-                <w:lang w:val="pt-BR" w:eastAsia="pt-BR" w:bidi="ar-SA"/>
-              </w:rPr>
-            </w:r>
-          </w:p>
-        </w:tc>
-      </w:tr>
-      <w:tr>
-        <w:trPr>
-          <w:cantSplit w:val="true"/>
-        </w:trPr>
-        <w:tc>
-          <w:tcPr>
-            <w:tcW w:w="4382" w:type="dxa"/>
-            <w:tcBorders>
-              <w:top w:val="single" w:sz="4" w:space="0" w:color="000000"/>
-              <w:left w:val="single" w:sz="12" w:space="0" w:color="000000"/>
-              <w:bottom w:val="single" w:sz="12" w:space="0" w:color="000000"/>
-              <w:right w:val="single" w:sz="4" w:space="0" w:color="000000"/>
-            </w:tcBorders>
-            <w:tcMar>
-              <w:top w:w="57" w:type="dxa"/>
-              <w:bottom w:w="57" w:type="dxa"/>
-            </w:tcMar>
-          </w:tcPr>
-          <w:p>
-            <w:pPr>
-              <w:pStyle w:val="Normal"/>
-              <w:widowControl w:val="false"/>
-              <w:spacing w:before="0" w:after="0"/>
-              <w:jc w:val="left"/>
-              <w:rPr>
-                <w:rFonts w:eastAsia="Calibri" w:cs="Calibri"/>
-                <w:kern w:val="0"/>
-                <w:sz w:val="22"/>
-                <w:szCs w:val="22"/>
-                <w:lang w:val="pt-BR" w:eastAsia="pt-BR" w:bidi="ar-SA"/>
-              </w:rPr>
-            </w:pPr>
-            <w:r>
-              <w:rPr>
-                <w:rFonts w:eastAsia="Calibri" w:cs="Calibri"/>
-                <w:kern w:val="0"/>
-                <w:sz w:val="22"/>
-                <w:szCs w:val="22"/>
-                <w:lang w:val="pt-BR" w:eastAsia="pt-BR" w:bidi="ar-SA"/>
-              </w:rPr>
-            </w:r>
-          </w:p>
-        </w:tc>
-        <w:tc>
-          <w:tcPr>
-            <w:tcW w:w="2832" w:type="dxa"/>
-            <w:tcBorders>
-              <w:top w:val="single" w:sz="4" w:space="0" w:color="000000"/>
-              <w:left w:val="single" w:sz="4" w:space="0" w:color="000000"/>
-              <w:bottom w:val="single" w:sz="12" w:space="0" w:color="000000"/>
-              <w:right w:val="single" w:sz="4" w:space="0" w:color="000000"/>
-            </w:tcBorders>
-            <w:tcMar>
-              <w:top w:w="57" w:type="dxa"/>
-              <w:bottom w:w="57" w:type="dxa"/>
-            </w:tcMar>
-          </w:tcPr>
-          <w:p>
-            <w:pPr>
-              <w:pStyle w:val="Normal"/>
-              <w:widowControl w:val="false"/>
-              <w:spacing w:before="0" w:after="0"/>
-              <w:jc w:val="left"/>
-              <w:rPr>
-                <w:rFonts w:eastAsia="Calibri" w:cs="Calibri"/>
-                <w:kern w:val="0"/>
-                <w:sz w:val="22"/>
-                <w:szCs w:val="22"/>
-                <w:lang w:val="pt-BR" w:eastAsia="pt-BR" w:bidi="ar-SA"/>
-              </w:rPr>
-            </w:pPr>
-            <w:r>
-              <w:rPr>
-                <w:rFonts w:eastAsia="Calibri" w:cs="Calibri"/>
-                <w:kern w:val="0"/>
-                <w:sz w:val="22"/>
-                <w:szCs w:val="22"/>
-                <w:lang w:val="pt-BR" w:eastAsia="pt-BR" w:bidi="ar-SA"/>
-              </w:rPr>
-            </w:r>
-          </w:p>
-        </w:tc>
-        <w:tc>
-          <w:tcPr>
-            <w:tcW w:w="1557" w:type="dxa"/>
-            <w:tcBorders>
-              <w:top w:val="single" w:sz="4" w:space="0" w:color="000000"/>
-              <w:left w:val="single" w:sz="4" w:space="0" w:color="000000"/>
-              <w:bottom w:val="single" w:sz="12" w:space="0" w:color="000000"/>
-              <w:right w:val="single" w:sz="4" w:space="0" w:color="000000"/>
-            </w:tcBorders>
-            <w:tcMar>
-              <w:top w:w="57" w:type="dxa"/>
-              <w:bottom w:w="57" w:type="dxa"/>
-            </w:tcMar>
-          </w:tcPr>
-          <w:p>
-            <w:pPr>
-              <w:pStyle w:val="Normal"/>
-              <w:widowControl w:val="false"/>
-              <w:spacing w:before="0" w:after="0"/>
-              <w:jc w:val="left"/>
-              <w:rPr>
-                <w:rFonts w:eastAsia="Calibri" w:cs="Calibri"/>
-                <w:kern w:val="0"/>
-                <w:sz w:val="22"/>
-                <w:szCs w:val="22"/>
-                <w:lang w:val="pt-BR" w:eastAsia="pt-BR" w:bidi="ar-SA"/>
-              </w:rPr>
-            </w:pPr>
-            <w:r>
-              <w:rPr>
-                <w:rFonts w:eastAsia="Calibri" w:cs="Calibri"/>
-                <w:kern w:val="0"/>
-                <w:sz w:val="22"/>
-                <w:szCs w:val="22"/>
-                <w:lang w:val="pt-BR" w:eastAsia="pt-BR" w:bidi="ar-SA"/>
-              </w:rPr>
-            </w:r>
-          </w:p>
-        </w:tc>
-        <w:tc>
-          <w:tcPr>
-            <w:tcW w:w="1416" w:type="dxa"/>
-            <w:tcBorders>
-              <w:top w:val="single" w:sz="4" w:space="0" w:color="000000"/>
-              <w:left w:val="single" w:sz="4" w:space="0" w:color="000000"/>
-              <w:bottom w:val="single" w:sz="12" w:space="0" w:color="000000"/>
-              <w:right w:val="single" w:sz="4" w:space="0" w:color="000000"/>
-            </w:tcBorders>
-            <w:tcMar>
-              <w:top w:w="57" w:type="dxa"/>
-              <w:bottom w:w="57" w:type="dxa"/>
-            </w:tcMar>
-          </w:tcPr>
-          <w:p>
-            <w:pPr>
-              <w:pStyle w:val="Normal"/>
-              <w:widowControl w:val="false"/>
-              <w:spacing w:before="0" w:after="0"/>
-              <w:jc w:val="left"/>
-              <w:rPr>
-                <w:rFonts w:eastAsia="Calibri" w:cs="Calibri"/>
-                <w:kern w:val="0"/>
-                <w:sz w:val="22"/>
-                <w:szCs w:val="22"/>
-                <w:lang w:val="pt-BR" w:eastAsia="pt-BR" w:bidi="ar-SA"/>
-              </w:rPr>
-            </w:pPr>
-            <w:r>
-              <w:rPr>
-                <w:rFonts w:eastAsia="Calibri" w:cs="Calibri"/>
-                <w:kern w:val="0"/>
-                <w:sz w:val="22"/>
-                <w:szCs w:val="22"/>
-                <w:lang w:val="pt-BR" w:eastAsia="pt-BR" w:bidi="ar-SA"/>
-              </w:rPr>
-            </w:r>
-          </w:p>
-        </w:tc>
-        <w:tc>
-          <w:tcPr>
-            <w:tcW w:w="4461" w:type="dxa"/>
-            <w:tcBorders>
-              <w:top w:val="single" w:sz="4" w:space="0" w:color="000000"/>
-              <w:left w:val="single" w:sz="4" w:space="0" w:color="000000"/>
-              <w:bottom w:val="single" w:sz="12" w:space="0" w:color="000000"/>
               <w:right w:val="single" w:sz="12" w:space="0" w:color="000000"/>
             </w:tcBorders>
             <w:tcMar>
@@ -7386,6 +5502,18 @@
                 <w:szCs w:val="22"/>
                 <w:lang w:val="pt-BR" w:eastAsia="pt-BR" w:bidi="ar-SA"/>
               </w:rPr>
+              <w:t>Construç</w:t>
+            </w:r>
+            <w:r>
+              <w:rPr>
+                <w:rFonts w:eastAsia="Calibri" w:cs="Calibri"/>
+                <w:color w:val="auto"/>
+                <w:kern w:val="0"/>
+                <w:sz w:val="22"/>
+                <w:szCs w:val="22"/>
+                <w:lang w:val="pt-BR" w:eastAsia="pt-BR" w:bidi="ar-SA"/>
+              </w:rPr>
+              <w:t>ão da solução final</w:t>
             </w:r>
           </w:p>
         </w:tc>
@@ -7425,6 +5553,7 @@
                 <w:szCs w:val="22"/>
                 <w:lang w:val="pt-BR" w:eastAsia="pt-BR" w:bidi="ar-SA"/>
               </w:rPr>
+              <w:t>Willian, Daniel, Gabriel e Dayan</w:t>
             </w:r>
           </w:p>
         </w:tc>
@@ -7464,6 +5593,7 @@
                 <w:szCs w:val="22"/>
                 <w:lang w:val="pt-BR" w:eastAsia="pt-BR" w:bidi="ar-SA"/>
               </w:rPr>
+              <w:t>13/04/2026</w:t>
             </w:r>
           </w:p>
         </w:tc>
@@ -7503,6 +5633,7 @@
                 <w:szCs w:val="22"/>
                 <w:lang w:val="pt-BR" w:eastAsia="pt-BR" w:bidi="ar-SA"/>
               </w:rPr>
+              <w:t>25/04/2026</w:t>
             </w:r>
           </w:p>
         </w:tc>
@@ -7586,6 +5717,18 @@
                 <w:szCs w:val="22"/>
                 <w:lang w:val="pt-BR" w:eastAsia="pt-BR" w:bidi="ar-SA"/>
               </w:rPr>
+              <w:t>Revis</w:t>
+            </w:r>
+            <w:r>
+              <w:rPr>
+                <w:rFonts w:eastAsia="Calibri" w:cs="Calibri"/>
+                <w:color w:val="auto"/>
+                <w:kern w:val="0"/>
+                <w:sz w:val="22"/>
+                <w:szCs w:val="22"/>
+                <w:lang w:val="pt-BR" w:eastAsia="pt-BR" w:bidi="ar-SA"/>
+              </w:rPr>
+              <w:t>ão e testes</w:t>
             </w:r>
           </w:p>
         </w:tc>
@@ -7625,6 +5768,18 @@
                 <w:szCs w:val="22"/>
                 <w:lang w:val="pt-BR" w:eastAsia="pt-BR" w:bidi="ar-SA"/>
               </w:rPr>
+              <w:t>Jos</w:t>
+            </w:r>
+            <w:r>
+              <w:rPr>
+                <w:rFonts w:eastAsia="Calibri" w:cs="Calibri"/>
+                <w:color w:val="auto"/>
+                <w:kern w:val="0"/>
+                <w:sz w:val="22"/>
+                <w:szCs w:val="22"/>
+                <w:lang w:val="pt-BR" w:eastAsia="pt-BR" w:bidi="ar-SA"/>
+              </w:rPr>
+              <w:t xml:space="preserve">é Ricardo, José Willas, Walter e Flávio </w:t>
             </w:r>
           </w:p>
         </w:tc>
@@ -7664,6 +5819,7 @@
                 <w:szCs w:val="22"/>
                 <w:lang w:val="pt-BR" w:eastAsia="pt-BR" w:bidi="ar-SA"/>
               </w:rPr>
+              <w:t>13/04/2026</w:t>
             </w:r>
           </w:p>
         </w:tc>
@@ -7703,6 +5859,7 @@
                 <w:szCs w:val="22"/>
                 <w:lang w:val="pt-BR" w:eastAsia="pt-BR" w:bidi="ar-SA"/>
               </w:rPr>
+              <w:t>25/04/2026</w:t>
             </w:r>
           </w:p>
         </w:tc>
@@ -7713,606 +5870,6 @@
               <w:top w:val="single" w:sz="4" w:space="0" w:color="000000"/>
               <w:left w:val="single" w:sz="4" w:space="0" w:color="000000"/>
               <w:bottom w:val="single" w:sz="4" w:space="0" w:color="000000"/>
-              <w:right w:val="single" w:sz="12" w:space="0" w:color="000000"/>
-            </w:tcBorders>
-            <w:tcMar>
-              <w:top w:w="57" w:type="dxa"/>
-              <w:bottom w:w="57" w:type="dxa"/>
-            </w:tcMar>
-          </w:tcPr>
-          <w:p>
-            <w:pPr>
-              <w:pStyle w:val="Normal"/>
-              <w:widowControl w:val="false"/>
-              <w:spacing w:before="0" w:after="0"/>
-              <w:jc w:val="left"/>
-              <w:rPr>
-                <w:rFonts w:eastAsia="Calibri" w:cs="Calibri"/>
-                <w:kern w:val="0"/>
-                <w:sz w:val="22"/>
-                <w:szCs w:val="22"/>
-                <w:lang w:val="pt-BR" w:eastAsia="pt-BR" w:bidi="ar-SA"/>
-              </w:rPr>
-            </w:pPr>
-            <w:r>
-              <w:rPr>
-                <w:rFonts w:eastAsia="Calibri" w:cs="Calibri"/>
-                <w:kern w:val="0"/>
-                <w:sz w:val="22"/>
-                <w:szCs w:val="22"/>
-                <w:lang w:val="pt-BR" w:eastAsia="pt-BR" w:bidi="ar-SA"/>
-              </w:rPr>
-            </w:r>
-          </w:p>
-        </w:tc>
-      </w:tr>
-      <w:tr>
-        <w:trPr>
-          <w:cantSplit w:val="true"/>
-        </w:trPr>
-        <w:tc>
-          <w:tcPr>
-            <w:tcW w:w="4382" w:type="dxa"/>
-            <w:tcBorders>
-              <w:top w:val="single" w:sz="4" w:space="0" w:color="000000"/>
-              <w:left w:val="single" w:sz="12" w:space="0" w:color="000000"/>
-              <w:bottom w:val="single" w:sz="4" w:space="0" w:color="000000"/>
-              <w:right w:val="single" w:sz="4" w:space="0" w:color="000000"/>
-            </w:tcBorders>
-            <w:tcMar>
-              <w:top w:w="57" w:type="dxa"/>
-              <w:bottom w:w="57" w:type="dxa"/>
-            </w:tcMar>
-          </w:tcPr>
-          <w:p>
-            <w:pPr>
-              <w:pStyle w:val="Normal"/>
-              <w:widowControl w:val="false"/>
-              <w:spacing w:before="0" w:after="0"/>
-              <w:jc w:val="left"/>
-              <w:rPr>
-                <w:rFonts w:eastAsia="Calibri" w:cs="Calibri"/>
-                <w:kern w:val="0"/>
-                <w:sz w:val="22"/>
-                <w:szCs w:val="22"/>
-                <w:lang w:val="pt-BR" w:eastAsia="pt-BR" w:bidi="ar-SA"/>
-              </w:rPr>
-            </w:pPr>
-            <w:r>
-              <w:rPr>
-                <w:rFonts w:eastAsia="Calibri" w:cs="Calibri"/>
-                <w:kern w:val="0"/>
-                <w:sz w:val="22"/>
-                <w:szCs w:val="22"/>
-                <w:lang w:val="pt-BR" w:eastAsia="pt-BR" w:bidi="ar-SA"/>
-              </w:rPr>
-            </w:r>
-          </w:p>
-        </w:tc>
-        <w:tc>
-          <w:tcPr>
-            <w:tcW w:w="2832" w:type="dxa"/>
-            <w:tcBorders>
-              <w:top w:val="single" w:sz="4" w:space="0" w:color="000000"/>
-              <w:left w:val="single" w:sz="4" w:space="0" w:color="000000"/>
-              <w:bottom w:val="single" w:sz="4" w:space="0" w:color="000000"/>
-              <w:right w:val="single" w:sz="4" w:space="0" w:color="000000"/>
-            </w:tcBorders>
-            <w:tcMar>
-              <w:top w:w="57" w:type="dxa"/>
-              <w:bottom w:w="57" w:type="dxa"/>
-            </w:tcMar>
-          </w:tcPr>
-          <w:p>
-            <w:pPr>
-              <w:pStyle w:val="Normal"/>
-              <w:widowControl w:val="false"/>
-              <w:spacing w:before="0" w:after="0"/>
-              <w:jc w:val="left"/>
-              <w:rPr>
-                <w:rFonts w:eastAsia="Calibri" w:cs="Calibri"/>
-                <w:kern w:val="0"/>
-                <w:sz w:val="22"/>
-                <w:szCs w:val="22"/>
-                <w:lang w:val="pt-BR" w:eastAsia="pt-BR" w:bidi="ar-SA"/>
-              </w:rPr>
-            </w:pPr>
-            <w:r>
-              <w:rPr>
-                <w:rFonts w:eastAsia="Calibri" w:cs="Calibri"/>
-                <w:kern w:val="0"/>
-                <w:sz w:val="22"/>
-                <w:szCs w:val="22"/>
-                <w:lang w:val="pt-BR" w:eastAsia="pt-BR" w:bidi="ar-SA"/>
-              </w:rPr>
-            </w:r>
-          </w:p>
-        </w:tc>
-        <w:tc>
-          <w:tcPr>
-            <w:tcW w:w="1557" w:type="dxa"/>
-            <w:tcBorders>
-              <w:top w:val="single" w:sz="4" w:space="0" w:color="000000"/>
-              <w:left w:val="single" w:sz="4" w:space="0" w:color="000000"/>
-              <w:bottom w:val="single" w:sz="4" w:space="0" w:color="000000"/>
-              <w:right w:val="single" w:sz="4" w:space="0" w:color="000000"/>
-            </w:tcBorders>
-            <w:tcMar>
-              <w:top w:w="57" w:type="dxa"/>
-              <w:bottom w:w="57" w:type="dxa"/>
-            </w:tcMar>
-          </w:tcPr>
-          <w:p>
-            <w:pPr>
-              <w:pStyle w:val="Normal"/>
-              <w:widowControl w:val="false"/>
-              <w:spacing w:before="0" w:after="0"/>
-              <w:jc w:val="left"/>
-              <w:rPr>
-                <w:rFonts w:eastAsia="Calibri" w:cs="Calibri"/>
-                <w:kern w:val="0"/>
-                <w:sz w:val="22"/>
-                <w:szCs w:val="22"/>
-                <w:lang w:val="pt-BR" w:eastAsia="pt-BR" w:bidi="ar-SA"/>
-              </w:rPr>
-            </w:pPr>
-            <w:r>
-              <w:rPr>
-                <w:rFonts w:eastAsia="Calibri" w:cs="Calibri"/>
-                <w:kern w:val="0"/>
-                <w:sz w:val="22"/>
-                <w:szCs w:val="22"/>
-                <w:lang w:val="pt-BR" w:eastAsia="pt-BR" w:bidi="ar-SA"/>
-              </w:rPr>
-            </w:r>
-          </w:p>
-        </w:tc>
-        <w:tc>
-          <w:tcPr>
-            <w:tcW w:w="1416" w:type="dxa"/>
-            <w:tcBorders>
-              <w:top w:val="single" w:sz="4" w:space="0" w:color="000000"/>
-              <w:left w:val="single" w:sz="4" w:space="0" w:color="000000"/>
-              <w:bottom w:val="single" w:sz="4" w:space="0" w:color="000000"/>
-              <w:right w:val="single" w:sz="4" w:space="0" w:color="000000"/>
-            </w:tcBorders>
-            <w:tcMar>
-              <w:top w:w="57" w:type="dxa"/>
-              <w:bottom w:w="57" w:type="dxa"/>
-            </w:tcMar>
-          </w:tcPr>
-          <w:p>
-            <w:pPr>
-              <w:pStyle w:val="Normal"/>
-              <w:widowControl w:val="false"/>
-              <w:spacing w:before="0" w:after="0"/>
-              <w:jc w:val="left"/>
-              <w:rPr>
-                <w:rFonts w:eastAsia="Calibri" w:cs="Calibri"/>
-                <w:kern w:val="0"/>
-                <w:sz w:val="22"/>
-                <w:szCs w:val="22"/>
-                <w:lang w:val="pt-BR" w:eastAsia="pt-BR" w:bidi="ar-SA"/>
-              </w:rPr>
-            </w:pPr>
-            <w:r>
-              <w:rPr>
-                <w:rFonts w:eastAsia="Calibri" w:cs="Calibri"/>
-                <w:kern w:val="0"/>
-                <w:sz w:val="22"/>
-                <w:szCs w:val="22"/>
-                <w:lang w:val="pt-BR" w:eastAsia="pt-BR" w:bidi="ar-SA"/>
-              </w:rPr>
-            </w:r>
-          </w:p>
-        </w:tc>
-        <w:tc>
-          <w:tcPr>
-            <w:tcW w:w="4461" w:type="dxa"/>
-            <w:tcBorders>
-              <w:top w:val="single" w:sz="4" w:space="0" w:color="000000"/>
-              <w:left w:val="single" w:sz="4" w:space="0" w:color="000000"/>
-              <w:bottom w:val="single" w:sz="4" w:space="0" w:color="000000"/>
-              <w:right w:val="single" w:sz="12" w:space="0" w:color="000000"/>
-            </w:tcBorders>
-            <w:tcMar>
-              <w:top w:w="57" w:type="dxa"/>
-              <w:bottom w:w="57" w:type="dxa"/>
-            </w:tcMar>
-          </w:tcPr>
-          <w:p>
-            <w:pPr>
-              <w:pStyle w:val="Normal"/>
-              <w:widowControl w:val="false"/>
-              <w:spacing w:before="0" w:after="0"/>
-              <w:jc w:val="left"/>
-              <w:rPr>
-                <w:rFonts w:eastAsia="Calibri" w:cs="Calibri"/>
-                <w:kern w:val="0"/>
-                <w:sz w:val="22"/>
-                <w:szCs w:val="22"/>
-                <w:lang w:val="pt-BR" w:eastAsia="pt-BR" w:bidi="ar-SA"/>
-              </w:rPr>
-            </w:pPr>
-            <w:r>
-              <w:rPr>
-                <w:rFonts w:eastAsia="Calibri" w:cs="Calibri"/>
-                <w:kern w:val="0"/>
-                <w:sz w:val="22"/>
-                <w:szCs w:val="22"/>
-                <w:lang w:val="pt-BR" w:eastAsia="pt-BR" w:bidi="ar-SA"/>
-              </w:rPr>
-            </w:r>
-          </w:p>
-        </w:tc>
-      </w:tr>
-      <w:tr>
-        <w:trPr>
-          <w:cantSplit w:val="true"/>
-        </w:trPr>
-        <w:tc>
-          <w:tcPr>
-            <w:tcW w:w="4382" w:type="dxa"/>
-            <w:tcBorders>
-              <w:top w:val="single" w:sz="4" w:space="0" w:color="000000"/>
-              <w:left w:val="single" w:sz="12" w:space="0" w:color="000000"/>
-              <w:bottom w:val="single" w:sz="4" w:space="0" w:color="000000"/>
-              <w:right w:val="single" w:sz="4" w:space="0" w:color="000000"/>
-            </w:tcBorders>
-            <w:tcMar>
-              <w:top w:w="57" w:type="dxa"/>
-              <w:bottom w:w="57" w:type="dxa"/>
-            </w:tcMar>
-          </w:tcPr>
-          <w:p>
-            <w:pPr>
-              <w:pStyle w:val="Normal"/>
-              <w:widowControl w:val="false"/>
-              <w:spacing w:before="0" w:after="0"/>
-              <w:jc w:val="left"/>
-              <w:rPr>
-                <w:rFonts w:eastAsia="Calibri" w:cs="Calibri"/>
-                <w:kern w:val="0"/>
-                <w:sz w:val="22"/>
-                <w:szCs w:val="22"/>
-                <w:lang w:val="pt-BR" w:eastAsia="pt-BR" w:bidi="ar-SA"/>
-              </w:rPr>
-            </w:pPr>
-            <w:r>
-              <w:rPr>
-                <w:rFonts w:eastAsia="Calibri" w:cs="Calibri"/>
-                <w:kern w:val="0"/>
-                <w:sz w:val="22"/>
-                <w:szCs w:val="22"/>
-                <w:lang w:val="pt-BR" w:eastAsia="pt-BR" w:bidi="ar-SA"/>
-              </w:rPr>
-            </w:r>
-          </w:p>
-        </w:tc>
-        <w:tc>
-          <w:tcPr>
-            <w:tcW w:w="2832" w:type="dxa"/>
-            <w:tcBorders>
-              <w:top w:val="single" w:sz="4" w:space="0" w:color="000000"/>
-              <w:left w:val="single" w:sz="4" w:space="0" w:color="000000"/>
-              <w:bottom w:val="single" w:sz="4" w:space="0" w:color="000000"/>
-              <w:right w:val="single" w:sz="4" w:space="0" w:color="000000"/>
-            </w:tcBorders>
-            <w:tcMar>
-              <w:top w:w="57" w:type="dxa"/>
-              <w:bottom w:w="57" w:type="dxa"/>
-            </w:tcMar>
-          </w:tcPr>
-          <w:p>
-            <w:pPr>
-              <w:pStyle w:val="Normal"/>
-              <w:widowControl w:val="false"/>
-              <w:spacing w:before="0" w:after="0"/>
-              <w:jc w:val="left"/>
-              <w:rPr>
-                <w:rFonts w:eastAsia="Calibri" w:cs="Calibri"/>
-                <w:kern w:val="0"/>
-                <w:sz w:val="22"/>
-                <w:szCs w:val="22"/>
-                <w:lang w:val="pt-BR" w:eastAsia="pt-BR" w:bidi="ar-SA"/>
-              </w:rPr>
-            </w:pPr>
-            <w:r>
-              <w:rPr>
-                <w:rFonts w:eastAsia="Calibri" w:cs="Calibri"/>
-                <w:kern w:val="0"/>
-                <w:sz w:val="22"/>
-                <w:szCs w:val="22"/>
-                <w:lang w:val="pt-BR" w:eastAsia="pt-BR" w:bidi="ar-SA"/>
-              </w:rPr>
-            </w:r>
-          </w:p>
-        </w:tc>
-        <w:tc>
-          <w:tcPr>
-            <w:tcW w:w="1557" w:type="dxa"/>
-            <w:tcBorders>
-              <w:top w:val="single" w:sz="4" w:space="0" w:color="000000"/>
-              <w:left w:val="single" w:sz="4" w:space="0" w:color="000000"/>
-              <w:bottom w:val="single" w:sz="4" w:space="0" w:color="000000"/>
-              <w:right w:val="single" w:sz="4" w:space="0" w:color="000000"/>
-            </w:tcBorders>
-            <w:tcMar>
-              <w:top w:w="57" w:type="dxa"/>
-              <w:bottom w:w="57" w:type="dxa"/>
-            </w:tcMar>
-          </w:tcPr>
-          <w:p>
-            <w:pPr>
-              <w:pStyle w:val="Normal"/>
-              <w:widowControl w:val="false"/>
-              <w:spacing w:before="0" w:after="0"/>
-              <w:jc w:val="left"/>
-              <w:rPr>
-                <w:rFonts w:eastAsia="Calibri" w:cs="Calibri"/>
-                <w:kern w:val="0"/>
-                <w:sz w:val="22"/>
-                <w:szCs w:val="22"/>
-                <w:lang w:val="pt-BR" w:eastAsia="pt-BR" w:bidi="ar-SA"/>
-              </w:rPr>
-            </w:pPr>
-            <w:r>
-              <w:rPr>
-                <w:rFonts w:eastAsia="Calibri" w:cs="Calibri"/>
-                <w:kern w:val="0"/>
-                <w:sz w:val="22"/>
-                <w:szCs w:val="22"/>
-                <w:lang w:val="pt-BR" w:eastAsia="pt-BR" w:bidi="ar-SA"/>
-              </w:rPr>
-            </w:r>
-          </w:p>
-        </w:tc>
-        <w:tc>
-          <w:tcPr>
-            <w:tcW w:w="1416" w:type="dxa"/>
-            <w:tcBorders>
-              <w:top w:val="single" w:sz="4" w:space="0" w:color="000000"/>
-              <w:left w:val="single" w:sz="4" w:space="0" w:color="000000"/>
-              <w:bottom w:val="single" w:sz="4" w:space="0" w:color="000000"/>
-              <w:right w:val="single" w:sz="4" w:space="0" w:color="000000"/>
-            </w:tcBorders>
-            <w:tcMar>
-              <w:top w:w="57" w:type="dxa"/>
-              <w:bottom w:w="57" w:type="dxa"/>
-            </w:tcMar>
-          </w:tcPr>
-          <w:p>
-            <w:pPr>
-              <w:pStyle w:val="Normal"/>
-              <w:widowControl w:val="false"/>
-              <w:spacing w:before="0" w:after="0"/>
-              <w:jc w:val="left"/>
-              <w:rPr>
-                <w:rFonts w:eastAsia="Calibri" w:cs="Calibri"/>
-                <w:kern w:val="0"/>
-                <w:sz w:val="22"/>
-                <w:szCs w:val="22"/>
-                <w:lang w:val="pt-BR" w:eastAsia="pt-BR" w:bidi="ar-SA"/>
-              </w:rPr>
-            </w:pPr>
-            <w:r>
-              <w:rPr>
-                <w:rFonts w:eastAsia="Calibri" w:cs="Calibri"/>
-                <w:kern w:val="0"/>
-                <w:sz w:val="22"/>
-                <w:szCs w:val="22"/>
-                <w:lang w:val="pt-BR" w:eastAsia="pt-BR" w:bidi="ar-SA"/>
-              </w:rPr>
-            </w:r>
-          </w:p>
-        </w:tc>
-        <w:tc>
-          <w:tcPr>
-            <w:tcW w:w="4461" w:type="dxa"/>
-            <w:tcBorders>
-              <w:top w:val="single" w:sz="4" w:space="0" w:color="000000"/>
-              <w:left w:val="single" w:sz="4" w:space="0" w:color="000000"/>
-              <w:bottom w:val="single" w:sz="4" w:space="0" w:color="000000"/>
-              <w:right w:val="single" w:sz="12" w:space="0" w:color="000000"/>
-            </w:tcBorders>
-            <w:tcMar>
-              <w:top w:w="57" w:type="dxa"/>
-              <w:bottom w:w="57" w:type="dxa"/>
-            </w:tcMar>
-          </w:tcPr>
-          <w:p>
-            <w:pPr>
-              <w:pStyle w:val="Normal"/>
-              <w:widowControl w:val="false"/>
-              <w:spacing w:before="0" w:after="0"/>
-              <w:jc w:val="left"/>
-              <w:rPr>
-                <w:rFonts w:eastAsia="Calibri" w:cs="Calibri"/>
-                <w:kern w:val="0"/>
-                <w:sz w:val="22"/>
-                <w:szCs w:val="22"/>
-                <w:lang w:val="pt-BR" w:eastAsia="pt-BR" w:bidi="ar-SA"/>
-              </w:rPr>
-            </w:pPr>
-            <w:r>
-              <w:rPr>
-                <w:rFonts w:eastAsia="Calibri" w:cs="Calibri"/>
-                <w:kern w:val="0"/>
-                <w:sz w:val="22"/>
-                <w:szCs w:val="22"/>
-                <w:lang w:val="pt-BR" w:eastAsia="pt-BR" w:bidi="ar-SA"/>
-              </w:rPr>
-            </w:r>
-          </w:p>
-        </w:tc>
-      </w:tr>
-      <w:tr>
-        <w:trPr>
-          <w:cantSplit w:val="true"/>
-        </w:trPr>
-        <w:tc>
-          <w:tcPr>
-            <w:tcW w:w="4382" w:type="dxa"/>
-            <w:tcBorders>
-              <w:top w:val="single" w:sz="4" w:space="0" w:color="000000"/>
-              <w:left w:val="single" w:sz="12" w:space="0" w:color="000000"/>
-              <w:bottom w:val="single" w:sz="12" w:space="0" w:color="000000"/>
-              <w:right w:val="single" w:sz="4" w:space="0" w:color="000000"/>
-            </w:tcBorders>
-            <w:tcMar>
-              <w:top w:w="57" w:type="dxa"/>
-              <w:bottom w:w="57" w:type="dxa"/>
-            </w:tcMar>
-          </w:tcPr>
-          <w:p>
-            <w:pPr>
-              <w:pStyle w:val="Normal"/>
-              <w:widowControl w:val="false"/>
-              <w:spacing w:before="0" w:after="0"/>
-              <w:jc w:val="left"/>
-              <w:rPr>
-                <w:rFonts w:eastAsia="Calibri" w:cs="Calibri"/>
-                <w:kern w:val="0"/>
-                <w:sz w:val="22"/>
-                <w:szCs w:val="22"/>
-                <w:lang w:val="pt-BR" w:eastAsia="pt-BR" w:bidi="ar-SA"/>
-              </w:rPr>
-            </w:pPr>
-            <w:r>
-              <w:rPr>
-                <w:rFonts w:eastAsia="Calibri" w:cs="Calibri"/>
-                <w:kern w:val="0"/>
-                <w:sz w:val="22"/>
-                <w:szCs w:val="22"/>
-                <w:lang w:val="pt-BR" w:eastAsia="pt-BR" w:bidi="ar-SA"/>
-              </w:rPr>
-            </w:r>
-          </w:p>
-        </w:tc>
-        <w:tc>
-          <w:tcPr>
-            <w:tcW w:w="2832" w:type="dxa"/>
-            <w:tcBorders>
-              <w:top w:val="single" w:sz="4" w:space="0" w:color="000000"/>
-              <w:left w:val="single" w:sz="4" w:space="0" w:color="000000"/>
-              <w:bottom w:val="single" w:sz="12" w:space="0" w:color="000000"/>
-              <w:right w:val="single" w:sz="4" w:space="0" w:color="000000"/>
-            </w:tcBorders>
-            <w:tcMar>
-              <w:top w:w="57" w:type="dxa"/>
-              <w:bottom w:w="57" w:type="dxa"/>
-            </w:tcMar>
-          </w:tcPr>
-          <w:p>
-            <w:pPr>
-              <w:pStyle w:val="Normal"/>
-              <w:widowControl w:val="false"/>
-              <w:spacing w:before="0" w:after="0"/>
-              <w:jc w:val="left"/>
-              <w:rPr>
-                <w:rFonts w:eastAsia="Calibri" w:cs="Calibri"/>
-                <w:kern w:val="0"/>
-                <w:sz w:val="22"/>
-                <w:szCs w:val="22"/>
-                <w:lang w:val="pt-BR" w:eastAsia="pt-BR" w:bidi="ar-SA"/>
-              </w:rPr>
-            </w:pPr>
-            <w:r>
-              <w:rPr>
-                <w:rFonts w:eastAsia="Calibri" w:cs="Calibri"/>
-                <w:kern w:val="0"/>
-                <w:sz w:val="22"/>
-                <w:szCs w:val="22"/>
-                <w:lang w:val="pt-BR" w:eastAsia="pt-BR" w:bidi="ar-SA"/>
-              </w:rPr>
-            </w:r>
-          </w:p>
-        </w:tc>
-        <w:tc>
-          <w:tcPr>
-            <w:tcW w:w="1557" w:type="dxa"/>
-            <w:tcBorders>
-              <w:top w:val="single" w:sz="4" w:space="0" w:color="000000"/>
-              <w:left w:val="single" w:sz="4" w:space="0" w:color="000000"/>
-              <w:bottom w:val="single" w:sz="12" w:space="0" w:color="000000"/>
-              <w:right w:val="single" w:sz="4" w:space="0" w:color="000000"/>
-            </w:tcBorders>
-            <w:tcMar>
-              <w:top w:w="57" w:type="dxa"/>
-              <w:bottom w:w="57" w:type="dxa"/>
-            </w:tcMar>
-          </w:tcPr>
-          <w:p>
-            <w:pPr>
-              <w:pStyle w:val="Normal"/>
-              <w:widowControl w:val="false"/>
-              <w:spacing w:before="0" w:after="0"/>
-              <w:jc w:val="left"/>
-              <w:rPr>
-                <w:rFonts w:eastAsia="Calibri" w:cs="Calibri"/>
-                <w:kern w:val="0"/>
-                <w:sz w:val="22"/>
-                <w:szCs w:val="22"/>
-                <w:lang w:val="pt-BR" w:eastAsia="pt-BR" w:bidi="ar-SA"/>
-              </w:rPr>
-            </w:pPr>
-            <w:r>
-              <w:rPr>
-                <w:rFonts w:eastAsia="Calibri" w:cs="Calibri"/>
-                <w:kern w:val="0"/>
-                <w:sz w:val="22"/>
-                <w:szCs w:val="22"/>
-                <w:lang w:val="pt-BR" w:eastAsia="pt-BR" w:bidi="ar-SA"/>
-              </w:rPr>
-            </w:r>
-          </w:p>
-        </w:tc>
-        <w:tc>
-          <w:tcPr>
-            <w:tcW w:w="1416" w:type="dxa"/>
-            <w:tcBorders>
-              <w:top w:val="single" w:sz="4" w:space="0" w:color="000000"/>
-              <w:left w:val="single" w:sz="4" w:space="0" w:color="000000"/>
-              <w:bottom w:val="single" w:sz="12" w:space="0" w:color="000000"/>
-              <w:right w:val="single" w:sz="4" w:space="0" w:color="000000"/>
-            </w:tcBorders>
-            <w:tcMar>
-              <w:top w:w="57" w:type="dxa"/>
-              <w:bottom w:w="57" w:type="dxa"/>
-            </w:tcMar>
-          </w:tcPr>
-          <w:p>
-            <w:pPr>
-              <w:pStyle w:val="Normal"/>
-              <w:widowControl w:val="false"/>
-              <w:spacing w:before="0" w:after="0"/>
-              <w:jc w:val="left"/>
-              <w:rPr>
-                <w:rFonts w:eastAsia="Calibri" w:cs="Calibri"/>
-                <w:kern w:val="0"/>
-                <w:sz w:val="22"/>
-                <w:szCs w:val="22"/>
-                <w:lang w:val="pt-BR" w:eastAsia="pt-BR" w:bidi="ar-SA"/>
-              </w:rPr>
-            </w:pPr>
-            <w:r>
-              <w:rPr>
-                <w:rFonts w:eastAsia="Calibri" w:cs="Calibri"/>
-                <w:kern w:val="0"/>
-                <w:sz w:val="22"/>
-                <w:szCs w:val="22"/>
-                <w:lang w:val="pt-BR" w:eastAsia="pt-BR" w:bidi="ar-SA"/>
-              </w:rPr>
-            </w:r>
-          </w:p>
-        </w:tc>
-        <w:tc>
-          <w:tcPr>
-            <w:tcW w:w="4461" w:type="dxa"/>
-            <w:tcBorders>
-              <w:top w:val="single" w:sz="4" w:space="0" w:color="000000"/>
-              <w:left w:val="single" w:sz="4" w:space="0" w:color="000000"/>
-              <w:bottom w:val="single" w:sz="12" w:space="0" w:color="000000"/>
               <w:right w:val="single" w:sz="12" w:space="0" w:color="000000"/>
             </w:tcBorders>
             <w:tcMar>
@@ -8733,6 +6290,18 @@
                 <w:szCs w:val="22"/>
                 <w:lang w:val="pt-BR" w:eastAsia="pt-BR" w:bidi="ar-SA"/>
               </w:rPr>
+              <w:t>Finalizaç</w:t>
+            </w:r>
+            <w:r>
+              <w:rPr>
+                <w:rFonts w:eastAsia="Calibri" w:cs="Calibri"/>
+                <w:color w:val="auto"/>
+                <w:kern w:val="0"/>
+                <w:sz w:val="22"/>
+                <w:szCs w:val="22"/>
+                <w:lang w:val="pt-BR" w:eastAsia="pt-BR" w:bidi="ar-SA"/>
+              </w:rPr>
+              <w:t xml:space="preserve">ão do protótipo </w:t>
             </w:r>
           </w:p>
         </w:tc>
@@ -8772,6 +6341,7 @@
                 <w:szCs w:val="22"/>
                 <w:lang w:val="pt-BR" w:eastAsia="pt-BR" w:bidi="ar-SA"/>
               </w:rPr>
+              <w:t>Willian, Daniel, Gabriel e Dayan</w:t>
             </w:r>
           </w:p>
         </w:tc>
@@ -8811,6 +6381,7 @@
                 <w:szCs w:val="22"/>
                 <w:lang w:val="pt-BR" w:eastAsia="pt-BR" w:bidi="ar-SA"/>
               </w:rPr>
+              <w:t>27/04/2026</w:t>
             </w:r>
           </w:p>
         </w:tc>
@@ -8850,6 +6421,7 @@
                 <w:szCs w:val="22"/>
                 <w:lang w:val="pt-BR" w:eastAsia="pt-BR" w:bidi="ar-SA"/>
               </w:rPr>
+              <w:t>10/05/2026</w:t>
             </w:r>
           </w:p>
         </w:tc>
@@ -8933,6 +6505,18 @@
                 <w:szCs w:val="22"/>
                 <w:lang w:val="pt-BR" w:eastAsia="pt-BR" w:bidi="ar-SA"/>
               </w:rPr>
+              <w:t>Preparaç</w:t>
+            </w:r>
+            <w:r>
+              <w:rPr>
+                <w:rFonts w:eastAsia="Calibri" w:cs="Calibri"/>
+                <w:color w:val="auto"/>
+                <w:kern w:val="0"/>
+                <w:sz w:val="22"/>
+                <w:szCs w:val="22"/>
+                <w:lang w:val="pt-BR" w:eastAsia="pt-BR" w:bidi="ar-SA"/>
+              </w:rPr>
+              <w:t>ão do video</w:t>
             </w:r>
           </w:p>
         </w:tc>
@@ -8972,6 +6556,18 @@
                 <w:szCs w:val="22"/>
                 <w:lang w:val="pt-BR" w:eastAsia="pt-BR" w:bidi="ar-SA"/>
               </w:rPr>
+              <w:t>Jos</w:t>
+            </w:r>
+            <w:r>
+              <w:rPr>
+                <w:rFonts w:eastAsia="Calibri" w:cs="Calibri"/>
+                <w:color w:val="auto"/>
+                <w:kern w:val="0"/>
+                <w:sz w:val="22"/>
+                <w:szCs w:val="22"/>
+                <w:lang w:val="pt-BR" w:eastAsia="pt-BR" w:bidi="ar-SA"/>
+              </w:rPr>
+              <w:t xml:space="preserve">é Ricardo, José Willas, Walter e Flávio </w:t>
             </w:r>
           </w:p>
         </w:tc>
@@ -9011,6 +6607,7 @@
                 <w:szCs w:val="22"/>
                 <w:lang w:val="pt-BR" w:eastAsia="pt-BR" w:bidi="ar-SA"/>
               </w:rPr>
+              <w:t>27/04/2026</w:t>
             </w:r>
           </w:p>
         </w:tc>
@@ -9050,6 +6647,7 @@
                 <w:szCs w:val="22"/>
                 <w:lang w:val="pt-BR" w:eastAsia="pt-BR" w:bidi="ar-SA"/>
               </w:rPr>
+              <w:t>10/05/2026</w:t>
             </w:r>
           </w:p>
         </w:tc>
@@ -9060,606 +6658,6 @@
               <w:top w:val="single" w:sz="4" w:space="0" w:color="000000"/>
               <w:left w:val="single" w:sz="4" w:space="0" w:color="000000"/>
               <w:bottom w:val="single" w:sz="4" w:space="0" w:color="000000"/>
-              <w:right w:val="single" w:sz="12" w:space="0" w:color="000000"/>
-            </w:tcBorders>
-            <w:tcMar>
-              <w:top w:w="57" w:type="dxa"/>
-              <w:bottom w:w="57" w:type="dxa"/>
-            </w:tcMar>
-          </w:tcPr>
-          <w:p>
-            <w:pPr>
-              <w:pStyle w:val="Normal"/>
-              <w:widowControl w:val="false"/>
-              <w:spacing w:before="0" w:after="0"/>
-              <w:jc w:val="left"/>
-              <w:rPr>
-                <w:rFonts w:eastAsia="Calibri" w:cs="Calibri"/>
-                <w:kern w:val="0"/>
-                <w:sz w:val="22"/>
-                <w:szCs w:val="22"/>
-                <w:lang w:val="pt-BR" w:eastAsia="pt-BR" w:bidi="ar-SA"/>
-              </w:rPr>
-            </w:pPr>
-            <w:r>
-              <w:rPr>
-                <w:rFonts w:eastAsia="Calibri" w:cs="Calibri"/>
-                <w:kern w:val="0"/>
-                <w:sz w:val="22"/>
-                <w:szCs w:val="22"/>
-                <w:lang w:val="pt-BR" w:eastAsia="pt-BR" w:bidi="ar-SA"/>
-              </w:rPr>
-            </w:r>
-          </w:p>
-        </w:tc>
-      </w:tr>
-      <w:tr>
-        <w:trPr>
-          <w:cantSplit w:val="true"/>
-        </w:trPr>
-        <w:tc>
-          <w:tcPr>
-            <w:tcW w:w="4382" w:type="dxa"/>
-            <w:tcBorders>
-              <w:top w:val="single" w:sz="4" w:space="0" w:color="000000"/>
-              <w:left w:val="single" w:sz="12" w:space="0" w:color="000000"/>
-              <w:bottom w:val="single" w:sz="4" w:space="0" w:color="000000"/>
-              <w:right w:val="single" w:sz="4" w:space="0" w:color="000000"/>
-            </w:tcBorders>
-            <w:tcMar>
-              <w:top w:w="57" w:type="dxa"/>
-              <w:bottom w:w="57" w:type="dxa"/>
-            </w:tcMar>
-          </w:tcPr>
-          <w:p>
-            <w:pPr>
-              <w:pStyle w:val="Normal"/>
-              <w:widowControl w:val="false"/>
-              <w:spacing w:before="0" w:after="0"/>
-              <w:jc w:val="left"/>
-              <w:rPr>
-                <w:rFonts w:eastAsia="Calibri" w:cs="Calibri"/>
-                <w:kern w:val="0"/>
-                <w:sz w:val="22"/>
-                <w:szCs w:val="22"/>
-                <w:lang w:val="pt-BR" w:eastAsia="pt-BR" w:bidi="ar-SA"/>
-              </w:rPr>
-            </w:pPr>
-            <w:r>
-              <w:rPr>
-                <w:rFonts w:eastAsia="Calibri" w:cs="Calibri"/>
-                <w:kern w:val="0"/>
-                <w:sz w:val="22"/>
-                <w:szCs w:val="22"/>
-                <w:lang w:val="pt-BR" w:eastAsia="pt-BR" w:bidi="ar-SA"/>
-              </w:rPr>
-            </w:r>
-          </w:p>
-        </w:tc>
-        <w:tc>
-          <w:tcPr>
-            <w:tcW w:w="2832" w:type="dxa"/>
-            <w:tcBorders>
-              <w:top w:val="single" w:sz="4" w:space="0" w:color="000000"/>
-              <w:left w:val="single" w:sz="4" w:space="0" w:color="000000"/>
-              <w:bottom w:val="single" w:sz="4" w:space="0" w:color="000000"/>
-              <w:right w:val="single" w:sz="4" w:space="0" w:color="000000"/>
-            </w:tcBorders>
-            <w:tcMar>
-              <w:top w:w="57" w:type="dxa"/>
-              <w:bottom w:w="57" w:type="dxa"/>
-            </w:tcMar>
-          </w:tcPr>
-          <w:p>
-            <w:pPr>
-              <w:pStyle w:val="Normal"/>
-              <w:widowControl w:val="false"/>
-              <w:spacing w:before="0" w:after="0"/>
-              <w:jc w:val="left"/>
-              <w:rPr>
-                <w:rFonts w:eastAsia="Calibri" w:cs="Calibri"/>
-                <w:kern w:val="0"/>
-                <w:sz w:val="22"/>
-                <w:szCs w:val="22"/>
-                <w:lang w:val="pt-BR" w:eastAsia="pt-BR" w:bidi="ar-SA"/>
-              </w:rPr>
-            </w:pPr>
-            <w:r>
-              <w:rPr>
-                <w:rFonts w:eastAsia="Calibri" w:cs="Calibri"/>
-                <w:kern w:val="0"/>
-                <w:sz w:val="22"/>
-                <w:szCs w:val="22"/>
-                <w:lang w:val="pt-BR" w:eastAsia="pt-BR" w:bidi="ar-SA"/>
-              </w:rPr>
-            </w:r>
-          </w:p>
-        </w:tc>
-        <w:tc>
-          <w:tcPr>
-            <w:tcW w:w="1557" w:type="dxa"/>
-            <w:tcBorders>
-              <w:top w:val="single" w:sz="4" w:space="0" w:color="000000"/>
-              <w:left w:val="single" w:sz="4" w:space="0" w:color="000000"/>
-              <w:bottom w:val="single" w:sz="4" w:space="0" w:color="000000"/>
-              <w:right w:val="single" w:sz="4" w:space="0" w:color="000000"/>
-            </w:tcBorders>
-            <w:tcMar>
-              <w:top w:w="57" w:type="dxa"/>
-              <w:bottom w:w="57" w:type="dxa"/>
-            </w:tcMar>
-          </w:tcPr>
-          <w:p>
-            <w:pPr>
-              <w:pStyle w:val="Normal"/>
-              <w:widowControl w:val="false"/>
-              <w:spacing w:before="0" w:after="0"/>
-              <w:jc w:val="left"/>
-              <w:rPr>
-                <w:rFonts w:eastAsia="Calibri" w:cs="Calibri"/>
-                <w:kern w:val="0"/>
-                <w:sz w:val="22"/>
-                <w:szCs w:val="22"/>
-                <w:lang w:val="pt-BR" w:eastAsia="pt-BR" w:bidi="ar-SA"/>
-              </w:rPr>
-            </w:pPr>
-            <w:r>
-              <w:rPr>
-                <w:rFonts w:eastAsia="Calibri" w:cs="Calibri"/>
-                <w:kern w:val="0"/>
-                <w:sz w:val="22"/>
-                <w:szCs w:val="22"/>
-                <w:lang w:val="pt-BR" w:eastAsia="pt-BR" w:bidi="ar-SA"/>
-              </w:rPr>
-            </w:r>
-          </w:p>
-        </w:tc>
-        <w:tc>
-          <w:tcPr>
-            <w:tcW w:w="1416" w:type="dxa"/>
-            <w:tcBorders>
-              <w:top w:val="single" w:sz="4" w:space="0" w:color="000000"/>
-              <w:left w:val="single" w:sz="4" w:space="0" w:color="000000"/>
-              <w:bottom w:val="single" w:sz="4" w:space="0" w:color="000000"/>
-              <w:right w:val="single" w:sz="4" w:space="0" w:color="000000"/>
-            </w:tcBorders>
-            <w:tcMar>
-              <w:top w:w="57" w:type="dxa"/>
-              <w:bottom w:w="57" w:type="dxa"/>
-            </w:tcMar>
-          </w:tcPr>
-          <w:p>
-            <w:pPr>
-              <w:pStyle w:val="Normal"/>
-              <w:widowControl w:val="false"/>
-              <w:spacing w:before="0" w:after="0"/>
-              <w:jc w:val="left"/>
-              <w:rPr>
-                <w:rFonts w:eastAsia="Calibri" w:cs="Calibri"/>
-                <w:kern w:val="0"/>
-                <w:sz w:val="22"/>
-                <w:szCs w:val="22"/>
-                <w:lang w:val="pt-BR" w:eastAsia="pt-BR" w:bidi="ar-SA"/>
-              </w:rPr>
-            </w:pPr>
-            <w:r>
-              <w:rPr>
-                <w:rFonts w:eastAsia="Calibri" w:cs="Calibri"/>
-                <w:kern w:val="0"/>
-                <w:sz w:val="22"/>
-                <w:szCs w:val="22"/>
-                <w:lang w:val="pt-BR" w:eastAsia="pt-BR" w:bidi="ar-SA"/>
-              </w:rPr>
-            </w:r>
-          </w:p>
-        </w:tc>
-        <w:tc>
-          <w:tcPr>
-            <w:tcW w:w="4461" w:type="dxa"/>
-            <w:tcBorders>
-              <w:top w:val="single" w:sz="4" w:space="0" w:color="000000"/>
-              <w:left w:val="single" w:sz="4" w:space="0" w:color="000000"/>
-              <w:bottom w:val="single" w:sz="4" w:space="0" w:color="000000"/>
-              <w:right w:val="single" w:sz="12" w:space="0" w:color="000000"/>
-            </w:tcBorders>
-            <w:tcMar>
-              <w:top w:w="57" w:type="dxa"/>
-              <w:bottom w:w="57" w:type="dxa"/>
-            </w:tcMar>
-          </w:tcPr>
-          <w:p>
-            <w:pPr>
-              <w:pStyle w:val="Normal"/>
-              <w:widowControl w:val="false"/>
-              <w:spacing w:before="0" w:after="0"/>
-              <w:jc w:val="left"/>
-              <w:rPr>
-                <w:rFonts w:eastAsia="Calibri" w:cs="Calibri"/>
-                <w:kern w:val="0"/>
-                <w:sz w:val="22"/>
-                <w:szCs w:val="22"/>
-                <w:lang w:val="pt-BR" w:eastAsia="pt-BR" w:bidi="ar-SA"/>
-              </w:rPr>
-            </w:pPr>
-            <w:r>
-              <w:rPr>
-                <w:rFonts w:eastAsia="Calibri" w:cs="Calibri"/>
-                <w:kern w:val="0"/>
-                <w:sz w:val="22"/>
-                <w:szCs w:val="22"/>
-                <w:lang w:val="pt-BR" w:eastAsia="pt-BR" w:bidi="ar-SA"/>
-              </w:rPr>
-            </w:r>
-          </w:p>
-        </w:tc>
-      </w:tr>
-      <w:tr>
-        <w:trPr>
-          <w:cantSplit w:val="true"/>
-        </w:trPr>
-        <w:tc>
-          <w:tcPr>
-            <w:tcW w:w="4382" w:type="dxa"/>
-            <w:tcBorders>
-              <w:top w:val="single" w:sz="4" w:space="0" w:color="000000"/>
-              <w:left w:val="single" w:sz="12" w:space="0" w:color="000000"/>
-              <w:bottom w:val="single" w:sz="4" w:space="0" w:color="000000"/>
-              <w:right w:val="single" w:sz="4" w:space="0" w:color="000000"/>
-            </w:tcBorders>
-            <w:tcMar>
-              <w:top w:w="57" w:type="dxa"/>
-              <w:bottom w:w="57" w:type="dxa"/>
-            </w:tcMar>
-          </w:tcPr>
-          <w:p>
-            <w:pPr>
-              <w:pStyle w:val="Normal"/>
-              <w:widowControl w:val="false"/>
-              <w:spacing w:before="0" w:after="0"/>
-              <w:jc w:val="left"/>
-              <w:rPr>
-                <w:rFonts w:eastAsia="Calibri" w:cs="Calibri"/>
-                <w:kern w:val="0"/>
-                <w:sz w:val="22"/>
-                <w:szCs w:val="22"/>
-                <w:lang w:val="pt-BR" w:eastAsia="pt-BR" w:bidi="ar-SA"/>
-              </w:rPr>
-            </w:pPr>
-            <w:r>
-              <w:rPr>
-                <w:rFonts w:eastAsia="Calibri" w:cs="Calibri"/>
-                <w:kern w:val="0"/>
-                <w:sz w:val="22"/>
-                <w:szCs w:val="22"/>
-                <w:lang w:val="pt-BR" w:eastAsia="pt-BR" w:bidi="ar-SA"/>
-              </w:rPr>
-            </w:r>
-          </w:p>
-        </w:tc>
-        <w:tc>
-          <w:tcPr>
-            <w:tcW w:w="2832" w:type="dxa"/>
-            <w:tcBorders>
-              <w:top w:val="single" w:sz="4" w:space="0" w:color="000000"/>
-              <w:left w:val="single" w:sz="4" w:space="0" w:color="000000"/>
-              <w:bottom w:val="single" w:sz="4" w:space="0" w:color="000000"/>
-              <w:right w:val="single" w:sz="4" w:space="0" w:color="000000"/>
-            </w:tcBorders>
-            <w:tcMar>
-              <w:top w:w="57" w:type="dxa"/>
-              <w:bottom w:w="57" w:type="dxa"/>
-            </w:tcMar>
-          </w:tcPr>
-          <w:p>
-            <w:pPr>
-              <w:pStyle w:val="Normal"/>
-              <w:widowControl w:val="false"/>
-              <w:spacing w:before="0" w:after="0"/>
-              <w:jc w:val="left"/>
-              <w:rPr>
-                <w:rFonts w:eastAsia="Calibri" w:cs="Calibri"/>
-                <w:kern w:val="0"/>
-                <w:sz w:val="22"/>
-                <w:szCs w:val="22"/>
-                <w:lang w:val="pt-BR" w:eastAsia="pt-BR" w:bidi="ar-SA"/>
-              </w:rPr>
-            </w:pPr>
-            <w:r>
-              <w:rPr>
-                <w:rFonts w:eastAsia="Calibri" w:cs="Calibri"/>
-                <w:kern w:val="0"/>
-                <w:sz w:val="22"/>
-                <w:szCs w:val="22"/>
-                <w:lang w:val="pt-BR" w:eastAsia="pt-BR" w:bidi="ar-SA"/>
-              </w:rPr>
-            </w:r>
-          </w:p>
-        </w:tc>
-        <w:tc>
-          <w:tcPr>
-            <w:tcW w:w="1557" w:type="dxa"/>
-            <w:tcBorders>
-              <w:top w:val="single" w:sz="4" w:space="0" w:color="000000"/>
-              <w:left w:val="single" w:sz="4" w:space="0" w:color="000000"/>
-              <w:bottom w:val="single" w:sz="4" w:space="0" w:color="000000"/>
-              <w:right w:val="single" w:sz="4" w:space="0" w:color="000000"/>
-            </w:tcBorders>
-            <w:tcMar>
-              <w:top w:w="57" w:type="dxa"/>
-              <w:bottom w:w="57" w:type="dxa"/>
-            </w:tcMar>
-          </w:tcPr>
-          <w:p>
-            <w:pPr>
-              <w:pStyle w:val="Normal"/>
-              <w:widowControl w:val="false"/>
-              <w:spacing w:before="0" w:after="0"/>
-              <w:jc w:val="left"/>
-              <w:rPr>
-                <w:rFonts w:eastAsia="Calibri" w:cs="Calibri"/>
-                <w:kern w:val="0"/>
-                <w:sz w:val="22"/>
-                <w:szCs w:val="22"/>
-                <w:lang w:val="pt-BR" w:eastAsia="pt-BR" w:bidi="ar-SA"/>
-              </w:rPr>
-            </w:pPr>
-            <w:r>
-              <w:rPr>
-                <w:rFonts w:eastAsia="Calibri" w:cs="Calibri"/>
-                <w:kern w:val="0"/>
-                <w:sz w:val="22"/>
-                <w:szCs w:val="22"/>
-                <w:lang w:val="pt-BR" w:eastAsia="pt-BR" w:bidi="ar-SA"/>
-              </w:rPr>
-            </w:r>
-          </w:p>
-        </w:tc>
-        <w:tc>
-          <w:tcPr>
-            <w:tcW w:w="1416" w:type="dxa"/>
-            <w:tcBorders>
-              <w:top w:val="single" w:sz="4" w:space="0" w:color="000000"/>
-              <w:left w:val="single" w:sz="4" w:space="0" w:color="000000"/>
-              <w:bottom w:val="single" w:sz="4" w:space="0" w:color="000000"/>
-              <w:right w:val="single" w:sz="4" w:space="0" w:color="000000"/>
-            </w:tcBorders>
-            <w:tcMar>
-              <w:top w:w="57" w:type="dxa"/>
-              <w:bottom w:w="57" w:type="dxa"/>
-            </w:tcMar>
-          </w:tcPr>
-          <w:p>
-            <w:pPr>
-              <w:pStyle w:val="Normal"/>
-              <w:widowControl w:val="false"/>
-              <w:spacing w:before="0" w:after="0"/>
-              <w:jc w:val="left"/>
-              <w:rPr>
-                <w:rFonts w:eastAsia="Calibri" w:cs="Calibri"/>
-                <w:kern w:val="0"/>
-                <w:sz w:val="22"/>
-                <w:szCs w:val="22"/>
-                <w:lang w:val="pt-BR" w:eastAsia="pt-BR" w:bidi="ar-SA"/>
-              </w:rPr>
-            </w:pPr>
-            <w:r>
-              <w:rPr>
-                <w:rFonts w:eastAsia="Calibri" w:cs="Calibri"/>
-                <w:kern w:val="0"/>
-                <w:sz w:val="22"/>
-                <w:szCs w:val="22"/>
-                <w:lang w:val="pt-BR" w:eastAsia="pt-BR" w:bidi="ar-SA"/>
-              </w:rPr>
-            </w:r>
-          </w:p>
-        </w:tc>
-        <w:tc>
-          <w:tcPr>
-            <w:tcW w:w="4461" w:type="dxa"/>
-            <w:tcBorders>
-              <w:top w:val="single" w:sz="4" w:space="0" w:color="000000"/>
-              <w:left w:val="single" w:sz="4" w:space="0" w:color="000000"/>
-              <w:bottom w:val="single" w:sz="4" w:space="0" w:color="000000"/>
-              <w:right w:val="single" w:sz="12" w:space="0" w:color="000000"/>
-            </w:tcBorders>
-            <w:tcMar>
-              <w:top w:w="57" w:type="dxa"/>
-              <w:bottom w:w="57" w:type="dxa"/>
-            </w:tcMar>
-          </w:tcPr>
-          <w:p>
-            <w:pPr>
-              <w:pStyle w:val="Normal"/>
-              <w:widowControl w:val="false"/>
-              <w:spacing w:before="0" w:after="0"/>
-              <w:jc w:val="left"/>
-              <w:rPr>
-                <w:rFonts w:eastAsia="Calibri" w:cs="Calibri"/>
-                <w:kern w:val="0"/>
-                <w:sz w:val="22"/>
-                <w:szCs w:val="22"/>
-                <w:lang w:val="pt-BR" w:eastAsia="pt-BR" w:bidi="ar-SA"/>
-              </w:rPr>
-            </w:pPr>
-            <w:r>
-              <w:rPr>
-                <w:rFonts w:eastAsia="Calibri" w:cs="Calibri"/>
-                <w:kern w:val="0"/>
-                <w:sz w:val="22"/>
-                <w:szCs w:val="22"/>
-                <w:lang w:val="pt-BR" w:eastAsia="pt-BR" w:bidi="ar-SA"/>
-              </w:rPr>
-            </w:r>
-          </w:p>
-        </w:tc>
-      </w:tr>
-      <w:tr>
-        <w:trPr>
-          <w:cantSplit w:val="true"/>
-        </w:trPr>
-        <w:tc>
-          <w:tcPr>
-            <w:tcW w:w="4382" w:type="dxa"/>
-            <w:tcBorders>
-              <w:top w:val="single" w:sz="4" w:space="0" w:color="000000"/>
-              <w:left w:val="single" w:sz="12" w:space="0" w:color="000000"/>
-              <w:bottom w:val="single" w:sz="12" w:space="0" w:color="000000"/>
-              <w:right w:val="single" w:sz="4" w:space="0" w:color="000000"/>
-            </w:tcBorders>
-            <w:tcMar>
-              <w:top w:w="57" w:type="dxa"/>
-              <w:bottom w:w="57" w:type="dxa"/>
-            </w:tcMar>
-          </w:tcPr>
-          <w:p>
-            <w:pPr>
-              <w:pStyle w:val="Normal"/>
-              <w:widowControl w:val="false"/>
-              <w:spacing w:before="0" w:after="0"/>
-              <w:jc w:val="left"/>
-              <w:rPr>
-                <w:rFonts w:eastAsia="Calibri" w:cs="Calibri"/>
-                <w:kern w:val="0"/>
-                <w:sz w:val="22"/>
-                <w:szCs w:val="22"/>
-                <w:lang w:val="pt-BR" w:eastAsia="pt-BR" w:bidi="ar-SA"/>
-              </w:rPr>
-            </w:pPr>
-            <w:r>
-              <w:rPr>
-                <w:rFonts w:eastAsia="Calibri" w:cs="Calibri"/>
-                <w:kern w:val="0"/>
-                <w:sz w:val="22"/>
-                <w:szCs w:val="22"/>
-                <w:lang w:val="pt-BR" w:eastAsia="pt-BR" w:bidi="ar-SA"/>
-              </w:rPr>
-            </w:r>
-          </w:p>
-        </w:tc>
-        <w:tc>
-          <w:tcPr>
-            <w:tcW w:w="2832" w:type="dxa"/>
-            <w:tcBorders>
-              <w:top w:val="single" w:sz="4" w:space="0" w:color="000000"/>
-              <w:left w:val="single" w:sz="4" w:space="0" w:color="000000"/>
-              <w:bottom w:val="single" w:sz="12" w:space="0" w:color="000000"/>
-              <w:right w:val="single" w:sz="4" w:space="0" w:color="000000"/>
-            </w:tcBorders>
-            <w:tcMar>
-              <w:top w:w="57" w:type="dxa"/>
-              <w:bottom w:w="57" w:type="dxa"/>
-            </w:tcMar>
-          </w:tcPr>
-          <w:p>
-            <w:pPr>
-              <w:pStyle w:val="Normal"/>
-              <w:widowControl w:val="false"/>
-              <w:spacing w:before="0" w:after="0"/>
-              <w:jc w:val="left"/>
-              <w:rPr>
-                <w:rFonts w:eastAsia="Calibri" w:cs="Calibri"/>
-                <w:kern w:val="0"/>
-                <w:sz w:val="22"/>
-                <w:szCs w:val="22"/>
-                <w:lang w:val="pt-BR" w:eastAsia="pt-BR" w:bidi="ar-SA"/>
-              </w:rPr>
-            </w:pPr>
-            <w:r>
-              <w:rPr>
-                <w:rFonts w:eastAsia="Calibri" w:cs="Calibri"/>
-                <w:kern w:val="0"/>
-                <w:sz w:val="22"/>
-                <w:szCs w:val="22"/>
-                <w:lang w:val="pt-BR" w:eastAsia="pt-BR" w:bidi="ar-SA"/>
-              </w:rPr>
-            </w:r>
-          </w:p>
-        </w:tc>
-        <w:tc>
-          <w:tcPr>
-            <w:tcW w:w="1557" w:type="dxa"/>
-            <w:tcBorders>
-              <w:top w:val="single" w:sz="4" w:space="0" w:color="000000"/>
-              <w:left w:val="single" w:sz="4" w:space="0" w:color="000000"/>
-              <w:bottom w:val="single" w:sz="12" w:space="0" w:color="000000"/>
-              <w:right w:val="single" w:sz="4" w:space="0" w:color="000000"/>
-            </w:tcBorders>
-            <w:tcMar>
-              <w:top w:w="57" w:type="dxa"/>
-              <w:bottom w:w="57" w:type="dxa"/>
-            </w:tcMar>
-          </w:tcPr>
-          <w:p>
-            <w:pPr>
-              <w:pStyle w:val="Normal"/>
-              <w:widowControl w:val="false"/>
-              <w:spacing w:before="0" w:after="0"/>
-              <w:jc w:val="left"/>
-              <w:rPr>
-                <w:rFonts w:eastAsia="Calibri" w:cs="Calibri"/>
-                <w:kern w:val="0"/>
-                <w:sz w:val="22"/>
-                <w:szCs w:val="22"/>
-                <w:lang w:val="pt-BR" w:eastAsia="pt-BR" w:bidi="ar-SA"/>
-              </w:rPr>
-            </w:pPr>
-            <w:r>
-              <w:rPr>
-                <w:rFonts w:eastAsia="Calibri" w:cs="Calibri"/>
-                <w:kern w:val="0"/>
-                <w:sz w:val="22"/>
-                <w:szCs w:val="22"/>
-                <w:lang w:val="pt-BR" w:eastAsia="pt-BR" w:bidi="ar-SA"/>
-              </w:rPr>
-            </w:r>
-          </w:p>
-        </w:tc>
-        <w:tc>
-          <w:tcPr>
-            <w:tcW w:w="1416" w:type="dxa"/>
-            <w:tcBorders>
-              <w:top w:val="single" w:sz="4" w:space="0" w:color="000000"/>
-              <w:left w:val="single" w:sz="4" w:space="0" w:color="000000"/>
-              <w:bottom w:val="single" w:sz="12" w:space="0" w:color="000000"/>
-              <w:right w:val="single" w:sz="4" w:space="0" w:color="000000"/>
-            </w:tcBorders>
-            <w:tcMar>
-              <w:top w:w="57" w:type="dxa"/>
-              <w:bottom w:w="57" w:type="dxa"/>
-            </w:tcMar>
-          </w:tcPr>
-          <w:p>
-            <w:pPr>
-              <w:pStyle w:val="Normal"/>
-              <w:widowControl w:val="false"/>
-              <w:spacing w:before="0" w:after="0"/>
-              <w:jc w:val="left"/>
-              <w:rPr>
-                <w:rFonts w:eastAsia="Calibri" w:cs="Calibri"/>
-                <w:kern w:val="0"/>
-                <w:sz w:val="22"/>
-                <w:szCs w:val="22"/>
-                <w:lang w:val="pt-BR" w:eastAsia="pt-BR" w:bidi="ar-SA"/>
-              </w:rPr>
-            </w:pPr>
-            <w:r>
-              <w:rPr>
-                <w:rFonts w:eastAsia="Calibri" w:cs="Calibri"/>
-                <w:kern w:val="0"/>
-                <w:sz w:val="22"/>
-                <w:szCs w:val="22"/>
-                <w:lang w:val="pt-BR" w:eastAsia="pt-BR" w:bidi="ar-SA"/>
-              </w:rPr>
-            </w:r>
-          </w:p>
-        </w:tc>
-        <w:tc>
-          <w:tcPr>
-            <w:tcW w:w="4461" w:type="dxa"/>
-            <w:tcBorders>
-              <w:top w:val="single" w:sz="4" w:space="0" w:color="000000"/>
-              <w:left w:val="single" w:sz="4" w:space="0" w:color="000000"/>
-              <w:bottom w:val="single" w:sz="12" w:space="0" w:color="000000"/>
               <w:right w:val="single" w:sz="12" w:space="0" w:color="000000"/>
             </w:tcBorders>
             <w:tcMar>
@@ -10080,6 +7078,18 @@
                 <w:szCs w:val="22"/>
                 <w:lang w:val="pt-BR" w:eastAsia="pt-BR" w:bidi="ar-SA"/>
               </w:rPr>
+              <w:t>Entrega do protótipo funcional e apresentaç</w:t>
+            </w:r>
+            <w:r>
+              <w:rPr>
+                <w:rFonts w:eastAsia="Calibri" w:cs="Calibri"/>
+                <w:color w:val="auto"/>
+                <w:kern w:val="0"/>
+                <w:sz w:val="22"/>
+                <w:szCs w:val="22"/>
+                <w:lang w:val="pt-BR" w:eastAsia="pt-BR" w:bidi="ar-SA"/>
+              </w:rPr>
+              <w:t>ão do video</w:t>
             </w:r>
           </w:p>
         </w:tc>
@@ -10119,6 +7129,7 @@
                 <w:szCs w:val="22"/>
                 <w:lang w:val="pt-BR" w:eastAsia="pt-BR" w:bidi="ar-SA"/>
               </w:rPr>
+              <w:t>Willian, Daniel, Gabriel e Dayan</w:t>
             </w:r>
           </w:p>
         </w:tc>
@@ -10158,6 +7169,7 @@
                 <w:szCs w:val="22"/>
                 <w:lang w:val="pt-BR" w:eastAsia="pt-BR" w:bidi="ar-SA"/>
               </w:rPr>
+              <w:t>11/05/2026</w:t>
             </w:r>
           </w:p>
         </w:tc>
@@ -10197,6 +7209,7 @@
                 <w:szCs w:val="22"/>
                 <w:lang w:val="pt-BR" w:eastAsia="pt-BR" w:bidi="ar-SA"/>
               </w:rPr>
+              <w:t>19/05/2026</w:t>
             </w:r>
           </w:p>
         </w:tc>
@@ -10280,6 +7293,18 @@
                 <w:szCs w:val="22"/>
                 <w:lang w:val="pt-BR" w:eastAsia="pt-BR" w:bidi="ar-SA"/>
               </w:rPr>
+              <w:t>Finalizaç</w:t>
+            </w:r>
+            <w:r>
+              <w:rPr>
+                <w:rFonts w:eastAsia="Calibri" w:cs="Calibri"/>
+                <w:color w:val="auto"/>
+                <w:kern w:val="0"/>
+                <w:sz w:val="22"/>
+                <w:szCs w:val="22"/>
+                <w:lang w:val="pt-BR" w:eastAsia="pt-BR" w:bidi="ar-SA"/>
+              </w:rPr>
+              <w:t>ão e entrega do Relatório Final</w:t>
             </w:r>
           </w:p>
         </w:tc>
@@ -10319,6 +7344,18 @@
                 <w:szCs w:val="22"/>
                 <w:lang w:val="pt-BR" w:eastAsia="pt-BR" w:bidi="ar-SA"/>
               </w:rPr>
+              <w:t>Jos</w:t>
+            </w:r>
+            <w:r>
+              <w:rPr>
+                <w:rFonts w:eastAsia="Calibri" w:cs="Calibri"/>
+                <w:color w:val="auto"/>
+                <w:kern w:val="0"/>
+                <w:sz w:val="22"/>
+                <w:szCs w:val="22"/>
+                <w:lang w:val="pt-BR" w:eastAsia="pt-BR" w:bidi="ar-SA"/>
+              </w:rPr>
+              <w:t xml:space="preserve">é Ricardo, José Willas, Walter e Flávio </w:t>
             </w:r>
           </w:p>
         </w:tc>
@@ -10358,6 +7395,7 @@
                 <w:szCs w:val="22"/>
                 <w:lang w:val="pt-BR" w:eastAsia="pt-BR" w:bidi="ar-SA"/>
               </w:rPr>
+              <w:t>11/05/2026</w:t>
             </w:r>
           </w:p>
         </w:tc>
@@ -10397,6 +7435,7 @@
                 <w:szCs w:val="22"/>
                 <w:lang w:val="pt-BR" w:eastAsia="pt-BR" w:bidi="ar-SA"/>
               </w:rPr>
+              <w:t>19/05/2026</w:t>
             </w:r>
           </w:p>
         </w:tc>
@@ -10407,606 +7446,6 @@
               <w:top w:val="single" w:sz="4" w:space="0" w:color="000000"/>
               <w:left w:val="single" w:sz="4" w:space="0" w:color="000000"/>
               <w:bottom w:val="single" w:sz="4" w:space="0" w:color="000000"/>
-              <w:right w:val="single" w:sz="12" w:space="0" w:color="000000"/>
-            </w:tcBorders>
-            <w:tcMar>
-              <w:top w:w="57" w:type="dxa"/>
-              <w:bottom w:w="57" w:type="dxa"/>
-            </w:tcMar>
-          </w:tcPr>
-          <w:p>
-            <w:pPr>
-              <w:pStyle w:val="Normal"/>
-              <w:widowControl w:val="false"/>
-              <w:spacing w:before="0" w:after="0"/>
-              <w:jc w:val="left"/>
-              <w:rPr>
-                <w:rFonts w:eastAsia="Calibri" w:cs="Calibri"/>
-                <w:kern w:val="0"/>
-                <w:sz w:val="22"/>
-                <w:szCs w:val="22"/>
-                <w:lang w:val="pt-BR" w:eastAsia="pt-BR" w:bidi="ar-SA"/>
-              </w:rPr>
-            </w:pPr>
-            <w:r>
-              <w:rPr>
-                <w:rFonts w:eastAsia="Calibri" w:cs="Calibri"/>
-                <w:kern w:val="0"/>
-                <w:sz w:val="22"/>
-                <w:szCs w:val="22"/>
-                <w:lang w:val="pt-BR" w:eastAsia="pt-BR" w:bidi="ar-SA"/>
-              </w:rPr>
-            </w:r>
-          </w:p>
-        </w:tc>
-      </w:tr>
-      <w:tr>
-        <w:trPr>
-          <w:cantSplit w:val="true"/>
-        </w:trPr>
-        <w:tc>
-          <w:tcPr>
-            <w:tcW w:w="4382" w:type="dxa"/>
-            <w:tcBorders>
-              <w:top w:val="single" w:sz="4" w:space="0" w:color="000000"/>
-              <w:left w:val="single" w:sz="12" w:space="0" w:color="000000"/>
-              <w:bottom w:val="single" w:sz="4" w:space="0" w:color="000000"/>
-              <w:right w:val="single" w:sz="4" w:space="0" w:color="000000"/>
-            </w:tcBorders>
-            <w:tcMar>
-              <w:top w:w="57" w:type="dxa"/>
-              <w:bottom w:w="57" w:type="dxa"/>
-            </w:tcMar>
-          </w:tcPr>
-          <w:p>
-            <w:pPr>
-              <w:pStyle w:val="Normal"/>
-              <w:widowControl w:val="false"/>
-              <w:spacing w:before="0" w:after="0"/>
-              <w:jc w:val="left"/>
-              <w:rPr>
-                <w:rFonts w:eastAsia="Calibri" w:cs="Calibri"/>
-                <w:kern w:val="0"/>
-                <w:sz w:val="22"/>
-                <w:szCs w:val="22"/>
-                <w:lang w:val="pt-BR" w:eastAsia="pt-BR" w:bidi="ar-SA"/>
-              </w:rPr>
-            </w:pPr>
-            <w:r>
-              <w:rPr>
-                <w:rFonts w:eastAsia="Calibri" w:cs="Calibri"/>
-                <w:kern w:val="0"/>
-                <w:sz w:val="22"/>
-                <w:szCs w:val="22"/>
-                <w:lang w:val="pt-BR" w:eastAsia="pt-BR" w:bidi="ar-SA"/>
-              </w:rPr>
-            </w:r>
-          </w:p>
-        </w:tc>
-        <w:tc>
-          <w:tcPr>
-            <w:tcW w:w="2832" w:type="dxa"/>
-            <w:tcBorders>
-              <w:top w:val="single" w:sz="4" w:space="0" w:color="000000"/>
-              <w:left w:val="single" w:sz="4" w:space="0" w:color="000000"/>
-              <w:bottom w:val="single" w:sz="4" w:space="0" w:color="000000"/>
-              <w:right w:val="single" w:sz="4" w:space="0" w:color="000000"/>
-            </w:tcBorders>
-            <w:tcMar>
-              <w:top w:w="57" w:type="dxa"/>
-              <w:bottom w:w="57" w:type="dxa"/>
-            </w:tcMar>
-          </w:tcPr>
-          <w:p>
-            <w:pPr>
-              <w:pStyle w:val="Normal"/>
-              <w:widowControl w:val="false"/>
-              <w:spacing w:before="0" w:after="0"/>
-              <w:jc w:val="left"/>
-              <w:rPr>
-                <w:rFonts w:eastAsia="Calibri" w:cs="Calibri"/>
-                <w:kern w:val="0"/>
-                <w:sz w:val="22"/>
-                <w:szCs w:val="22"/>
-                <w:lang w:val="pt-BR" w:eastAsia="pt-BR" w:bidi="ar-SA"/>
-              </w:rPr>
-            </w:pPr>
-            <w:r>
-              <w:rPr>
-                <w:rFonts w:eastAsia="Calibri" w:cs="Calibri"/>
-                <w:kern w:val="0"/>
-                <w:sz w:val="22"/>
-                <w:szCs w:val="22"/>
-                <w:lang w:val="pt-BR" w:eastAsia="pt-BR" w:bidi="ar-SA"/>
-              </w:rPr>
-            </w:r>
-          </w:p>
-        </w:tc>
-        <w:tc>
-          <w:tcPr>
-            <w:tcW w:w="1557" w:type="dxa"/>
-            <w:tcBorders>
-              <w:top w:val="single" w:sz="4" w:space="0" w:color="000000"/>
-              <w:left w:val="single" w:sz="4" w:space="0" w:color="000000"/>
-              <w:bottom w:val="single" w:sz="4" w:space="0" w:color="000000"/>
-              <w:right w:val="single" w:sz="4" w:space="0" w:color="000000"/>
-            </w:tcBorders>
-            <w:tcMar>
-              <w:top w:w="57" w:type="dxa"/>
-              <w:bottom w:w="57" w:type="dxa"/>
-            </w:tcMar>
-          </w:tcPr>
-          <w:p>
-            <w:pPr>
-              <w:pStyle w:val="Normal"/>
-              <w:widowControl w:val="false"/>
-              <w:spacing w:before="0" w:after="0"/>
-              <w:jc w:val="left"/>
-              <w:rPr>
-                <w:rFonts w:eastAsia="Calibri" w:cs="Calibri"/>
-                <w:kern w:val="0"/>
-                <w:sz w:val="22"/>
-                <w:szCs w:val="22"/>
-                <w:lang w:val="pt-BR" w:eastAsia="pt-BR" w:bidi="ar-SA"/>
-              </w:rPr>
-            </w:pPr>
-            <w:r>
-              <w:rPr>
-                <w:rFonts w:eastAsia="Calibri" w:cs="Calibri"/>
-                <w:kern w:val="0"/>
-                <w:sz w:val="22"/>
-                <w:szCs w:val="22"/>
-                <w:lang w:val="pt-BR" w:eastAsia="pt-BR" w:bidi="ar-SA"/>
-              </w:rPr>
-            </w:r>
-          </w:p>
-        </w:tc>
-        <w:tc>
-          <w:tcPr>
-            <w:tcW w:w="1416" w:type="dxa"/>
-            <w:tcBorders>
-              <w:top w:val="single" w:sz="4" w:space="0" w:color="000000"/>
-              <w:left w:val="single" w:sz="4" w:space="0" w:color="000000"/>
-              <w:bottom w:val="single" w:sz="4" w:space="0" w:color="000000"/>
-              <w:right w:val="single" w:sz="4" w:space="0" w:color="000000"/>
-            </w:tcBorders>
-            <w:tcMar>
-              <w:top w:w="57" w:type="dxa"/>
-              <w:bottom w:w="57" w:type="dxa"/>
-            </w:tcMar>
-          </w:tcPr>
-          <w:p>
-            <w:pPr>
-              <w:pStyle w:val="Normal"/>
-              <w:widowControl w:val="false"/>
-              <w:spacing w:before="0" w:after="0"/>
-              <w:jc w:val="left"/>
-              <w:rPr>
-                <w:rFonts w:eastAsia="Calibri" w:cs="Calibri"/>
-                <w:kern w:val="0"/>
-                <w:sz w:val="22"/>
-                <w:szCs w:val="22"/>
-                <w:lang w:val="pt-BR" w:eastAsia="pt-BR" w:bidi="ar-SA"/>
-              </w:rPr>
-            </w:pPr>
-            <w:r>
-              <w:rPr>
-                <w:rFonts w:eastAsia="Calibri" w:cs="Calibri"/>
-                <w:kern w:val="0"/>
-                <w:sz w:val="22"/>
-                <w:szCs w:val="22"/>
-                <w:lang w:val="pt-BR" w:eastAsia="pt-BR" w:bidi="ar-SA"/>
-              </w:rPr>
-            </w:r>
-          </w:p>
-        </w:tc>
-        <w:tc>
-          <w:tcPr>
-            <w:tcW w:w="4461" w:type="dxa"/>
-            <w:tcBorders>
-              <w:top w:val="single" w:sz="4" w:space="0" w:color="000000"/>
-              <w:left w:val="single" w:sz="4" w:space="0" w:color="000000"/>
-              <w:bottom w:val="single" w:sz="4" w:space="0" w:color="000000"/>
-              <w:right w:val="single" w:sz="12" w:space="0" w:color="000000"/>
-            </w:tcBorders>
-            <w:tcMar>
-              <w:top w:w="57" w:type="dxa"/>
-              <w:bottom w:w="57" w:type="dxa"/>
-            </w:tcMar>
-          </w:tcPr>
-          <w:p>
-            <w:pPr>
-              <w:pStyle w:val="Normal"/>
-              <w:widowControl w:val="false"/>
-              <w:spacing w:before="0" w:after="0"/>
-              <w:jc w:val="left"/>
-              <w:rPr>
-                <w:rFonts w:eastAsia="Calibri" w:cs="Calibri"/>
-                <w:kern w:val="0"/>
-                <w:sz w:val="22"/>
-                <w:szCs w:val="22"/>
-                <w:lang w:val="pt-BR" w:eastAsia="pt-BR" w:bidi="ar-SA"/>
-              </w:rPr>
-            </w:pPr>
-            <w:r>
-              <w:rPr>
-                <w:rFonts w:eastAsia="Calibri" w:cs="Calibri"/>
-                <w:kern w:val="0"/>
-                <w:sz w:val="22"/>
-                <w:szCs w:val="22"/>
-                <w:lang w:val="pt-BR" w:eastAsia="pt-BR" w:bidi="ar-SA"/>
-              </w:rPr>
-            </w:r>
-          </w:p>
-        </w:tc>
-      </w:tr>
-      <w:tr>
-        <w:trPr>
-          <w:cantSplit w:val="true"/>
-        </w:trPr>
-        <w:tc>
-          <w:tcPr>
-            <w:tcW w:w="4382" w:type="dxa"/>
-            <w:tcBorders>
-              <w:top w:val="single" w:sz="4" w:space="0" w:color="000000"/>
-              <w:left w:val="single" w:sz="12" w:space="0" w:color="000000"/>
-              <w:bottom w:val="single" w:sz="4" w:space="0" w:color="000000"/>
-              <w:right w:val="single" w:sz="4" w:space="0" w:color="000000"/>
-            </w:tcBorders>
-            <w:tcMar>
-              <w:top w:w="57" w:type="dxa"/>
-              <w:bottom w:w="57" w:type="dxa"/>
-            </w:tcMar>
-          </w:tcPr>
-          <w:p>
-            <w:pPr>
-              <w:pStyle w:val="Normal"/>
-              <w:widowControl w:val="false"/>
-              <w:spacing w:before="0" w:after="0"/>
-              <w:jc w:val="left"/>
-              <w:rPr>
-                <w:rFonts w:eastAsia="Calibri" w:cs="Calibri"/>
-                <w:kern w:val="0"/>
-                <w:sz w:val="22"/>
-                <w:szCs w:val="22"/>
-                <w:lang w:val="pt-BR" w:eastAsia="pt-BR" w:bidi="ar-SA"/>
-              </w:rPr>
-            </w:pPr>
-            <w:r>
-              <w:rPr>
-                <w:rFonts w:eastAsia="Calibri" w:cs="Calibri"/>
-                <w:kern w:val="0"/>
-                <w:sz w:val="22"/>
-                <w:szCs w:val="22"/>
-                <w:lang w:val="pt-BR" w:eastAsia="pt-BR" w:bidi="ar-SA"/>
-              </w:rPr>
-            </w:r>
-          </w:p>
-        </w:tc>
-        <w:tc>
-          <w:tcPr>
-            <w:tcW w:w="2832" w:type="dxa"/>
-            <w:tcBorders>
-              <w:top w:val="single" w:sz="4" w:space="0" w:color="000000"/>
-              <w:left w:val="single" w:sz="4" w:space="0" w:color="000000"/>
-              <w:bottom w:val="single" w:sz="4" w:space="0" w:color="000000"/>
-              <w:right w:val="single" w:sz="4" w:space="0" w:color="000000"/>
-            </w:tcBorders>
-            <w:tcMar>
-              <w:top w:w="57" w:type="dxa"/>
-              <w:bottom w:w="57" w:type="dxa"/>
-            </w:tcMar>
-          </w:tcPr>
-          <w:p>
-            <w:pPr>
-              <w:pStyle w:val="Normal"/>
-              <w:widowControl w:val="false"/>
-              <w:spacing w:before="0" w:after="0"/>
-              <w:jc w:val="left"/>
-              <w:rPr>
-                <w:rFonts w:eastAsia="Calibri" w:cs="Calibri"/>
-                <w:kern w:val="0"/>
-                <w:sz w:val="22"/>
-                <w:szCs w:val="22"/>
-                <w:lang w:val="pt-BR" w:eastAsia="pt-BR" w:bidi="ar-SA"/>
-              </w:rPr>
-            </w:pPr>
-            <w:r>
-              <w:rPr>
-                <w:rFonts w:eastAsia="Calibri" w:cs="Calibri"/>
-                <w:kern w:val="0"/>
-                <w:sz w:val="22"/>
-                <w:szCs w:val="22"/>
-                <w:lang w:val="pt-BR" w:eastAsia="pt-BR" w:bidi="ar-SA"/>
-              </w:rPr>
-            </w:r>
-          </w:p>
-        </w:tc>
-        <w:tc>
-          <w:tcPr>
-            <w:tcW w:w="1557" w:type="dxa"/>
-            <w:tcBorders>
-              <w:top w:val="single" w:sz="4" w:space="0" w:color="000000"/>
-              <w:left w:val="single" w:sz="4" w:space="0" w:color="000000"/>
-              <w:bottom w:val="single" w:sz="4" w:space="0" w:color="000000"/>
-              <w:right w:val="single" w:sz="4" w:space="0" w:color="000000"/>
-            </w:tcBorders>
-            <w:tcMar>
-              <w:top w:w="57" w:type="dxa"/>
-              <w:bottom w:w="57" w:type="dxa"/>
-            </w:tcMar>
-          </w:tcPr>
-          <w:p>
-            <w:pPr>
-              <w:pStyle w:val="Normal"/>
-              <w:widowControl w:val="false"/>
-              <w:spacing w:before="0" w:after="0"/>
-              <w:jc w:val="left"/>
-              <w:rPr>
-                <w:rFonts w:eastAsia="Calibri" w:cs="Calibri"/>
-                <w:kern w:val="0"/>
-                <w:sz w:val="22"/>
-                <w:szCs w:val="22"/>
-                <w:lang w:val="pt-BR" w:eastAsia="pt-BR" w:bidi="ar-SA"/>
-              </w:rPr>
-            </w:pPr>
-            <w:r>
-              <w:rPr>
-                <w:rFonts w:eastAsia="Calibri" w:cs="Calibri"/>
-                <w:kern w:val="0"/>
-                <w:sz w:val="22"/>
-                <w:szCs w:val="22"/>
-                <w:lang w:val="pt-BR" w:eastAsia="pt-BR" w:bidi="ar-SA"/>
-              </w:rPr>
-            </w:r>
-          </w:p>
-        </w:tc>
-        <w:tc>
-          <w:tcPr>
-            <w:tcW w:w="1416" w:type="dxa"/>
-            <w:tcBorders>
-              <w:top w:val="single" w:sz="4" w:space="0" w:color="000000"/>
-              <w:left w:val="single" w:sz="4" w:space="0" w:color="000000"/>
-              <w:bottom w:val="single" w:sz="4" w:space="0" w:color="000000"/>
-              <w:right w:val="single" w:sz="4" w:space="0" w:color="000000"/>
-            </w:tcBorders>
-            <w:tcMar>
-              <w:top w:w="57" w:type="dxa"/>
-              <w:bottom w:w="57" w:type="dxa"/>
-            </w:tcMar>
-          </w:tcPr>
-          <w:p>
-            <w:pPr>
-              <w:pStyle w:val="Normal"/>
-              <w:widowControl w:val="false"/>
-              <w:spacing w:before="0" w:after="0"/>
-              <w:jc w:val="left"/>
-              <w:rPr>
-                <w:rFonts w:eastAsia="Calibri" w:cs="Calibri"/>
-                <w:kern w:val="0"/>
-                <w:sz w:val="22"/>
-                <w:szCs w:val="22"/>
-                <w:lang w:val="pt-BR" w:eastAsia="pt-BR" w:bidi="ar-SA"/>
-              </w:rPr>
-            </w:pPr>
-            <w:r>
-              <w:rPr>
-                <w:rFonts w:eastAsia="Calibri" w:cs="Calibri"/>
-                <w:kern w:val="0"/>
-                <w:sz w:val="22"/>
-                <w:szCs w:val="22"/>
-                <w:lang w:val="pt-BR" w:eastAsia="pt-BR" w:bidi="ar-SA"/>
-              </w:rPr>
-            </w:r>
-          </w:p>
-        </w:tc>
-        <w:tc>
-          <w:tcPr>
-            <w:tcW w:w="4461" w:type="dxa"/>
-            <w:tcBorders>
-              <w:top w:val="single" w:sz="4" w:space="0" w:color="000000"/>
-              <w:left w:val="single" w:sz="4" w:space="0" w:color="000000"/>
-              <w:bottom w:val="single" w:sz="4" w:space="0" w:color="000000"/>
-              <w:right w:val="single" w:sz="12" w:space="0" w:color="000000"/>
-            </w:tcBorders>
-            <w:tcMar>
-              <w:top w:w="57" w:type="dxa"/>
-              <w:bottom w:w="57" w:type="dxa"/>
-            </w:tcMar>
-          </w:tcPr>
-          <w:p>
-            <w:pPr>
-              <w:pStyle w:val="Normal"/>
-              <w:widowControl w:val="false"/>
-              <w:spacing w:before="0" w:after="0"/>
-              <w:jc w:val="left"/>
-              <w:rPr>
-                <w:rFonts w:eastAsia="Calibri" w:cs="Calibri"/>
-                <w:kern w:val="0"/>
-                <w:sz w:val="22"/>
-                <w:szCs w:val="22"/>
-                <w:lang w:val="pt-BR" w:eastAsia="pt-BR" w:bidi="ar-SA"/>
-              </w:rPr>
-            </w:pPr>
-            <w:r>
-              <w:rPr>
-                <w:rFonts w:eastAsia="Calibri" w:cs="Calibri"/>
-                <w:kern w:val="0"/>
-                <w:sz w:val="22"/>
-                <w:szCs w:val="22"/>
-                <w:lang w:val="pt-BR" w:eastAsia="pt-BR" w:bidi="ar-SA"/>
-              </w:rPr>
-            </w:r>
-          </w:p>
-        </w:tc>
-      </w:tr>
-      <w:tr>
-        <w:trPr>
-          <w:cantSplit w:val="true"/>
-        </w:trPr>
-        <w:tc>
-          <w:tcPr>
-            <w:tcW w:w="4382" w:type="dxa"/>
-            <w:tcBorders>
-              <w:top w:val="single" w:sz="4" w:space="0" w:color="000000"/>
-              <w:left w:val="single" w:sz="12" w:space="0" w:color="000000"/>
-              <w:bottom w:val="single" w:sz="12" w:space="0" w:color="000000"/>
-              <w:right w:val="single" w:sz="4" w:space="0" w:color="000000"/>
-            </w:tcBorders>
-            <w:tcMar>
-              <w:top w:w="57" w:type="dxa"/>
-              <w:bottom w:w="57" w:type="dxa"/>
-            </w:tcMar>
-          </w:tcPr>
-          <w:p>
-            <w:pPr>
-              <w:pStyle w:val="Normal"/>
-              <w:widowControl w:val="false"/>
-              <w:spacing w:before="0" w:after="0"/>
-              <w:jc w:val="left"/>
-              <w:rPr>
-                <w:rFonts w:eastAsia="Calibri" w:cs="Calibri"/>
-                <w:kern w:val="0"/>
-                <w:sz w:val="22"/>
-                <w:szCs w:val="22"/>
-                <w:lang w:val="pt-BR" w:eastAsia="pt-BR" w:bidi="ar-SA"/>
-              </w:rPr>
-            </w:pPr>
-            <w:r>
-              <w:rPr>
-                <w:rFonts w:eastAsia="Calibri" w:cs="Calibri"/>
-                <w:kern w:val="0"/>
-                <w:sz w:val="22"/>
-                <w:szCs w:val="22"/>
-                <w:lang w:val="pt-BR" w:eastAsia="pt-BR" w:bidi="ar-SA"/>
-              </w:rPr>
-            </w:r>
-          </w:p>
-        </w:tc>
-        <w:tc>
-          <w:tcPr>
-            <w:tcW w:w="2832" w:type="dxa"/>
-            <w:tcBorders>
-              <w:top w:val="single" w:sz="4" w:space="0" w:color="000000"/>
-              <w:left w:val="single" w:sz="4" w:space="0" w:color="000000"/>
-              <w:bottom w:val="single" w:sz="12" w:space="0" w:color="000000"/>
-              <w:right w:val="single" w:sz="4" w:space="0" w:color="000000"/>
-            </w:tcBorders>
-            <w:tcMar>
-              <w:top w:w="57" w:type="dxa"/>
-              <w:bottom w:w="57" w:type="dxa"/>
-            </w:tcMar>
-          </w:tcPr>
-          <w:p>
-            <w:pPr>
-              <w:pStyle w:val="Normal"/>
-              <w:widowControl w:val="false"/>
-              <w:spacing w:before="0" w:after="0"/>
-              <w:jc w:val="left"/>
-              <w:rPr>
-                <w:rFonts w:eastAsia="Calibri" w:cs="Calibri"/>
-                <w:kern w:val="0"/>
-                <w:sz w:val="22"/>
-                <w:szCs w:val="22"/>
-                <w:lang w:val="pt-BR" w:eastAsia="pt-BR" w:bidi="ar-SA"/>
-              </w:rPr>
-            </w:pPr>
-            <w:r>
-              <w:rPr>
-                <w:rFonts w:eastAsia="Calibri" w:cs="Calibri"/>
-                <w:kern w:val="0"/>
-                <w:sz w:val="22"/>
-                <w:szCs w:val="22"/>
-                <w:lang w:val="pt-BR" w:eastAsia="pt-BR" w:bidi="ar-SA"/>
-              </w:rPr>
-            </w:r>
-          </w:p>
-        </w:tc>
-        <w:tc>
-          <w:tcPr>
-            <w:tcW w:w="1557" w:type="dxa"/>
-            <w:tcBorders>
-              <w:top w:val="single" w:sz="4" w:space="0" w:color="000000"/>
-              <w:left w:val="single" w:sz="4" w:space="0" w:color="000000"/>
-              <w:bottom w:val="single" w:sz="12" w:space="0" w:color="000000"/>
-              <w:right w:val="single" w:sz="4" w:space="0" w:color="000000"/>
-            </w:tcBorders>
-            <w:tcMar>
-              <w:top w:w="57" w:type="dxa"/>
-              <w:bottom w:w="57" w:type="dxa"/>
-            </w:tcMar>
-          </w:tcPr>
-          <w:p>
-            <w:pPr>
-              <w:pStyle w:val="Normal"/>
-              <w:widowControl w:val="false"/>
-              <w:spacing w:before="0" w:after="0"/>
-              <w:jc w:val="left"/>
-              <w:rPr>
-                <w:rFonts w:eastAsia="Calibri" w:cs="Calibri"/>
-                <w:kern w:val="0"/>
-                <w:sz w:val="22"/>
-                <w:szCs w:val="22"/>
-                <w:lang w:val="pt-BR" w:eastAsia="pt-BR" w:bidi="ar-SA"/>
-              </w:rPr>
-            </w:pPr>
-            <w:r>
-              <w:rPr>
-                <w:rFonts w:eastAsia="Calibri" w:cs="Calibri"/>
-                <w:kern w:val="0"/>
-                <w:sz w:val="22"/>
-                <w:szCs w:val="22"/>
-                <w:lang w:val="pt-BR" w:eastAsia="pt-BR" w:bidi="ar-SA"/>
-              </w:rPr>
-            </w:r>
-          </w:p>
-        </w:tc>
-        <w:tc>
-          <w:tcPr>
-            <w:tcW w:w="1416" w:type="dxa"/>
-            <w:tcBorders>
-              <w:top w:val="single" w:sz="4" w:space="0" w:color="000000"/>
-              <w:left w:val="single" w:sz="4" w:space="0" w:color="000000"/>
-              <w:bottom w:val="single" w:sz="12" w:space="0" w:color="000000"/>
-              <w:right w:val="single" w:sz="4" w:space="0" w:color="000000"/>
-            </w:tcBorders>
-            <w:tcMar>
-              <w:top w:w="57" w:type="dxa"/>
-              <w:bottom w:w="57" w:type="dxa"/>
-            </w:tcMar>
-          </w:tcPr>
-          <w:p>
-            <w:pPr>
-              <w:pStyle w:val="Normal"/>
-              <w:widowControl w:val="false"/>
-              <w:spacing w:before="0" w:after="0"/>
-              <w:jc w:val="left"/>
-              <w:rPr>
-                <w:rFonts w:eastAsia="Calibri" w:cs="Calibri"/>
-                <w:kern w:val="0"/>
-                <w:sz w:val="22"/>
-                <w:szCs w:val="22"/>
-                <w:lang w:val="pt-BR" w:eastAsia="pt-BR" w:bidi="ar-SA"/>
-              </w:rPr>
-            </w:pPr>
-            <w:r>
-              <w:rPr>
-                <w:rFonts w:eastAsia="Calibri" w:cs="Calibri"/>
-                <w:kern w:val="0"/>
-                <w:sz w:val="22"/>
-                <w:szCs w:val="22"/>
-                <w:lang w:val="pt-BR" w:eastAsia="pt-BR" w:bidi="ar-SA"/>
-              </w:rPr>
-            </w:r>
-          </w:p>
-        </w:tc>
-        <w:tc>
-          <w:tcPr>
-            <w:tcW w:w="4461" w:type="dxa"/>
-            <w:tcBorders>
-              <w:top w:val="single" w:sz="4" w:space="0" w:color="000000"/>
-              <w:left w:val="single" w:sz="4" w:space="0" w:color="000000"/>
-              <w:bottom w:val="single" w:sz="12" w:space="0" w:color="000000"/>
               <w:right w:val="single" w:sz="12" w:space="0" w:color="000000"/>
             </w:tcBorders>
             <w:tcMar>
@@ -11259,7 +7698,7 @@
     </w:pPr>
     <w:r>
       <w:drawing>
-        <wp:anchor behindDoc="1" distT="0" distB="0" distL="114300" distR="114300" simplePos="0" locked="0" layoutInCell="0" allowOverlap="1" relativeHeight="8">
+        <wp:anchor behindDoc="0" distT="0" distB="0" distL="114300" distR="114300" simplePos="0" locked="0" layoutInCell="0" allowOverlap="1" relativeHeight="8">
           <wp:simplePos x="0" y="0"/>
           <wp:positionH relativeFrom="column">
             <wp:posOffset>13970</wp:posOffset>
@@ -11380,7 +7819,7 @@
     </w:pPr>
     <w:r>
       <w:drawing>
-        <wp:anchor behindDoc="1" distT="0" distB="0" distL="114300" distR="114300" simplePos="0" locked="0" layoutInCell="0" allowOverlap="1" relativeHeight="5">
+        <wp:anchor behindDoc="0" distT="0" distB="0" distL="114300" distR="114300" simplePos="0" locked="0" layoutInCell="0" allowOverlap="1" relativeHeight="5">
           <wp:simplePos x="0" y="0"/>
           <wp:positionH relativeFrom="column">
             <wp:posOffset>13970</wp:posOffset>
@@ -11507,7 +7946,7 @@
     <w:pPr>
       <w:widowControl/>
       <w:suppressAutoHyphens w:val="true"/>
-      <w:overflowPunct w:val="true"/>
+      <w:overflowPunct w:val="false"/>
       <w:bidi w:val="0"/>
       <w:spacing w:lineRule="auto" w:line="288" w:before="0" w:after="120"/>
       <w:jc w:val="left"/>
@@ -11753,7 +8192,7 @@
     <w:pPr>
       <w:widowControl/>
       <w:suppressAutoHyphens w:val="true"/>
-      <w:overflowPunct w:val="true"/>
+      <w:overflowPunct w:val="false"/>
       <w:bidi w:val="0"/>
       <w:spacing w:lineRule="auto" w:line="259" w:before="0" w:after="160"/>
       <w:jc w:val="left"/>

</xml_diff>